<commit_message>
Add European replication (Eurostat OJA by ISCO3, 16 countries); update manuscript
Co-Authored-By: Claude Sonnet 5.5 <noreply@anthropic.com>
Claude-Session: https://claude.ai/code/session_01H4JvRLBkzRHsy6jU5TcEWv
</commit_message>
<xml_diff>
--- a/isr_paper/ISR_Paper_Early_Adoption_Delayed_Displacement.docx
+++ b/isr_paper/ISR_Paper_Early_Adoption_Delayed_Displacement.docx
@@ -67,7 +67,7 @@
           <w:sz w:val="22"/>
           <w:szCs w:val="22"/>
         </w:rPr>
-        <w:t xml:space="preserve">This draft reports a full analysis on open data, but it is not yet ready for submission. Three items remain open: (i) the large-language-model (LLM) measure of occupational exposure to visual content creation has not been validated against human coders; (ii) the evidence on labor effects is small and imprecise, and we do not claim a causal effect of generative visual AI; (iii) model release dates and the bibliographic details marked † must be verified. All reported numbers are produced by the code and data in the accompanying repository.</w:t>
+        <w:t xml:space="preserve">This draft reports a full analysis on open data, but it is not yet ready for submission. Three items remain open: (i) the large-language-model (LLM) measure of occupational exposure to visual content creation has not been validated against human coders; (ii) the evidence on labor effects is small and imprecise, with two post-2022 years in the European replication, and we do not claim a causal effect of generative visual AI; (iii) model release dates and the bibliographic details marked † must be verified. All reported numbers are produced by the code and data in the accompanying repository.</w:t>
       </w:r>
     </w:p>
     <w:p>
@@ -102,7 +102,7 @@
           <w:sz w:val="24"/>
           <w:szCs w:val="24"/>
         </w:rPr>
-        <w:t xml:space="preserve">Does generative AI that creates images and video displace creative workers, or is its effect delayed? We model labor demand in visual-content occupations as the share of employers who have adopted times the net effect among adopters, where adoption requires output of acceptable quality at low review cost and is held back by expertise and legal frictions. Eurostat survey data show that adoption is already substantial (9.6% of European firms with ten or more employees use AI that generates pictures, video, or audio) and that firms that considered AI cite lack of expertise and legal and privacy uncertainty far more than lack of usefulness. In UK online job adverts for 403 occupations, occupational exposure to visual content creation is associated with small, imprecise declines after 2022 that follow a pre-existing COVID-era pattern, are not concentrated in low-quality-requirement tasks, and are too large to attribute to current adoption levels.</w:t>
+        <w:t xml:space="preserve">Does generative AI that creates images and video displace creative workers, or is its effect delayed? We model labor demand in visual-content occupations as the share of employers who have adopted times the net effect among adopters, where adoption requires acceptable output quality at low review cost and is held back by expertise and legal frictions. Eurostat survey data show substantial adoption (9.6% of European firms with ten or more employees use AI that generates pictures, video, or audio) and that firms cite lack of expertise and legal and privacy uncertainty far more than lack of usefulness. In online job adverts for 403 UK occupations and 96 occupations in 16 European countries, exposure to visual content creation predicts small declines after 2022 (about 1 to 3% per standard deviation) that are not concentrated in low-quality-requirement tasks and, for the most exposed UK occupations, exceed what current adoption could explain.</w:t>
       </w:r>
     </w:p>
     <w:p>
@@ -216,7 +216,7 @@
           <w:sz w:val="24"/>
           <w:szCs w:val="24"/>
         </w:rPr>
-        <w:t xml:space="preserve">We bring together three sources. First, Eurostat’s enterprise survey on AI, which in 2025 asks whether firms use AI that generates pictures, videos, or audio, and why firms that considered AI did not adopt it. Second, UK online job adverts by occupation from the Office for National Statistics (ONS), covering 413 four-digit occupations from 2017 to 2026. Third, an LLM-coded measure of occupational exposure to visual content creation built from O*NET task statements, which we map to UK occupations through the ISCO-08 classification. We also report, as supplementary evidence, US postings by sector and European employment by industry.</w:t>
+        <w:t xml:space="preserve">We bring together three sources. First, Eurostat’s enterprise survey on AI, which in 2025 asks whether firms use AI that generates pictures, videos, or audio, and why firms that considered AI did not adopt it. Second, UK online job adverts by occupation from the Office for National Statistics (ONS), covering 413 four-digit occupations from 2017 to 2026. Third, an LLM-coded measure of occupational exposure to visual content creation built from O*NET task statements, which we map to UK occupations through the ISCO-08 classification. As a replication we use Eurostat’s experimental statistics on online job advertisements by ISCO three-digit occupation for 16 European countries from 2019 to 2024. We also report, as supplementary evidence, US postings by sector and European employment by industry.</w:t>
       </w:r>
     </w:p>
     <w:p>
@@ -231,7 +231,7 @@
           <w:sz w:val="24"/>
           <w:szCs w:val="24"/>
         </w:rPr>
-        <w:t xml:space="preserve">Our findings are as follows. Adoption is already substantial: 9.6% of European firms with ten or more employees use AI that generates pictures, video, or audio, rising to 27.9% among firms with 250 or more employees and to about 36% in publishing, film, and broadcasting. Among firms that considered AI but did not adopt it, 70% cite lack of expertise, 54% unclear legal consequences, and 53% data protection and privacy concerns, against 18% who consider AI not useful. In UK adverts, occupations with higher exposure to visual content creation show small declines after 2022 (about 2 to 3% per standard deviation of exposure by 2025 and 2026, with randomization p-values from 0.03 to 0.47 across years and specifications), but these declines resemble a reversal of a COVID-era pattern, are not concentrated in tasks with low quality requirements, vanish when one occupation is dropped, and are far too large, for the occupations with the highest exposure, to be explained by the observed adoption levels. We read the evidence as consistent with early adoption and little detectable displacement so far, and we do not claim that displacement is absent or will not come.</w:t>
+        <w:t xml:space="preserve">Our findings are as follows. Adoption is already substantial: 9.6% of European firms with ten or more employees use AI that generates pictures, video, or audio, rising to 27.9% among firms with 250 or more employees and to about 36% in publishing, film, and broadcasting. Among firms that considered AI but did not adopt it, 70% cite lack of expertise, 54% unclear legal consequences, and 53% data protection and privacy concerns, against 18% who consider AI not useful. In UK adverts, occupations with higher exposure to visual content creation show small declines after 2022 (about 2 to 3% per standard deviation of exposure by 2025 and 2026, with randomization p-values from 0.03 to 0.47 across years and specifications), but these declines resemble a reversal of a COVID-era pattern, are not concentrated in tasks with low quality requirements, vanish when one occupation is dropped, and are far too large, for the occupations with the highest exposure, to be explained by the observed adoption levels. In the European replication the pattern has the same sign and similar size, with flat pre-period coefficients and two post-2022 years (about −1.6% per standard deviation in 2023 and −1.2% in 2024 with the language control; −3.7% and −5.9% without). We read the evidence as consistent with early adoption and little detectable displacement so far, and we do not claim that displacement is absent or will not come.</w:t>
       </w:r>
     </w:p>
     <w:p>
@@ -1639,7 +1639,7 @@
           <w:sz w:val="24"/>
           <w:szCs w:val="24"/>
         </w:rPr>
-        <w:t xml:space="preserve">4.2 Hiring: UK Online Job Adverts by Occupation</w:t>
+        <w:t xml:space="preserve">4.2 Hiring: UK Online Job Adverts by Occupation, and European Replication Data</w:t>
       </w:r>
     </w:p>
     <w:p>
@@ -1659,6 +1659,21 @@
     </w:p>
     <w:p>
       <w:pPr>
+        <w:spacing w:after="0" w:line="480" w:lineRule="auto"/>
+        <w:ind w:firstLine="720"/>
+        <w:jc w:val="left"/>
+      </w:pPr>
+      <w:r>
+        <w:rPr>
+          <w:rFonts w:ascii="Times New Roman" w:cs="Times New Roman" w:eastAsia="Times New Roman" w:hAnsi="Times New Roman"/>
+          <w:sz w:val="24"/>
+          <w:szCs w:val="24"/>
+        </w:rPr>
+        <w:t xml:space="preserve">For replication we use Eurostat’s experimental statistics on online job advertisements (dataset jvs_a_isco3_r1), which are derived from the Web Intelligence Hub’s classified online job adverts. They give the annual number of online job advertisements by ISCO-08 three-digit occupation and country for 2019 to 2024. We use national-level counts for the countries with data (18), keep country-occupation cells with at least 1,000 adverts in 2022, and obtain 604 cells in 96 occupations in 16 countries. ISCO three-digit occupations are coarser than UK unit groups; for example, graphic designers fall within ISCO 216 (architects, planners, surveyors, and designers). We map the O*NET exposure measures to ISCO three-digit codes through the same crosswalk.</w:t>
+      </w:r>
+    </w:p>
+    <w:p>
+      <w:pPr>
         <w:pStyle w:val="Heading2"/>
         <w:keepNext/>
         <w:spacing w:after="120" w:before="240" w:line="240" w:lineRule="auto"/>
@@ -1769,7 +1784,7 @@
           <w:sz w:val="24"/>
           <w:szCs w:val="24"/>
         </w:rPr>
-        <w:t xml:space="preserve">We also use the Indeed Hiring Lab job postings index by sector for the United States (47 sectors, daily, 2020–2026) and Eurostat Labour Force Survey employment by NACE two-digit industry for the EU27 (2015–2025). Their results are reported in Section 6.6.</w:t>
+        <w:t xml:space="preserve">We also use the Indeed Hiring Lab job postings index by sector for the United States (47 sectors, daily, 2020–2026) and Eurostat Labour Force Survey employment by NACE two-digit industry for the EU27 (2015–2025). Their results are reported in Section 6.7.</w:t>
       </w:r>
     </w:p>
     <w:p>
@@ -2037,7 +2052,7 @@
           <w:sz w:val="24"/>
           <w:szCs w:val="24"/>
         </w:rPr>
-        <w:t xml:space="preserve"> for years before the base year provides a check on pre-existing differences, although the pre-period contains the COVID shock and cannot be used to test parallel trends cleanly. As an alternative to conventional standard errors we compute randomization p-values by permuting exposure across occupations within sub-major groups (2,000 draws). In Section 6.3 we also compare three occupation groups chosen from occupation labels before looking at outcomes: image and video production (graphic and multimedia designers, artists, photographers and audio-visual operators, web design professionals), creative direction and production, and text production (writers, journalists, editors).</w:t>
+        <w:t xml:space="preserve"> for years before the base year provides a check on pre-existing differences, although the pre-period contains the COVID shock and cannot be used to test parallel trends cleanly. As an alternative to conventional standard errors we compute randomization p-values by permuting exposure across occupations within sub-major groups (2,000 draws). For the European replication we estimate the same model on country-occupation cells with country-year fixed effects, so that the comparison is between occupations within the same country and year, and with standard errors clustered by ISCO three-digit occupation and, as a check, by two-digit group; randomization p-values permute exposure across occupations within ISCO two-digit groups (1,000 draws). In Section 6.4 we also compare three occupation groups chosen from occupation labels before looking at outcomes: image and video production (graphic and multimedia designers, artists, photographers and audio-visual operators, web design professionals), creative direction and production, and text production (writers, journalists, editors).</w:t>
       </w:r>
     </w:p>
     <w:p>
@@ -5235,7 +5250,7 @@
           <w:sz w:val="24"/>
           <w:szCs w:val="24"/>
         </w:rPr>
-        <w:t xml:space="preserve">6.3 UK Adverts: Occupation Groups</w:t>
+        <w:t xml:space="preserve">6.3 European Replication</w:t>
       </w:r>
     </w:p>
     <w:p>
@@ -5250,7 +5265,7 @@
           <w:sz w:val="24"/>
           <w:szCs w:val="24"/>
         </w:rPr>
-        <w:t xml:space="preserve">The three groups chosen from occupation labels show a similar story with larger numbers (Table 5). Relative to other occupations, adverts for image and video production occupations fell by 0.20 log points in the first year after the base year (randomization p = 0.032) and by 0.38 in the third and fourth (p = 0.011). Creative direction occupations fell by less (−0.11 in the first year and −0.23 in the third; p between 0.15 and 0.27). Text production occupations did not differ from others in the first two years (−0.10 and +0.03) and fell later (−0.33 in the third year, p = 0.046; −0.47 in the fourth, p = 0.008), led by journalists and editors. The decline in image and video production is concentrated in web design professionals, who rank first or third among 405 occupations in the later years (log changes of −1.45 and −1.36 against a comparison median of −0.43 and −0.46); graphic and multimedia designers rank 32nd to 38th (−0.86 and −0.89), and artists and photographers are close to the median. Without web design professionals the third- and fourth-year differences fall to −0.16 and −0.21. Placebo design occupations that image generators do not target (interior designers, fashion and accessories designers, design occupations not elsewhere classified) also fell relative to others (−0.16, −0.20, and −0.06 in the first, third, and fourth years). Between June 2019 and June 2021 the image and video production group had already fallen by 0.32 log points relative to others, and the other two groups by 0.36 and 0.31.</w:t>
+        <w:t xml:space="preserve">Table 5 reports the replication in 16 European countries. With country-year fixed effects and the control for LLM exposure, a standard deviation of exposure is associated with 1.6% fewer online adverts in 2023 relative to 2022 (standard error 0.6, randomization p = 0.016) and 1.2% fewer in 2024 (standard error 1.7, p = 0.19). Without the language control the estimates are −3.7% in 2023 (standard error 0.9) and −5.9% in 2024 (standard error 2.1), because exposure to visual content creation and to LLMs are correlated across occupations (0.27). Weighting occupations by their 2022 adverts gives −2.5% for 2024 (standard error 2.2). The pre-2022 coefficients are positive or close to zero (+0.024, +0.008, and +0.011 for 2019, 2020, and 2021), so, unlike the UK, the European data show no differential decline before 2022. In country-by-country regressions with at least 25 occupations, the slope is negative in 7 of 9 countries in 2023 (median −0.012) and in 8 of 9 in 2024 (median −0.035). Among creative occupations, adverts for architects, planners, surveyors, and designers (ISCO 216, which includes graphic designers) fell by 0.48 log points between 2022 and 2024 against an average of −0.19 across all occupations, while adverts for creative and performing artists (ISCO 265) rose by 0.35. These results point in the same direction as the UK results and are similar in size, but they cover only two post-2022 years, use coarser occupations, and give a precise estimate only for 2023.</w:t>
       </w:r>
     </w:p>
     <w:p>
@@ -5268,6 +5283,875 @@
           <w:szCs w:val="22"/>
         </w:rPr>
         <w:t xml:space="preserve">Table 5.</w:t>
+      </w:r>
+      <w:r>
+        <w:rPr>
+          <w:rFonts w:ascii="Times New Roman" w:cs="Times New Roman" w:eastAsia="Times New Roman" w:hAnsi="Times New Roman"/>
+          <w:sz w:val="22"/>
+          <w:szCs w:val="22"/>
+        </w:rPr>
+        <w:t xml:space="preserve"> European replication: coefficient on occupational exposure to visual content creation (per standard deviation), change in log online adverts relative to 2022</w:t>
+      </w:r>
+    </w:p>
+    <w:tbl>
+      <w:tblPr>
+        <w:tblW w:type="dxa" w:w="9360"/>
+        <w:tblBorders>
+          <w:top w:val="single" w:color="auto" w:sz="4"/>
+          <w:left w:val="single" w:color="auto" w:sz="4"/>
+          <w:bottom w:val="single" w:color="auto" w:sz="4"/>
+          <w:right w:val="single" w:color="auto" w:sz="4"/>
+          <w:insideH w:val="single" w:color="auto" w:sz="4"/>
+          <w:insideV w:val="single" w:color="auto" w:sz="4"/>
+        </w:tblBorders>
+      </w:tblPr>
+      <w:tblGrid>
+        <w:gridCol w:w="3560"/>
+        <w:gridCol w:w="1160"/>
+        <w:gridCol w:w="1160"/>
+        <w:gridCol w:w="1160"/>
+        <w:gridCol w:w="1160"/>
+        <w:gridCol w:w="1160"/>
+      </w:tblGrid>
+      <w:tr>
+        <w:trPr>
+          <w:cantSplit/>
+          <w:tblHeader/>
+        </w:trPr>
+        <w:tc>
+          <w:tcPr>
+            <w:tcW w:type="dxa" w:w="3560"/>
+            <w:tcBorders>
+              <w:top w:val="single" w:color="000000" w:sz="4"/>
+              <w:left w:val="none" w:color="FFFFFF" w:sz="0"/>
+              <w:bottom w:val="single" w:color="000000" w:sz="4"/>
+              <w:right w:val="none" w:color="FFFFFF" w:sz="0"/>
+            </w:tcBorders>
+            <w:shd w:fill="EDEDED" w:color="auto" w:val="clear"/>
+            <w:tcMar>
+              <w:top w:type="dxa" w:w="50"/>
+              <w:left w:type="dxa" w:w="90"/>
+              <w:bottom w:type="dxa" w:w="50"/>
+              <w:right w:type="dxa" w:w="90"/>
+            </w:tcMar>
+          </w:tcPr>
+          <w:p>
+            <w:pPr>
+              <w:spacing w:line="240" w:lineRule="auto"/>
+            </w:pPr>
+            <w:r>
+              <w:rPr>
+                <w:rFonts w:ascii="Times New Roman" w:cs="Times New Roman" w:eastAsia="Times New Roman" w:hAnsi="Times New Roman"/>
+                <w:b/>
+                <w:bCs/>
+                <w:sz w:val="20"/>
+                <w:szCs w:val="20"/>
+              </w:rPr>
+              <w:t xml:space="preserve">Specification</w:t>
+            </w:r>
+          </w:p>
+        </w:tc>
+        <w:tc>
+          <w:tcPr>
+            <w:tcW w:type="dxa" w:w="1160"/>
+            <w:tcBorders>
+              <w:top w:val="single" w:color="000000" w:sz="4"/>
+              <w:left w:val="none" w:color="FFFFFF" w:sz="0"/>
+              <w:bottom w:val="single" w:color="000000" w:sz="4"/>
+              <w:right w:val="none" w:color="FFFFFF" w:sz="0"/>
+            </w:tcBorders>
+            <w:shd w:fill="EDEDED" w:color="auto" w:val="clear"/>
+            <w:tcMar>
+              <w:top w:type="dxa" w:w="50"/>
+              <w:left w:type="dxa" w:w="90"/>
+              <w:bottom w:type="dxa" w:w="50"/>
+              <w:right w:type="dxa" w:w="90"/>
+            </w:tcMar>
+          </w:tcPr>
+          <w:p>
+            <w:pPr>
+              <w:spacing w:line="240" w:lineRule="auto"/>
+            </w:pPr>
+            <w:r>
+              <w:rPr>
+                <w:rFonts w:ascii="Times New Roman" w:cs="Times New Roman" w:eastAsia="Times New Roman" w:hAnsi="Times New Roman"/>
+                <w:b/>
+                <w:bCs/>
+                <w:sz w:val="20"/>
+                <w:szCs w:val="20"/>
+              </w:rPr>
+              <w:t xml:space="preserve">2019</w:t>
+            </w:r>
+          </w:p>
+        </w:tc>
+        <w:tc>
+          <w:tcPr>
+            <w:tcW w:type="dxa" w:w="1160"/>
+            <w:tcBorders>
+              <w:top w:val="single" w:color="000000" w:sz="4"/>
+              <w:left w:val="none" w:color="FFFFFF" w:sz="0"/>
+              <w:bottom w:val="single" w:color="000000" w:sz="4"/>
+              <w:right w:val="none" w:color="FFFFFF" w:sz="0"/>
+            </w:tcBorders>
+            <w:shd w:fill="EDEDED" w:color="auto" w:val="clear"/>
+            <w:tcMar>
+              <w:top w:type="dxa" w:w="50"/>
+              <w:left w:type="dxa" w:w="90"/>
+              <w:bottom w:type="dxa" w:w="50"/>
+              <w:right w:type="dxa" w:w="90"/>
+            </w:tcMar>
+          </w:tcPr>
+          <w:p>
+            <w:pPr>
+              <w:spacing w:line="240" w:lineRule="auto"/>
+            </w:pPr>
+            <w:r>
+              <w:rPr>
+                <w:rFonts w:ascii="Times New Roman" w:cs="Times New Roman" w:eastAsia="Times New Roman" w:hAnsi="Times New Roman"/>
+                <w:b/>
+                <w:bCs/>
+                <w:sz w:val="20"/>
+                <w:szCs w:val="20"/>
+              </w:rPr>
+              <w:t xml:space="preserve">2020</w:t>
+            </w:r>
+          </w:p>
+        </w:tc>
+        <w:tc>
+          <w:tcPr>
+            <w:tcW w:type="dxa" w:w="1160"/>
+            <w:tcBorders>
+              <w:top w:val="single" w:color="000000" w:sz="4"/>
+              <w:left w:val="none" w:color="FFFFFF" w:sz="0"/>
+              <w:bottom w:val="single" w:color="000000" w:sz="4"/>
+              <w:right w:val="none" w:color="FFFFFF" w:sz="0"/>
+            </w:tcBorders>
+            <w:shd w:fill="EDEDED" w:color="auto" w:val="clear"/>
+            <w:tcMar>
+              <w:top w:type="dxa" w:w="50"/>
+              <w:left w:type="dxa" w:w="90"/>
+              <w:bottom w:type="dxa" w:w="50"/>
+              <w:right w:type="dxa" w:w="90"/>
+            </w:tcMar>
+          </w:tcPr>
+          <w:p>
+            <w:pPr>
+              <w:spacing w:line="240" w:lineRule="auto"/>
+            </w:pPr>
+            <w:r>
+              <w:rPr>
+                <w:rFonts w:ascii="Times New Roman" w:cs="Times New Roman" w:eastAsia="Times New Roman" w:hAnsi="Times New Roman"/>
+                <w:b/>
+                <w:bCs/>
+                <w:sz w:val="20"/>
+                <w:szCs w:val="20"/>
+              </w:rPr>
+              <w:t xml:space="preserve">2021</w:t>
+            </w:r>
+          </w:p>
+        </w:tc>
+        <w:tc>
+          <w:tcPr>
+            <w:tcW w:type="dxa" w:w="1160"/>
+            <w:tcBorders>
+              <w:top w:val="single" w:color="000000" w:sz="4"/>
+              <w:left w:val="none" w:color="FFFFFF" w:sz="0"/>
+              <w:bottom w:val="single" w:color="000000" w:sz="4"/>
+              <w:right w:val="none" w:color="FFFFFF" w:sz="0"/>
+            </w:tcBorders>
+            <w:shd w:fill="EDEDED" w:color="auto" w:val="clear"/>
+            <w:tcMar>
+              <w:top w:type="dxa" w:w="50"/>
+              <w:left w:type="dxa" w:w="90"/>
+              <w:bottom w:type="dxa" w:w="50"/>
+              <w:right w:type="dxa" w:w="90"/>
+            </w:tcMar>
+          </w:tcPr>
+          <w:p>
+            <w:pPr>
+              <w:spacing w:line="240" w:lineRule="auto"/>
+            </w:pPr>
+            <w:r>
+              <w:rPr>
+                <w:rFonts w:ascii="Times New Roman" w:cs="Times New Roman" w:eastAsia="Times New Roman" w:hAnsi="Times New Roman"/>
+                <w:b/>
+                <w:bCs/>
+                <w:sz w:val="20"/>
+                <w:szCs w:val="20"/>
+              </w:rPr>
+              <w:t xml:space="preserve">2023</w:t>
+            </w:r>
+          </w:p>
+        </w:tc>
+        <w:tc>
+          <w:tcPr>
+            <w:tcW w:type="dxa" w:w="1160"/>
+            <w:tcBorders>
+              <w:top w:val="single" w:color="000000" w:sz="4"/>
+              <w:left w:val="none" w:color="FFFFFF" w:sz="0"/>
+              <w:bottom w:val="single" w:color="000000" w:sz="4"/>
+              <w:right w:val="none" w:color="FFFFFF" w:sz="0"/>
+            </w:tcBorders>
+            <w:shd w:fill="EDEDED" w:color="auto" w:val="clear"/>
+            <w:tcMar>
+              <w:top w:type="dxa" w:w="50"/>
+              <w:left w:type="dxa" w:w="90"/>
+              <w:bottom w:type="dxa" w:w="50"/>
+              <w:right w:type="dxa" w:w="90"/>
+            </w:tcMar>
+          </w:tcPr>
+          <w:p>
+            <w:pPr>
+              <w:spacing w:line="240" w:lineRule="auto"/>
+            </w:pPr>
+            <w:r>
+              <w:rPr>
+                <w:rFonts w:ascii="Times New Roman" w:cs="Times New Roman" w:eastAsia="Times New Roman" w:hAnsi="Times New Roman"/>
+                <w:b/>
+                <w:bCs/>
+                <w:sz w:val="20"/>
+                <w:szCs w:val="20"/>
+              </w:rPr>
+              <w:t xml:space="preserve">2024</w:t>
+            </w:r>
+          </w:p>
+        </w:tc>
+      </w:tr>
+      <w:tr>
+        <w:trPr>
+          <w:cantSplit/>
+          <w:tblHeader w:val="false"/>
+        </w:trPr>
+        <w:tc>
+          <w:tcPr>
+            <w:tcW w:type="dxa" w:w="3560"/>
+            <w:tcBorders>
+              <w:top w:val="none" w:color="FFFFFF" w:sz="0"/>
+              <w:left w:val="none" w:color="FFFFFF" w:sz="0"/>
+              <w:bottom w:val="none" w:color="FFFFFF" w:sz="0"/>
+              <w:right w:val="none" w:color="FFFFFF" w:sz="0"/>
+            </w:tcBorders>
+            <w:tcMar>
+              <w:top w:type="dxa" w:w="50"/>
+              <w:left w:type="dxa" w:w="90"/>
+              <w:bottom w:type="dxa" w:w="50"/>
+              <w:right w:type="dxa" w:w="90"/>
+            </w:tcMar>
+          </w:tcPr>
+          <w:p>
+            <w:pPr>
+              <w:spacing w:line="240" w:lineRule="auto"/>
+            </w:pPr>
+            <w:r>
+              <w:rPr>
+                <w:rFonts w:ascii="Times New Roman" w:cs="Times New Roman" w:eastAsia="Times New Roman" w:hAnsi="Times New Roman"/>
+                <w:b w:val="false"/>
+                <w:bCs w:val="false"/>
+                <w:sz w:val="20"/>
+                <w:szCs w:val="20"/>
+              </w:rPr>
+              <w:t xml:space="preserve">Country-year FE, LLM control</w:t>
+            </w:r>
+          </w:p>
+        </w:tc>
+        <w:tc>
+          <w:tcPr>
+            <w:tcW w:type="dxa" w:w="1160"/>
+            <w:tcBorders>
+              <w:top w:val="none" w:color="FFFFFF" w:sz="0"/>
+              <w:left w:val="none" w:color="FFFFFF" w:sz="0"/>
+              <w:bottom w:val="none" w:color="FFFFFF" w:sz="0"/>
+              <w:right w:val="none" w:color="FFFFFF" w:sz="0"/>
+            </w:tcBorders>
+            <w:tcMar>
+              <w:top w:type="dxa" w:w="50"/>
+              <w:left w:type="dxa" w:w="90"/>
+              <w:bottom w:type="dxa" w:w="50"/>
+              <w:right w:type="dxa" w:w="90"/>
+            </w:tcMar>
+          </w:tcPr>
+          <w:p>
+            <w:pPr>
+              <w:spacing w:line="240" w:lineRule="auto"/>
+            </w:pPr>
+            <w:r>
+              <w:rPr>
+                <w:rFonts w:ascii="Times New Roman" w:cs="Times New Roman" w:eastAsia="Times New Roman" w:hAnsi="Times New Roman"/>
+                <w:b w:val="false"/>
+                <w:bCs w:val="false"/>
+                <w:sz w:val="20"/>
+                <w:szCs w:val="20"/>
+              </w:rPr>
+              <w:t xml:space="preserve">+0.024 (0.014)</w:t>
+            </w:r>
+          </w:p>
+        </w:tc>
+        <w:tc>
+          <w:tcPr>
+            <w:tcW w:type="dxa" w:w="1160"/>
+            <w:tcBorders>
+              <w:top w:val="none" w:color="FFFFFF" w:sz="0"/>
+              <w:left w:val="none" w:color="FFFFFF" w:sz="0"/>
+              <w:bottom w:val="none" w:color="FFFFFF" w:sz="0"/>
+              <w:right w:val="none" w:color="FFFFFF" w:sz="0"/>
+            </w:tcBorders>
+            <w:tcMar>
+              <w:top w:type="dxa" w:w="50"/>
+              <w:left w:type="dxa" w:w="90"/>
+              <w:bottom w:type="dxa" w:w="50"/>
+              <w:right w:type="dxa" w:w="90"/>
+            </w:tcMar>
+          </w:tcPr>
+          <w:p>
+            <w:pPr>
+              <w:spacing w:line="240" w:lineRule="auto"/>
+            </w:pPr>
+            <w:r>
+              <w:rPr>
+                <w:rFonts w:ascii="Times New Roman" w:cs="Times New Roman" w:eastAsia="Times New Roman" w:hAnsi="Times New Roman"/>
+                <w:b w:val="false"/>
+                <w:bCs w:val="false"/>
+                <w:sz w:val="20"/>
+                <w:szCs w:val="20"/>
+              </w:rPr>
+              <w:t xml:space="preserve">+0.008 (0.013)</w:t>
+            </w:r>
+          </w:p>
+        </w:tc>
+        <w:tc>
+          <w:tcPr>
+            <w:tcW w:type="dxa" w:w="1160"/>
+            <w:tcBorders>
+              <w:top w:val="none" w:color="FFFFFF" w:sz="0"/>
+              <w:left w:val="none" w:color="FFFFFF" w:sz="0"/>
+              <w:bottom w:val="none" w:color="FFFFFF" w:sz="0"/>
+              <w:right w:val="none" w:color="FFFFFF" w:sz="0"/>
+            </w:tcBorders>
+            <w:tcMar>
+              <w:top w:type="dxa" w:w="50"/>
+              <w:left w:type="dxa" w:w="90"/>
+              <w:bottom w:type="dxa" w:w="50"/>
+              <w:right w:type="dxa" w:w="90"/>
+            </w:tcMar>
+          </w:tcPr>
+          <w:p>
+            <w:pPr>
+              <w:spacing w:line="240" w:lineRule="auto"/>
+            </w:pPr>
+            <w:r>
+              <w:rPr>
+                <w:rFonts w:ascii="Times New Roman" w:cs="Times New Roman" w:eastAsia="Times New Roman" w:hAnsi="Times New Roman"/>
+                <w:b w:val="false"/>
+                <w:bCs w:val="false"/>
+                <w:sz w:val="20"/>
+                <w:szCs w:val="20"/>
+              </w:rPr>
+              <w:t xml:space="preserve">+0.011 (0.009)</w:t>
+            </w:r>
+          </w:p>
+        </w:tc>
+        <w:tc>
+          <w:tcPr>
+            <w:tcW w:type="dxa" w:w="1160"/>
+            <w:tcBorders>
+              <w:top w:val="none" w:color="FFFFFF" w:sz="0"/>
+              <w:left w:val="none" w:color="FFFFFF" w:sz="0"/>
+              <w:bottom w:val="none" w:color="FFFFFF" w:sz="0"/>
+              <w:right w:val="none" w:color="FFFFFF" w:sz="0"/>
+            </w:tcBorders>
+            <w:tcMar>
+              <w:top w:type="dxa" w:w="50"/>
+              <w:left w:type="dxa" w:w="90"/>
+              <w:bottom w:type="dxa" w:w="50"/>
+              <w:right w:type="dxa" w:w="90"/>
+            </w:tcMar>
+          </w:tcPr>
+          <w:p>
+            <w:pPr>
+              <w:spacing w:line="240" w:lineRule="auto"/>
+            </w:pPr>
+            <w:r>
+              <w:rPr>
+                <w:rFonts w:ascii="Times New Roman" w:cs="Times New Roman" w:eastAsia="Times New Roman" w:hAnsi="Times New Roman"/>
+                <w:b w:val="false"/>
+                <w:bCs w:val="false"/>
+                <w:sz w:val="20"/>
+                <w:szCs w:val="20"/>
+              </w:rPr>
+              <w:t xml:space="preserve">−0.016 (0.006)</w:t>
+            </w:r>
+          </w:p>
+        </w:tc>
+        <w:tc>
+          <w:tcPr>
+            <w:tcW w:type="dxa" w:w="1160"/>
+            <w:tcBorders>
+              <w:top w:val="none" w:color="FFFFFF" w:sz="0"/>
+              <w:left w:val="none" w:color="FFFFFF" w:sz="0"/>
+              <w:bottom w:val="none" w:color="FFFFFF" w:sz="0"/>
+              <w:right w:val="none" w:color="FFFFFF" w:sz="0"/>
+            </w:tcBorders>
+            <w:tcMar>
+              <w:top w:type="dxa" w:w="50"/>
+              <w:left w:type="dxa" w:w="90"/>
+              <w:bottom w:type="dxa" w:w="50"/>
+              <w:right w:type="dxa" w:w="90"/>
+            </w:tcMar>
+          </w:tcPr>
+          <w:p>
+            <w:pPr>
+              <w:spacing w:line="240" w:lineRule="auto"/>
+            </w:pPr>
+            <w:r>
+              <w:rPr>
+                <w:rFonts w:ascii="Times New Roman" w:cs="Times New Roman" w:eastAsia="Times New Roman" w:hAnsi="Times New Roman"/>
+                <w:b w:val="false"/>
+                <w:bCs w:val="false"/>
+                <w:sz w:val="20"/>
+                <w:szCs w:val="20"/>
+              </w:rPr>
+              <w:t xml:space="preserve">−0.012 (0.017)</w:t>
+            </w:r>
+          </w:p>
+        </w:tc>
+      </w:tr>
+      <w:tr>
+        <w:trPr>
+          <w:cantSplit/>
+          <w:tblHeader w:val="false"/>
+        </w:trPr>
+        <w:tc>
+          <w:tcPr>
+            <w:tcW w:type="dxa" w:w="3560"/>
+            <w:tcBorders>
+              <w:top w:val="none" w:color="FFFFFF" w:sz="0"/>
+              <w:left w:val="none" w:color="FFFFFF" w:sz="0"/>
+              <w:bottom w:val="none" w:color="FFFFFF" w:sz="0"/>
+              <w:right w:val="none" w:color="FFFFFF" w:sz="0"/>
+            </w:tcBorders>
+            <w:tcMar>
+              <w:top w:type="dxa" w:w="50"/>
+              <w:left w:type="dxa" w:w="90"/>
+              <w:bottom w:type="dxa" w:w="50"/>
+              <w:right w:type="dxa" w:w="90"/>
+            </w:tcMar>
+          </w:tcPr>
+          <w:p>
+            <w:pPr>
+              <w:spacing w:line="240" w:lineRule="auto"/>
+            </w:pPr>
+            <w:r>
+              <w:rPr>
+                <w:rFonts w:ascii="Times New Roman" w:cs="Times New Roman" w:eastAsia="Times New Roman" w:hAnsi="Times New Roman"/>
+                <w:b w:val="false"/>
+                <w:bCs w:val="false"/>
+                <w:sz w:val="20"/>
+                <w:szCs w:val="20"/>
+              </w:rPr>
+              <w:t xml:space="preserve">Country-year FE, no LLM control</w:t>
+            </w:r>
+          </w:p>
+        </w:tc>
+        <w:tc>
+          <w:tcPr>
+            <w:tcW w:type="dxa" w:w="1160"/>
+            <w:tcBorders>
+              <w:top w:val="none" w:color="FFFFFF" w:sz="0"/>
+              <w:left w:val="none" w:color="FFFFFF" w:sz="0"/>
+              <w:bottom w:val="none" w:color="FFFFFF" w:sz="0"/>
+              <w:right w:val="none" w:color="FFFFFF" w:sz="0"/>
+            </w:tcBorders>
+            <w:tcMar>
+              <w:top w:type="dxa" w:w="50"/>
+              <w:left w:type="dxa" w:w="90"/>
+              <w:bottom w:type="dxa" w:w="50"/>
+              <w:right w:type="dxa" w:w="90"/>
+            </w:tcMar>
+          </w:tcPr>
+          <w:p>
+            <w:pPr>
+              <w:spacing w:line="240" w:lineRule="auto"/>
+            </w:pPr>
+            <w:r>
+              <w:rPr>
+                <w:rFonts w:ascii="Times New Roman" w:cs="Times New Roman" w:eastAsia="Times New Roman" w:hAnsi="Times New Roman"/>
+                <w:b w:val="false"/>
+                <w:bCs w:val="false"/>
+                <w:sz w:val="20"/>
+                <w:szCs w:val="20"/>
+              </w:rPr>
+              <w:t xml:space="preserve">+0.008 (0.013)</w:t>
+            </w:r>
+          </w:p>
+        </w:tc>
+        <w:tc>
+          <w:tcPr>
+            <w:tcW w:type="dxa" w:w="1160"/>
+            <w:tcBorders>
+              <w:top w:val="none" w:color="FFFFFF" w:sz="0"/>
+              <w:left w:val="none" w:color="FFFFFF" w:sz="0"/>
+              <w:bottom w:val="none" w:color="FFFFFF" w:sz="0"/>
+              <w:right w:val="none" w:color="FFFFFF" w:sz="0"/>
+            </w:tcBorders>
+            <w:tcMar>
+              <w:top w:type="dxa" w:w="50"/>
+              <w:left w:type="dxa" w:w="90"/>
+              <w:bottom w:type="dxa" w:w="50"/>
+              <w:right w:type="dxa" w:w="90"/>
+            </w:tcMar>
+          </w:tcPr>
+          <w:p>
+            <w:pPr>
+              <w:spacing w:line="240" w:lineRule="auto"/>
+            </w:pPr>
+            <w:r>
+              <w:rPr>
+                <w:rFonts w:ascii="Times New Roman" w:cs="Times New Roman" w:eastAsia="Times New Roman" w:hAnsi="Times New Roman"/>
+                <w:b w:val="false"/>
+                <w:bCs w:val="false"/>
+                <w:sz w:val="20"/>
+                <w:szCs w:val="20"/>
+              </w:rPr>
+              <w:t xml:space="preserve">−0.002 (0.013)</w:t>
+            </w:r>
+          </w:p>
+        </w:tc>
+        <w:tc>
+          <w:tcPr>
+            <w:tcW w:type="dxa" w:w="1160"/>
+            <w:tcBorders>
+              <w:top w:val="none" w:color="FFFFFF" w:sz="0"/>
+              <w:left w:val="none" w:color="FFFFFF" w:sz="0"/>
+              <w:bottom w:val="none" w:color="FFFFFF" w:sz="0"/>
+              <w:right w:val="none" w:color="FFFFFF" w:sz="0"/>
+            </w:tcBorders>
+            <w:tcMar>
+              <w:top w:type="dxa" w:w="50"/>
+              <w:left w:type="dxa" w:w="90"/>
+              <w:bottom w:type="dxa" w:w="50"/>
+              <w:right w:type="dxa" w:w="90"/>
+            </w:tcMar>
+          </w:tcPr>
+          <w:p>
+            <w:pPr>
+              <w:spacing w:line="240" w:lineRule="auto"/>
+            </w:pPr>
+            <w:r>
+              <w:rPr>
+                <w:rFonts w:ascii="Times New Roman" w:cs="Times New Roman" w:eastAsia="Times New Roman" w:hAnsi="Times New Roman"/>
+                <w:b w:val="false"/>
+                <w:bCs w:val="false"/>
+                <w:sz w:val="20"/>
+                <w:szCs w:val="20"/>
+              </w:rPr>
+              <w:t xml:space="preserve">+0.008 (0.008)</w:t>
+            </w:r>
+          </w:p>
+        </w:tc>
+        <w:tc>
+          <w:tcPr>
+            <w:tcW w:type="dxa" w:w="1160"/>
+            <w:tcBorders>
+              <w:top w:val="none" w:color="FFFFFF" w:sz="0"/>
+              <w:left w:val="none" w:color="FFFFFF" w:sz="0"/>
+              <w:bottom w:val="none" w:color="FFFFFF" w:sz="0"/>
+              <w:right w:val="none" w:color="FFFFFF" w:sz="0"/>
+            </w:tcBorders>
+            <w:tcMar>
+              <w:top w:type="dxa" w:w="50"/>
+              <w:left w:type="dxa" w:w="90"/>
+              <w:bottom w:type="dxa" w:w="50"/>
+              <w:right w:type="dxa" w:w="90"/>
+            </w:tcMar>
+          </w:tcPr>
+          <w:p>
+            <w:pPr>
+              <w:spacing w:line="240" w:lineRule="auto"/>
+            </w:pPr>
+            <w:r>
+              <w:rPr>
+                <w:rFonts w:ascii="Times New Roman" w:cs="Times New Roman" w:eastAsia="Times New Roman" w:hAnsi="Times New Roman"/>
+                <w:b w:val="false"/>
+                <w:bCs w:val="false"/>
+                <w:sz w:val="20"/>
+                <w:szCs w:val="20"/>
+              </w:rPr>
+              <w:t xml:space="preserve">−0.037 (0.009)</w:t>
+            </w:r>
+          </w:p>
+        </w:tc>
+        <w:tc>
+          <w:tcPr>
+            <w:tcW w:type="dxa" w:w="1160"/>
+            <w:tcBorders>
+              <w:top w:val="none" w:color="FFFFFF" w:sz="0"/>
+              <w:left w:val="none" w:color="FFFFFF" w:sz="0"/>
+              <w:bottom w:val="none" w:color="FFFFFF" w:sz="0"/>
+              <w:right w:val="none" w:color="FFFFFF" w:sz="0"/>
+            </w:tcBorders>
+            <w:tcMar>
+              <w:top w:type="dxa" w:w="50"/>
+              <w:left w:type="dxa" w:w="90"/>
+              <w:bottom w:type="dxa" w:w="50"/>
+              <w:right w:type="dxa" w:w="90"/>
+            </w:tcMar>
+          </w:tcPr>
+          <w:p>
+            <w:pPr>
+              <w:spacing w:line="240" w:lineRule="auto"/>
+            </w:pPr>
+            <w:r>
+              <w:rPr>
+                <w:rFonts w:ascii="Times New Roman" w:cs="Times New Roman" w:eastAsia="Times New Roman" w:hAnsi="Times New Roman"/>
+                <w:b w:val="false"/>
+                <w:bCs w:val="false"/>
+                <w:sz w:val="20"/>
+                <w:szCs w:val="20"/>
+              </w:rPr>
+              <w:t xml:space="preserve">−0.059 (0.021)</w:t>
+            </w:r>
+          </w:p>
+        </w:tc>
+      </w:tr>
+      <w:tr>
+        <w:trPr>
+          <w:cantSplit/>
+          <w:tblHeader w:val="false"/>
+        </w:trPr>
+        <w:tc>
+          <w:tcPr>
+            <w:tcW w:type="dxa" w:w="3560"/>
+            <w:tcBorders>
+              <w:top w:val="none" w:color="FFFFFF" w:sz="0"/>
+              <w:left w:val="none" w:color="FFFFFF" w:sz="0"/>
+              <w:bottom w:val="single" w:color="000000" w:sz="4"/>
+              <w:right w:val="none" w:color="FFFFFF" w:sz="0"/>
+            </w:tcBorders>
+            <w:tcMar>
+              <w:top w:type="dxa" w:w="50"/>
+              <w:left w:type="dxa" w:w="90"/>
+              <w:bottom w:type="dxa" w:w="50"/>
+              <w:right w:type="dxa" w:w="90"/>
+            </w:tcMar>
+          </w:tcPr>
+          <w:p>
+            <w:pPr>
+              <w:spacing w:line="240" w:lineRule="auto"/>
+            </w:pPr>
+            <w:r>
+              <w:rPr>
+                <w:rFonts w:ascii="Times New Roman" w:cs="Times New Roman" w:eastAsia="Times New Roman" w:hAnsi="Times New Roman"/>
+                <w:b w:val="false"/>
+                <w:bCs w:val="false"/>
+                <w:sz w:val="20"/>
+                <w:szCs w:val="20"/>
+              </w:rPr>
+              <w:t xml:space="preserve">Randomization p (LLM control)</w:t>
+            </w:r>
+          </w:p>
+        </w:tc>
+        <w:tc>
+          <w:tcPr>
+            <w:tcW w:type="dxa" w:w="1160"/>
+            <w:tcBorders>
+              <w:top w:val="none" w:color="FFFFFF" w:sz="0"/>
+              <w:left w:val="none" w:color="FFFFFF" w:sz="0"/>
+              <w:bottom w:val="single" w:color="000000" w:sz="4"/>
+              <w:right w:val="none" w:color="FFFFFF" w:sz="0"/>
+            </w:tcBorders>
+            <w:tcMar>
+              <w:top w:type="dxa" w:w="50"/>
+              <w:left w:type="dxa" w:w="90"/>
+              <w:bottom w:type="dxa" w:w="50"/>
+              <w:right w:type="dxa" w:w="90"/>
+            </w:tcMar>
+          </w:tcPr>
+          <w:p>
+            <w:pPr>
+              <w:spacing w:line="240" w:lineRule="auto"/>
+            </w:pPr>
+          </w:p>
+        </w:tc>
+        <w:tc>
+          <w:tcPr>
+            <w:tcW w:type="dxa" w:w="1160"/>
+            <w:tcBorders>
+              <w:top w:val="none" w:color="FFFFFF" w:sz="0"/>
+              <w:left w:val="none" w:color="FFFFFF" w:sz="0"/>
+              <w:bottom w:val="single" w:color="000000" w:sz="4"/>
+              <w:right w:val="none" w:color="FFFFFF" w:sz="0"/>
+            </w:tcBorders>
+            <w:tcMar>
+              <w:top w:type="dxa" w:w="50"/>
+              <w:left w:type="dxa" w:w="90"/>
+              <w:bottom w:type="dxa" w:w="50"/>
+              <w:right w:type="dxa" w:w="90"/>
+            </w:tcMar>
+          </w:tcPr>
+          <w:p>
+            <w:pPr>
+              <w:spacing w:line="240" w:lineRule="auto"/>
+            </w:pPr>
+          </w:p>
+        </w:tc>
+        <w:tc>
+          <w:tcPr>
+            <w:tcW w:type="dxa" w:w="1160"/>
+            <w:tcBorders>
+              <w:top w:val="none" w:color="FFFFFF" w:sz="0"/>
+              <w:left w:val="none" w:color="FFFFFF" w:sz="0"/>
+              <w:bottom w:val="single" w:color="000000" w:sz="4"/>
+              <w:right w:val="none" w:color="FFFFFF" w:sz="0"/>
+            </w:tcBorders>
+            <w:tcMar>
+              <w:top w:type="dxa" w:w="50"/>
+              <w:left w:type="dxa" w:w="90"/>
+              <w:bottom w:type="dxa" w:w="50"/>
+              <w:right w:type="dxa" w:w="90"/>
+            </w:tcMar>
+          </w:tcPr>
+          <w:p>
+            <w:pPr>
+              <w:spacing w:line="240" w:lineRule="auto"/>
+            </w:pPr>
+          </w:p>
+        </w:tc>
+        <w:tc>
+          <w:tcPr>
+            <w:tcW w:type="dxa" w:w="1160"/>
+            <w:tcBorders>
+              <w:top w:val="none" w:color="FFFFFF" w:sz="0"/>
+              <w:left w:val="none" w:color="FFFFFF" w:sz="0"/>
+              <w:bottom w:val="single" w:color="000000" w:sz="4"/>
+              <w:right w:val="none" w:color="FFFFFF" w:sz="0"/>
+            </w:tcBorders>
+            <w:tcMar>
+              <w:top w:type="dxa" w:w="50"/>
+              <w:left w:type="dxa" w:w="90"/>
+              <w:bottom w:type="dxa" w:w="50"/>
+              <w:right w:type="dxa" w:w="90"/>
+            </w:tcMar>
+          </w:tcPr>
+          <w:p>
+            <w:pPr>
+              <w:spacing w:line="240" w:lineRule="auto"/>
+            </w:pPr>
+            <w:r>
+              <w:rPr>
+                <w:rFonts w:ascii="Times New Roman" w:cs="Times New Roman" w:eastAsia="Times New Roman" w:hAnsi="Times New Roman"/>
+                <w:b w:val="false"/>
+                <w:bCs w:val="false"/>
+                <w:sz w:val="20"/>
+                <w:szCs w:val="20"/>
+              </w:rPr>
+              <w:t xml:space="preserve">0.016</w:t>
+            </w:r>
+          </w:p>
+        </w:tc>
+        <w:tc>
+          <w:tcPr>
+            <w:tcW w:type="dxa" w:w="1160"/>
+            <w:tcBorders>
+              <w:top w:val="none" w:color="FFFFFF" w:sz="0"/>
+              <w:left w:val="none" w:color="FFFFFF" w:sz="0"/>
+              <w:bottom w:val="single" w:color="000000" w:sz="4"/>
+              <w:right w:val="none" w:color="FFFFFF" w:sz="0"/>
+            </w:tcBorders>
+            <w:tcMar>
+              <w:top w:type="dxa" w:w="50"/>
+              <w:left w:type="dxa" w:w="90"/>
+              <w:bottom w:type="dxa" w:w="50"/>
+              <w:right w:type="dxa" w:w="90"/>
+            </w:tcMar>
+          </w:tcPr>
+          <w:p>
+            <w:pPr>
+              <w:spacing w:line="240" w:lineRule="auto"/>
+            </w:pPr>
+            <w:r>
+              <w:rPr>
+                <w:rFonts w:ascii="Times New Roman" w:cs="Times New Roman" w:eastAsia="Times New Roman" w:hAnsi="Times New Roman"/>
+                <w:b w:val="false"/>
+                <w:bCs w:val="false"/>
+                <w:sz w:val="20"/>
+                <w:szCs w:val="20"/>
+              </w:rPr>
+              <w:t xml:space="preserve">0.188</w:t>
+            </w:r>
+          </w:p>
+        </w:tc>
+      </w:tr>
+    </w:tbl>
+    <w:p>
+      <w:pPr>
+        <w:spacing w:after="200" w:before="60" w:line="240" w:lineRule="auto"/>
+      </w:pPr>
+      <w:r>
+        <w:rPr>
+          <w:rFonts w:ascii="Times New Roman" w:cs="Times New Roman" w:eastAsia="Times New Roman" w:hAnsi="Times New Roman"/>
+          <w:i/>
+          <w:iCs/>
+          <w:sz w:val="20"/>
+          <w:szCs w:val="20"/>
+        </w:rPr>
+        <w:t xml:space="preserve">Note.</w:t>
+      </w:r>
+      <w:r>
+        <w:rPr>
+          <w:rFonts w:ascii="Times New Roman" w:cs="Times New Roman" w:eastAsia="Times New Roman" w:hAnsi="Times New Roman"/>
+          <w:sz w:val="20"/>
+          <w:szCs w:val="20"/>
+        </w:rPr>
+        <w:t xml:space="preserve"> Eurostat experimental statistics on online job advertisements by ISCO three-digit occupation; 604 country-occupation cells, 96 occupations, 16 countries in 2023. Standard errors clustered by ISCO three-digit occupation in parentheses; 2022 is the base year.</w:t>
+      </w:r>
+    </w:p>
+    <w:p>
+      <w:pPr>
+        <w:pStyle w:val="Heading2"/>
+        <w:keepNext/>
+        <w:spacing w:after="120" w:before="240" w:line="240" w:lineRule="auto"/>
+      </w:pPr>
+      <w:r>
+        <w:rPr>
+          <w:rFonts w:ascii="Times New Roman" w:cs="Times New Roman" w:eastAsia="Times New Roman" w:hAnsi="Times New Roman"/>
+          <w:b/>
+          <w:bCs/>
+          <w:sz w:val="24"/>
+          <w:szCs w:val="24"/>
+        </w:rPr>
+        <w:t xml:space="preserve">6.4 UK Adverts: Occupation Groups</w:t>
+      </w:r>
+    </w:p>
+    <w:p>
+      <w:pPr>
+        <w:spacing w:after="0" w:line="480" w:lineRule="auto"/>
+        <w:ind w:firstLine="720"/>
+        <w:jc w:val="left"/>
+      </w:pPr>
+      <w:r>
+        <w:rPr>
+          <w:rFonts w:ascii="Times New Roman" w:cs="Times New Roman" w:eastAsia="Times New Roman" w:hAnsi="Times New Roman"/>
+          <w:sz w:val="24"/>
+          <w:szCs w:val="24"/>
+        </w:rPr>
+        <w:t xml:space="preserve">The three groups chosen from occupation labels show a similar story with larger numbers (Table 6). Relative to other occupations, adverts for image and video production occupations fell by 0.20 log points in the first year after the base year (randomization p = 0.032) and by 0.38 in the third and fourth (p = 0.011). Creative direction occupations fell by less (−0.11 in the first year and −0.23 in the third; p between 0.15 and 0.27). Text production occupations did not differ from others in the first two years (−0.10 and +0.03) and fell later (−0.33 in the third year, p = 0.046; −0.47 in the fourth, p = 0.008), led by journalists and editors. The decline in image and video production is concentrated in web design professionals, who rank first or third among 405 occupations in the later years (log changes of −1.45 and −1.36 against a comparison median of −0.43 and −0.46); graphic and multimedia designers rank 32nd to 38th (−0.86 and −0.89), and artists and photographers are close to the median. Without web design professionals the third- and fourth-year differences fall to −0.16 and −0.21. Placebo design occupations that image generators do not target (interior designers, fashion and accessories designers, design occupations not elsewhere classified) also fell relative to others (−0.16, −0.20, and −0.06 in the first, third, and fourth years). Between June 2019 and June 2021 the image and video production group had already fallen by 0.32 log points relative to others, and the other two groups by 0.36 and 0.31.</w:t>
+      </w:r>
+    </w:p>
+    <w:p>
+      <w:pPr>
+        <w:keepNext/>
+        <w:spacing w:after="80" w:before="240" w:line="240" w:lineRule="auto"/>
+        <w:jc w:val="center"/>
+      </w:pPr>
+      <w:r>
+        <w:rPr>
+          <w:rFonts w:ascii="Times New Roman" w:cs="Times New Roman" w:eastAsia="Times New Roman" w:hAnsi="Times New Roman"/>
+          <w:b/>
+          <w:bCs/>
+          <w:sz w:val="22"/>
+          <w:szCs w:val="22"/>
+        </w:rPr>
+        <w:t xml:space="preserve">Table 6.</w:t>
       </w:r>
       <w:r>
         <w:rPr>
@@ -6502,7 +7386,7 @@
           <w:sz w:val="24"/>
           <w:szCs w:val="24"/>
         </w:rPr>
-        <w:t xml:space="preserve">6.4 Quality-Requirement Heterogeneity (H2)</w:t>
+        <w:t xml:space="preserve">6.5 Quality-Requirement Heterogeneity (H2)</w:t>
       </w:r>
     </w:p>
     <w:p>
@@ -6517,7 +7401,7 @@
           <w:sz w:val="24"/>
           <w:szCs w:val="24"/>
         </w:rPr>
-        <w:t xml:space="preserve">H2 is not supported. Exposure to low-quality-requirement creation tasks is associated with declines in 2023 and 2024 (−0.026 and −0.019, standard errors 0.016 and 0.023), but the coefficient is close to zero in 2025 (−0.005) and small in 2026 (−0.017). Exposure to high-requirement tasks has coefficients near zero throughout. The difference between the low and high coefficients is −0.029 (standard error 0.025) in 2023, −0.028 (0.036) in 2024, 0.000 (0.033) in 2025, and −0.014 (0.036) in 2026 (Table 6). The difference has the same sign in the pre-period (−0.046 in 2018 and −0.031 in 2019), and none of the differences is statistically distinguishable from zero. Low- and high-requirement exposure are correlated across occupations (0.48), which limits power. We cannot reject that quality requirements matter, but we find no support for it.</w:t>
+        <w:t xml:space="preserve">H2 is not supported. Exposure to low-quality-requirement creation tasks is associated with declines in 2023 and 2024 (−0.026 and −0.019, standard errors 0.016 and 0.023), but the coefficient is close to zero in 2025 (−0.005) and small in 2026 (−0.017). Exposure to high-requirement tasks has coefficients near zero throughout. The difference between the low and high coefficients is −0.029 (standard error 0.025) in 2023, −0.028 (0.036) in 2024, 0.000 (0.033) in 2025, and −0.014 (0.036) in 2026 (Table 7). The difference has the same sign in the pre-period (−0.046 in 2018 and −0.031 in 2019), and none of the differences is statistically distinguishable from zero. Low- and high-requirement exposure are correlated across occupations (0.48), which limits power. We cannot reject that quality requirements matter, but we find no support for it.</w:t>
       </w:r>
     </w:p>
     <w:p>
@@ -6534,7 +7418,7 @@
           <w:sz w:val="22"/>
           <w:szCs w:val="22"/>
         </w:rPr>
-        <w:t xml:space="preserve">Table 6.</w:t>
+        <w:t xml:space="preserve">Table 7.</w:t>
       </w:r>
       <w:r>
         <w:rPr>
@@ -7769,7 +8653,7 @@
           <w:sz w:val="24"/>
           <w:szCs w:val="24"/>
         </w:rPr>
-        <w:t xml:space="preserve">6.5 Scaling by Adoption</w:t>
+        <w:t xml:space="preserve">6.6 Scaling by Adoption</w:t>
       </w:r>
     </w:p>
     <w:p>
@@ -7784,7 +8668,7 @@
           <w:sz w:val="24"/>
           <w:szCs w:val="24"/>
         </w:rPr>
-        <w:t xml:space="preserve">Table 7 applies equation (2). For graphic and multimedia designers, who have the highest exposure (8.0 standard deviations above the mean), the coefficients imply a predicted log change of −0.17 in 2025 and −0.26 in 2026 (specification with the language control). If 36% of employers of this occupation had adopted, which is the EU27 rate in publishing, film, and broadcasting, the implied effect among adopters would be −0.46 and −0.73 log points, a fall in adverts of 37% to 52% among adopters. At the EU27 average adoption rate of 10% the implied effect among adopters is −1.7 and −2.6 log points, which means 81% to 93% fewer adverts. The lower end of the 95% interval is larger still. Without the language control the implied numbers are about twice as large. These magnitudes are implausibly large for substitution among adopters, who would have to cut hiring for the occupation sharply and persistently within a few years of a technology’s release, while still adopting less than the average firm in the professions that employ designers. Either adoption among employers of these occupations is far higher than the sector averages in Table 2, or most of the observed decline is not due to adoption of generative visual AI. The first reading is possible because designers are concentrated in sectors with higher adoption and in small firms that buy tools off the shelf. The second reading is consistent with the COVID-era pattern in Section 6.2 and with the decline of design occupations that image generators do not target.</w:t>
+        <w:t xml:space="preserve">Table 8 applies equation (2). For graphic and multimedia designers, who have the highest exposure (8.0 standard deviations above the mean), the coefficients imply a predicted log change of −0.17 in 2025 and −0.26 in 2026 (specification with the language control). If 36% of employers of this occupation had adopted, which is the EU27 rate in publishing, film, and broadcasting, the implied effect among adopters would be −0.46 and −0.73 log points, a fall in adverts of 37% to 52% among adopters. At the EU27 average adoption rate of 10% the implied effect among adopters is −1.7 and −2.6 log points, which means 81% to 93% fewer adverts. The lower end of the 95% interval is larger still. Without the language control the implied numbers are about twice as large. These magnitudes are implausibly large for substitution among adopters, who would have to cut hiring for the occupation sharply and persistently within a few years of a technology’s release, while still adopting less than the average firm in the professions that employ designers. Either adoption among employers of these occupations is far higher than the sector averages in Table 2, or most of the observed decline is not due to adoption of generative visual AI. The first reading is possible because designers are concentrated in sectors with higher adoption and in small firms that buy tools off the shelf. The second reading is consistent with the COVID-era pattern in Section 6.2 and with the decline of design occupations that image generators do not target.</w:t>
       </w:r>
     </w:p>
     <w:p>
@@ -7801,7 +8685,7 @@
           <w:sz w:val="22"/>
           <w:szCs w:val="22"/>
         </w:rPr>
-        <w:t xml:space="preserve">Table 7.</w:t>
+        <w:t xml:space="preserve">Table 8.</w:t>
       </w:r>
       <w:r>
         <w:rPr>
@@ -8704,7 +9588,7 @@
           <w:sz w:val="24"/>
           <w:szCs w:val="24"/>
         </w:rPr>
-        <w:t xml:space="preserve">6.6 Supplementary Evidence: US Sectors and European Employment</w:t>
+        <w:t xml:space="preserve">6.7 Supplementary Evidence: US Sectors and European Employment</w:t>
       </w:r>
     </w:p>
     <w:p>
@@ -8736,7 +9620,7 @@
           <w:sz w:val="24"/>
           <w:szCs w:val="24"/>
         </w:rPr>
-        <w:t xml:space="preserve">6.7 Summary of Evidence Against the Hypotheses</w:t>
+        <w:t xml:space="preserve">6.8 Summary of Evidence Against the Hypotheses</w:t>
       </w:r>
     </w:p>
     <w:p>
@@ -8751,7 +9635,7 @@
           <w:sz w:val="24"/>
           <w:szCs w:val="24"/>
         </w:rPr>
-        <w:t xml:space="preserve">H1 is supported in a limited sense: adoption is substantial and rising, while estimated labor-demand effects are small, imprecise, and partly a reversal of earlier trends; the scaling exercise shows that the largest observed declines are too large for current adoption to explain through substitution. H2 is not supported. H3 is partly supported: firms cite expertise and legal and privacy uncertainty far more than usefulness, but cross-country variation in these concerns does not clearly explain adoption. H4 is weakly supported: the coefficients are most negative in 2026, but the pattern is not monotone and the effect cannot be separated from the pre-existing pattern.</w:t>
+        <w:t xml:space="preserve">H1 is supported in a limited sense: adoption is substantial and rising, while estimated labor-demand effects are small, imprecise, and partly a reversal of earlier trends; the scaling exercise shows that the largest observed declines are too large for current adoption to explain through substitution. H2 is not supported. H3 is partly supported: firms cite expertise and legal and privacy uncertainty far more than usefulness, but cross-country variation in these concerns does not clearly explain adoption. H4 is weakly supported: in the UK the coefficients are most negative in 2026 and in Europe without the language control they grow from 2023 to 2024, but in both the pattern is not clearly monotone and in the UK the effect cannot be separated from the pre-existing pattern. The European replication strengthens the direction of the result and removes the pre-trend concern, but it covers only two post-2022 years.</w:t>
       </w:r>
     </w:p>
     <w:p>
@@ -8801,7 +9685,7 @@
           <w:sz w:val="24"/>
           <w:szCs w:val="24"/>
         </w:rPr>
-        <w:t xml:space="preserve">The paper offers a model that decomposes the labor-demand effect of a technology into adoption and the net effect among adopters, and uses it to bound what adoption can explain. It brings direct survey evidence on obstacles to adoption, which are expertise and legal and privacy uncertainty, and shows that adoption of generative visual AI is already substantial. It links task-level data on visual content creation to occupation-level hiring data across countries with an open and reproducible pipeline, and shows that estimated effects are small and sensitive to a few occupations. For research on delayed diffusion, the results illustrate how adoption statistics and labor outcomes can diverge: the adoption statistics are high enough to signal an early-adoption phase, while the labor outcomes have not yet moved in a way that can be attributed to the technology.</w:t>
+        <w:t xml:space="preserve">The paper offers a model that decomposes the labor-demand effect of a technology into adoption and the net effect among adopters, and uses it to bound what adoption can explain. It brings direct survey evidence on obstacles to adoption, which are expertise and legal and privacy uncertainty, and shows that adoption of generative visual AI is already substantial. It links task-level data on visual content creation to occupation-level hiring data across countries with an open and reproducible pipeline, and shows that estimated effects are small, have the same sign in a European replication, and are sensitive to a few occupations in the UK. For research on delayed diffusion, the results illustrate how adoption statistics and labor outcomes can diverge: the adoption statistics are high enough to signal an early-adoption phase, while the labor outcomes have not yet moved in a way that can be attributed to the technology.</w:t>
       </w:r>
     </w:p>
     <w:p>
@@ -8865,7 +9749,7 @@
           <w:sz w:val="24"/>
           <w:szCs w:val="24"/>
         </w:rPr>
-        <w:t xml:space="preserve">The identification is weak. Exposure is a continuous measure, but the pre-period contains the COVID shock, and the post-2022 pattern resembles a reversal of the 2022 recovery; the coefficients are small and rely on a few occupations. We do not observe adoption by employers of each occupation, so the scaling exercise is a stylized check. The adoption survey covers Europe and asks about AI in general for the barriers, whereas the hiring data are for the United Kingdom, so we link them only through sector averages. The Eurostat indicator for generative visual AI is available for one year, so we cannot show its growth. The exposure measure is LLM-coded and has not been validated against human coders, although a rule-based score gives similar results. The mapping from O*NET to UK occupations goes through ISCO-08 and is approximate. The ONS series is experimental and has missing months that we interpolate. Adverts measure hiring intent, not employment, and substitution may occur through hours, outsourcing, or freelancing, which adverts cannot show. Model release dates are approximate. Finally, our model abstracts from changes in the quality and variety of assets and from price effects.</w:t>
+        <w:t xml:space="preserve">The identification is weak. Exposure is a continuous measure, but the pre-period contains the COVID shock, and the post-2022 pattern resembles a reversal of the 2022 recovery; the coefficients are small and rely on a few occupations. We do not observe adoption by employers of each occupation, so the scaling exercise is a stylized check. The adoption survey covers Europe and asks about AI in general for the barriers, whereas the hiring data are for the United Kingdom, so we link them only through sector averages. The Eurostat indicator for generative visual AI is available for one year, so we cannot show its growth. The European replication uses experimental statistics that cover 16 countries, ISCO three-digit occupations, and only two post-2022 years, and it ends in 2024. The exposure measure is LLM-coded and has not been validated against human coders, although a rule-based score gives similar results. The mapping from O*NET to UK occupations goes through ISCO-08 and is approximate. The ONS series is experimental and has missing months that we interpolate. Adverts measure hiring intent, not employment, and substitution may occur through hours, outsourcing, or freelancing, which adverts cannot show. Model release dates are approximate. Finally, our model abstracts from changes in the quality and variety of assets and from price effects.</w:t>
       </w:r>
     </w:p>
     <w:p>
@@ -9197,7 +10081,7 @@
           <w:sz w:val="24"/>
           <w:szCs w:val="24"/>
         </w:rPr>
-        <w:t xml:space="preserve">Eurostat. ICT usage in enterprises: artificial intelligence by size class of enterprise (isoc_eb_ai) and by NACE Rev. 2 activity (isoc_eb_ain2); Labour Force Survey employed persons by occupation and economic activity (lfsa_eisn2) and by detailed economic activity (lfsa_egan22d). Accessed via the Eurostat dissemination API.</w:t>
+        <w:t xml:space="preserve">Eurostat. ICT usage in enterprises: artificial intelligence by size class of enterprise (isoc_eb_ai) and by NACE Rev. 2 activity (isoc_eb_ain2); online job advertisements by occupation (jvs_a_isco3_r1, experimental statistics based on the Web Intelligence Hub); Labour Force Survey employed persons by occupation and economic activity (lfsa_eisn2) and by detailed economic activity (lfsa_egan22d). Accessed via the Eurostat dissemination API.</w:t>
       </w:r>
     </w:p>
     <w:p>

</xml_diff>

<commit_message>
Add Canada replication (JVWS by NOC unit group); update manuscript
Co-Authored-By: Claude Sonnet 5.5 <noreply@anthropic.com>
Claude-Session: https://claude.ai/code/session_01H4JvRLBkzRHsy6jU5TcEWv
</commit_message>
<xml_diff>
--- a/isr_paper/ISR_Paper_Early_Adoption_Delayed_Displacement.docx
+++ b/isr_paper/ISR_Paper_Early_Adoption_Delayed_Displacement.docx
@@ -102,7 +102,7 @@
           <w:sz w:val="24"/>
           <w:szCs w:val="24"/>
         </w:rPr>
-        <w:t xml:space="preserve">Does generative AI that creates images and video displace creative workers, or is its effect delayed? We model labor demand in visual-content occupations as the share of employers who have adopted times the net effect among adopters, where adoption requires acceptable output quality at low review cost and is held back by expertise and legal frictions. Eurostat survey data show substantial adoption (9.6% of European firms with ten or more employees use AI that generates pictures, video, or audio) and that firms cite lack of expertise and legal and privacy uncertainty far more than lack of usefulness. In online job adverts for 403 UK occupations and 96 occupations in 16 European countries, exposure to visual content creation predicts small declines after 2022 (about 1 to 3% per standard deviation) that are not concentrated in low-quality-requirement tasks and, for the most exposed UK occupations, exceed what current adoption could explain.</w:t>
+        <w:t xml:space="preserve">Does generative AI that creates images and video displace creative workers, or is its effect delayed? We model labor demand in visual-content occupations as the share of employers who have adopted times the net effect among adopters, where adoption requires acceptable output quality at low review cost and is held back by expertise and legal frictions. Eurostat data show that 9.6% of European firms with ten or more employees already use AI that generates pictures, video, or audio, and that firms cite lack of expertise and legal and privacy uncertainty far more than lack of usefulness. In job-posting data for 403 UK occupations, 96 occupations in 16 European countries, and 308 Canadian occupations, exposure to visual content creation predicts small, fragile declines after 2022 (about 1 to 3% per standard deviation) that are not concentrated in low-quality-requirement tasks and, for the most exposed UK occupations, exceed what current adoption could explain.</w:t>
       </w:r>
     </w:p>
     <w:p>
@@ -216,7 +216,7 @@
           <w:sz w:val="24"/>
           <w:szCs w:val="24"/>
         </w:rPr>
-        <w:t xml:space="preserve">We bring together three sources. First, Eurostat’s enterprise survey on AI, which in 2025 asks whether firms use AI that generates pictures, videos, or audio, and why firms that considered AI did not adopt it. Second, UK online job adverts by occupation from the Office for National Statistics (ONS), covering 413 four-digit occupations from 2017 to 2026. Third, an LLM-coded measure of occupational exposure to visual content creation built from O*NET task statements, which we map to UK occupations through the ISCO-08 classification. As a replication we use Eurostat’s experimental statistics on online job advertisements by ISCO three-digit occupation for 16 European countries from 2019 to 2024. We also report, as supplementary evidence, US postings by sector and European employment by industry.</w:t>
+        <w:t xml:space="preserve">We bring together three sources. First, Eurostat’s enterprise survey on AI, which in 2025 asks whether firms use AI that generates pictures, videos, or audio, and why firms that considered AI did not adopt it. Second, UK online job adverts by occupation from the Office for National Statistics (ONS), covering 413 four-digit occupations from 2017 to 2026. Third, an LLM-coded measure of occupational exposure to visual content creation built from O*NET task statements, which we map to UK occupations through the ISCO-08 classification. As a replication we use Eurostat’s experimental statistics on online job advertisements by ISCO three-digit occupation for 16 European countries from 2019 to 2024, and Statistics Canada’s Job Vacancy and Wage Survey by occupation for 2015 to 2026. We also report, as supplementary evidence, US postings by sector and European employment by industry.</w:t>
       </w:r>
     </w:p>
     <w:p>
@@ -231,7 +231,7 @@
           <w:sz w:val="24"/>
           <w:szCs w:val="24"/>
         </w:rPr>
-        <w:t xml:space="preserve">Our findings are as follows. Adoption is already substantial: 9.6% of European firms with ten or more employees use AI that generates pictures, video, or audio, rising to 27.9% among firms with 250 or more employees and to about 36% in publishing, film, and broadcasting. Among firms that considered AI but did not adopt it, 70% cite lack of expertise, 54% unclear legal consequences, and 53% data protection and privacy concerns, against 18% who consider AI not useful. In UK adverts, occupations with higher exposure to visual content creation show small declines after 2022 (about 2 to 3% per standard deviation of exposure by 2025 and 2026, with randomization p-values from 0.03 to 0.47 across years and specifications), but these declines resemble a reversal of a COVID-era pattern, are not concentrated in tasks with low quality requirements, vanish when one occupation is dropped, and are far too large, for the occupations with the highest exposure, to be explained by the observed adoption levels. In the European replication the pattern has the same sign and similar size, with flat pre-period coefficients and two post-2022 years (about −1.6% per standard deviation in 2023 and −1.2% in 2024 with the language control; −3.7% and −5.9% without). We read the evidence as consistent with early adoption and little detectable displacement so far, and we do not claim that displacement is absent or will not come.</w:t>
+        <w:t xml:space="preserve">Our findings are as follows. Adoption is already substantial: 9.6% of European firms with ten or more employees use AI that generates pictures, video, or audio, rising to 27.9% among firms with 250 or more employees and to about 36% in publishing, film, and broadcasting. Among firms that considered AI but did not adopt it, 70% cite lack of expertise, 54% unclear legal consequences, and 53% data protection and privacy concerns, against 18% who consider AI not useful. In UK adverts, occupations with higher exposure to visual content creation show small declines after 2022 (about 2 to 3% per standard deviation of exposure by 2025 and 2026, with randomization p-values from 0.03 to 0.47 across years and specifications), but these declines resemble a reversal of a COVID-era pattern, are not concentrated in tasks with low quality requirements, vanish when one occupation is dropped, and are far too large, for the occupations with the highest exposure, to be explained by the observed adoption levels. In the European replication the pattern has the same sign and similar size, with flat pre-period coefficients and two post-2022 years (about −1.6% per standard deviation in 2023 and −1.2% in 2024 with the language control; −3.7% and −5.9% without). In Canada the coefficient is negative in the first post-2022 year (−2.2% per standard deviation, with occupation-group fixed effects) but not afterward. We read the evidence as consistent with early adoption and little detectable displacement so far, and we do not claim that displacement is absent or will not come.</w:t>
       </w:r>
     </w:p>
     <w:p>
@@ -1674,6 +1674,21 @@
     </w:p>
     <w:p>
       <w:pPr>
+        <w:spacing w:after="0" w:line="480" w:lineRule="auto"/>
+        <w:ind w:firstLine="720"/>
+        <w:jc w:val="left"/>
+      </w:pPr>
+      <w:r>
+        <w:rPr>
+          <w:rFonts w:ascii="Times New Roman" w:cs="Times New Roman" w:eastAsia="Times New Roman" w:hAnsi="Times New Roman"/>
+          <w:sz w:val="24"/>
+          <w:szCs w:val="24"/>
+        </w:rPr>
+        <w:t xml:space="preserve">A third data set is Statistics Canada’s Job Vacancy and Wage Survey (table 14-10-0444), an employer survey that gives the number of job vacancies by NOC 2021 unit group (five-digit) for Canada each quarter from 2015 to 2026. The quarters 2020Q2 and 2020Q3 were not collected, so we cannot compute the twelve-month window ending in June 2021, and cells with small counts are suppressed. We keep the 308 unit groups with at least 1,000 vacancies in the base window (July 2021 to June 2022). Because there is no official concordance between the Canadian and US classifications, we score the 6,144 main-duty statements in the NOC 2021 with the same rubric used for O*NET tasks (3.4% score one or two); unit group exposure is the mean of the score divided by two. We cannot control for LLM exposure in Canada because the Eloundou et al. (2023) scores are mapped to US occupation codes only.</w:t>
+      </w:r>
+    </w:p>
+    <w:p>
+      <w:pPr>
         <w:pStyle w:val="Heading2"/>
         <w:keepNext/>
         <w:spacing w:after="120" w:before="240" w:line="240" w:lineRule="auto"/>
@@ -1784,7 +1799,7 @@
           <w:sz w:val="24"/>
           <w:szCs w:val="24"/>
         </w:rPr>
-        <w:t xml:space="preserve">We also use the Indeed Hiring Lab job postings index by sector for the United States (47 sectors, daily, 2020–2026) and Eurostat Labour Force Survey employment by NACE two-digit industry for the EU27 (2015–2025). Their results are reported in Section 6.7.</w:t>
+        <w:t xml:space="preserve">We also use the Indeed Hiring Lab job postings index by sector for the United States (47 sectors, daily, 2020–2026) and Eurostat Labour Force Survey employment by NACE two-digit industry for the EU27 (2015–2025). Their results are reported in Section 6.8.</w:t>
       </w:r>
     </w:p>
     <w:p>
@@ -2052,7 +2067,7 @@
           <w:sz w:val="24"/>
           <w:szCs w:val="24"/>
         </w:rPr>
-        <w:t xml:space="preserve"> for years before the base year provides a check on pre-existing differences, although the pre-period contains the COVID shock and cannot be used to test parallel trends cleanly. As an alternative to conventional standard errors we compute randomization p-values by permuting exposure across occupations within sub-major groups (2,000 draws). For the European replication we estimate the same model on country-occupation cells with country-year fixed effects, so that the comparison is between occupations within the same country and year, and with standard errors clustered by ISCO three-digit occupation and, as a check, by two-digit group; randomization p-values permute exposure across occupations within ISCO two-digit groups (1,000 draws). In Section 6.4 we also compare three occupation groups chosen from occupation labels before looking at outcomes: image and video production (graphic and multimedia designers, artists, photographers and audio-visual operators, web design professionals), creative direction and production, and text production (writers, journalists, editors).</w:t>
+        <w:t xml:space="preserve"> for years before the base year provides a check on pre-existing differences, although the pre-period contains the COVID shock and cannot be used to test parallel trends cleanly. As an alternative to conventional standard errors we compute randomization p-values by permuting exposure across occupations within sub-major groups (2,000 draws). For the European replication we estimate the same model on country-occupation cells with country-year fixed effects, so that the comparison is between occupations within the same country and year, and with standard errors clustered by ISCO three-digit occupation and, as a check, by two-digit group; randomization p-values permute exposure across occupations within ISCO two-digit groups (1,000 draws). For Canada we estimate the same model on unit groups with fixed effects for NOC major groups or two-digit groups, using the twelve-month windows from July to June, standard errors clustered by NOC three-digit group, and randomization p-values from permuting exposure within two-digit groups (1,000 draws). In Section 6.5 we also compare three occupation groups chosen from occupation labels before looking at outcomes: image and video production (graphic and multimedia designers, artists, photographers and audio-visual operators, web design professionals), creative direction and production, and text production (writers, journalists, editors).</w:t>
       </w:r>
     </w:p>
     <w:p>
@@ -6119,7 +6134,7 @@
           <w:sz w:val="24"/>
           <w:szCs w:val="24"/>
         </w:rPr>
-        <w:t xml:space="preserve">6.4 UK Adverts: Occupation Groups</w:t>
+        <w:t xml:space="preserve">6.4 Canadian Replication</w:t>
       </w:r>
     </w:p>
     <w:p>
@@ -6134,7 +6149,7 @@
           <w:sz w:val="24"/>
           <w:szCs w:val="24"/>
         </w:rPr>
-        <w:t xml:space="preserve">The three groups chosen from occupation labels show a similar story with larger numbers (Table 6). Relative to other occupations, adverts for image and video production occupations fell by 0.20 log points in the first year after the base year (randomization p = 0.032) and by 0.38 in the third and fourth (p = 0.011). Creative direction occupations fell by less (−0.11 in the first year and −0.23 in the third; p between 0.15 and 0.27). Text production occupations did not differ from others in the first two years (−0.10 and +0.03) and fell later (−0.33 in the third year, p = 0.046; −0.47 in the fourth, p = 0.008), led by journalists and editors. The decline in image and video production is concentrated in web design professionals, who rank first or third among 405 occupations in the later years (log changes of −1.45 and −1.36 against a comparison median of −0.43 and −0.46); graphic and multimedia designers rank 32nd to 38th (−0.86 and −0.89), and artists and photographers are close to the median. Without web design professionals the third- and fourth-year differences fall to −0.16 and −0.21. Placebo design occupations that image generators do not target (interior designers, fashion and accessories designers, design occupations not elsewhere classified) also fell relative to others (−0.16, −0.20, and −0.06 in the first, third, and fourth years). Between June 2019 and June 2021 the image and video production group had already fallen by 0.32 log points relative to others, and the other two groups by 0.36 and 0.31.</w:t>
+        <w:t xml:space="preserve">Table 6 reports the estimates for Canada (308 unit groups). With fixed effects for NOC major groups, a standard deviation of exposure is associated with 2.9% fewer vacancies in the year ending June 2023 relative to the base year (standard error 0.7), 2.6% fewer in 2024 (2.2), 3.5% fewer in 2025 (2.4), and 3.4% fewer in 2026 (2.5). Without fixed effects the estimates are −3.7%, −3.4%, −5.2%, and −5.3% (standard errors 0.7, 2.5, 2.9, and 2.6). When the comparison is within NOC two-digit groups, the estimate is −2.2% in 2023 (standard error 0.9, randomization p = 0.10) and not different from zero afterwards (−0.9% in 2024, +1.6% in 2025, and +1.1% in 2026; p between 0.59 and 0.77). The pre-2022 coefficients are close to zero in all specifications (for the specification without fixed effects, −0.005, +0.001, and −0.009 for 2017, 2018, and 2019), but the data do not allow a comparison for 2020 and 2021 because of the missing quarters. Vacancies fell sharply across the Canadian economy: total vacancies in the twelve months ending June 2026 were 47% below those in the base year (a log change of −0.63). Vacancies for graphic designers and illustrators (NOC 52120), one of the most exposed unit groups, fell from 11,610 to 3,910 over the same period (−1.09 log points, a 66% fall), more than the market as a whole. The Canadian estimates therefore agree with the UK and European results on the sign in the first post-2022 year and show no clear pattern afterwards once occupations are compared within narrow groups.</w:t>
       </w:r>
     </w:p>
     <w:p>
@@ -6152,6 +6167,1083 @@
           <w:szCs w:val="22"/>
         </w:rPr>
         <w:t xml:space="preserve">Table 6.</w:t>
+      </w:r>
+      <w:r>
+        <w:rPr>
+          <w:rFonts w:ascii="Times New Roman" w:cs="Times New Roman" w:eastAsia="Times New Roman" w:hAnsi="Times New Roman"/>
+          <w:sz w:val="22"/>
+          <w:szCs w:val="22"/>
+        </w:rPr>
+        <w:t xml:space="preserve"> Canada: coefficient on occupational exposure to visual content creation (per standard deviation), change in log vacancies relative to July 2021–June 2022</w:t>
+      </w:r>
+    </w:p>
+    <w:tbl>
+      <w:tblPr>
+        <w:tblW w:type="dxa" w:w="8360"/>
+        <w:tblBorders>
+          <w:top w:val="single" w:color="auto" w:sz="4"/>
+          <w:left w:val="single" w:color="auto" w:sz="4"/>
+          <w:bottom w:val="single" w:color="auto" w:sz="4"/>
+          <w:right w:val="single" w:color="auto" w:sz="4"/>
+          <w:insideH w:val="single" w:color="auto" w:sz="4"/>
+          <w:insideV w:val="single" w:color="auto" w:sz="4"/>
+        </w:tblBorders>
+      </w:tblPr>
+      <w:tblGrid>
+        <w:gridCol w:w="2760"/>
+        <w:gridCol w:w="1075"/>
+        <w:gridCol w:w="1075"/>
+        <w:gridCol w:w="1075"/>
+        <w:gridCol w:w="1075"/>
+        <w:gridCol w:w="1300"/>
+      </w:tblGrid>
+      <w:tr>
+        <w:trPr>
+          <w:cantSplit/>
+          <w:tblHeader/>
+        </w:trPr>
+        <w:tc>
+          <w:tcPr>
+            <w:tcW w:type="dxa" w:w="2760"/>
+            <w:tcBorders>
+              <w:top w:val="single" w:color="000000" w:sz="4"/>
+              <w:left w:val="none" w:color="FFFFFF" w:sz="0"/>
+              <w:bottom w:val="single" w:color="000000" w:sz="4"/>
+              <w:right w:val="none" w:color="FFFFFF" w:sz="0"/>
+            </w:tcBorders>
+            <w:shd w:fill="EDEDED" w:color="auto" w:val="clear"/>
+            <w:tcMar>
+              <w:top w:type="dxa" w:w="50"/>
+              <w:left w:type="dxa" w:w="90"/>
+              <w:bottom w:type="dxa" w:w="50"/>
+              <w:right w:type="dxa" w:w="90"/>
+            </w:tcMar>
+          </w:tcPr>
+          <w:p>
+            <w:pPr>
+              <w:spacing w:line="240" w:lineRule="auto"/>
+            </w:pPr>
+            <w:r>
+              <w:rPr>
+                <w:rFonts w:ascii="Times New Roman" w:cs="Times New Roman" w:eastAsia="Times New Roman" w:hAnsi="Times New Roman"/>
+                <w:b/>
+                <w:bCs/>
+                <w:sz w:val="20"/>
+                <w:szCs w:val="20"/>
+              </w:rPr>
+              <w:t xml:space="preserve">Specification</w:t>
+            </w:r>
+          </w:p>
+        </w:tc>
+        <w:tc>
+          <w:tcPr>
+            <w:tcW w:type="dxa" w:w="1075"/>
+            <w:tcBorders>
+              <w:top w:val="single" w:color="000000" w:sz="4"/>
+              <w:left w:val="none" w:color="FFFFFF" w:sz="0"/>
+              <w:bottom w:val="single" w:color="000000" w:sz="4"/>
+              <w:right w:val="none" w:color="FFFFFF" w:sz="0"/>
+            </w:tcBorders>
+            <w:shd w:fill="EDEDED" w:color="auto" w:val="clear"/>
+            <w:tcMar>
+              <w:top w:type="dxa" w:w="50"/>
+              <w:left w:type="dxa" w:w="90"/>
+              <w:bottom w:type="dxa" w:w="50"/>
+              <w:right w:type="dxa" w:w="90"/>
+            </w:tcMar>
+          </w:tcPr>
+          <w:p>
+            <w:pPr>
+              <w:spacing w:line="240" w:lineRule="auto"/>
+            </w:pPr>
+            <w:r>
+              <w:rPr>
+                <w:rFonts w:ascii="Times New Roman" w:cs="Times New Roman" w:eastAsia="Times New Roman" w:hAnsi="Times New Roman"/>
+                <w:b/>
+                <w:bCs/>
+                <w:sz w:val="20"/>
+                <w:szCs w:val="20"/>
+              </w:rPr>
+              <w:t xml:space="preserve">2017</w:t>
+            </w:r>
+          </w:p>
+        </w:tc>
+        <w:tc>
+          <w:tcPr>
+            <w:tcW w:type="dxa" w:w="1075"/>
+            <w:tcBorders>
+              <w:top w:val="single" w:color="000000" w:sz="4"/>
+              <w:left w:val="none" w:color="FFFFFF" w:sz="0"/>
+              <w:bottom w:val="single" w:color="000000" w:sz="4"/>
+              <w:right w:val="none" w:color="FFFFFF" w:sz="0"/>
+            </w:tcBorders>
+            <w:shd w:fill="EDEDED" w:color="auto" w:val="clear"/>
+            <w:tcMar>
+              <w:top w:type="dxa" w:w="50"/>
+              <w:left w:type="dxa" w:w="90"/>
+              <w:bottom w:type="dxa" w:w="50"/>
+              <w:right w:type="dxa" w:w="90"/>
+            </w:tcMar>
+          </w:tcPr>
+          <w:p>
+            <w:pPr>
+              <w:spacing w:line="240" w:lineRule="auto"/>
+            </w:pPr>
+            <w:r>
+              <w:rPr>
+                <w:rFonts w:ascii="Times New Roman" w:cs="Times New Roman" w:eastAsia="Times New Roman" w:hAnsi="Times New Roman"/>
+                <w:b/>
+                <w:bCs/>
+                <w:sz w:val="20"/>
+                <w:szCs w:val="20"/>
+              </w:rPr>
+              <w:t xml:space="preserve">2019</w:t>
+            </w:r>
+          </w:p>
+        </w:tc>
+        <w:tc>
+          <w:tcPr>
+            <w:tcW w:type="dxa" w:w="1075"/>
+            <w:tcBorders>
+              <w:top w:val="single" w:color="000000" w:sz="4"/>
+              <w:left w:val="none" w:color="FFFFFF" w:sz="0"/>
+              <w:bottom w:val="single" w:color="000000" w:sz="4"/>
+              <w:right w:val="none" w:color="FFFFFF" w:sz="0"/>
+            </w:tcBorders>
+            <w:shd w:fill="EDEDED" w:color="auto" w:val="clear"/>
+            <w:tcMar>
+              <w:top w:type="dxa" w:w="50"/>
+              <w:left w:type="dxa" w:w="90"/>
+              <w:bottom w:type="dxa" w:w="50"/>
+              <w:right w:type="dxa" w:w="90"/>
+            </w:tcMar>
+          </w:tcPr>
+          <w:p>
+            <w:pPr>
+              <w:spacing w:line="240" w:lineRule="auto"/>
+            </w:pPr>
+            <w:r>
+              <w:rPr>
+                <w:rFonts w:ascii="Times New Roman" w:cs="Times New Roman" w:eastAsia="Times New Roman" w:hAnsi="Times New Roman"/>
+                <w:b/>
+                <w:bCs/>
+                <w:sz w:val="20"/>
+                <w:szCs w:val="20"/>
+              </w:rPr>
+              <w:t xml:space="preserve">2023</w:t>
+            </w:r>
+          </w:p>
+        </w:tc>
+        <w:tc>
+          <w:tcPr>
+            <w:tcW w:type="dxa" w:w="1075"/>
+            <w:tcBorders>
+              <w:top w:val="single" w:color="000000" w:sz="4"/>
+              <w:left w:val="none" w:color="FFFFFF" w:sz="0"/>
+              <w:bottom w:val="single" w:color="000000" w:sz="4"/>
+              <w:right w:val="none" w:color="FFFFFF" w:sz="0"/>
+            </w:tcBorders>
+            <w:shd w:fill="EDEDED" w:color="auto" w:val="clear"/>
+            <w:tcMar>
+              <w:top w:type="dxa" w:w="50"/>
+              <w:left w:type="dxa" w:w="90"/>
+              <w:bottom w:type="dxa" w:w="50"/>
+              <w:right w:type="dxa" w:w="90"/>
+            </w:tcMar>
+          </w:tcPr>
+          <w:p>
+            <w:pPr>
+              <w:spacing w:line="240" w:lineRule="auto"/>
+            </w:pPr>
+            <w:r>
+              <w:rPr>
+                <w:rFonts w:ascii="Times New Roman" w:cs="Times New Roman" w:eastAsia="Times New Roman" w:hAnsi="Times New Roman"/>
+                <w:b/>
+                <w:bCs/>
+                <w:sz w:val="20"/>
+                <w:szCs w:val="20"/>
+              </w:rPr>
+              <w:t xml:space="preserve">2024</w:t>
+            </w:r>
+          </w:p>
+        </w:tc>
+        <w:tc>
+          <w:tcPr>
+            <w:tcW w:type="dxa" w:w="1300"/>
+            <w:tcBorders>
+              <w:top w:val="single" w:color="000000" w:sz="4"/>
+              <w:left w:val="none" w:color="FFFFFF" w:sz="0"/>
+              <w:bottom w:val="single" w:color="000000" w:sz="4"/>
+              <w:right w:val="none" w:color="FFFFFF" w:sz="0"/>
+            </w:tcBorders>
+            <w:shd w:fill="EDEDED" w:color="auto" w:val="clear"/>
+            <w:tcMar>
+              <w:top w:type="dxa" w:w="50"/>
+              <w:left w:type="dxa" w:w="90"/>
+              <w:bottom w:type="dxa" w:w="50"/>
+              <w:right w:type="dxa" w:w="90"/>
+            </w:tcMar>
+          </w:tcPr>
+          <w:p>
+            <w:pPr>
+              <w:spacing w:line="240" w:lineRule="auto"/>
+            </w:pPr>
+            <w:r>
+              <w:rPr>
+                <w:rFonts w:ascii="Times New Roman" w:cs="Times New Roman" w:eastAsia="Times New Roman" w:hAnsi="Times New Roman"/>
+                <w:b/>
+                <w:bCs/>
+                <w:sz w:val="20"/>
+                <w:szCs w:val="20"/>
+              </w:rPr>
+              <w:t xml:space="preserve">2025 / 2026</w:t>
+            </w:r>
+          </w:p>
+        </w:tc>
+      </w:tr>
+      <w:tr>
+        <w:trPr>
+          <w:cantSplit/>
+          <w:tblHeader w:val="false"/>
+        </w:trPr>
+        <w:tc>
+          <w:tcPr>
+            <w:tcW w:type="dxa" w:w="2760"/>
+            <w:tcBorders>
+              <w:top w:val="none" w:color="FFFFFF" w:sz="0"/>
+              <w:left w:val="none" w:color="FFFFFF" w:sz="0"/>
+              <w:bottom w:val="none" w:color="FFFFFF" w:sz="0"/>
+              <w:right w:val="none" w:color="FFFFFF" w:sz="0"/>
+            </w:tcBorders>
+            <w:tcMar>
+              <w:top w:type="dxa" w:w="50"/>
+              <w:left w:type="dxa" w:w="90"/>
+              <w:bottom w:type="dxa" w:w="50"/>
+              <w:right w:type="dxa" w:w="90"/>
+            </w:tcMar>
+          </w:tcPr>
+          <w:p>
+            <w:pPr>
+              <w:spacing w:line="240" w:lineRule="auto"/>
+            </w:pPr>
+            <w:r>
+              <w:rPr>
+                <w:rFonts w:ascii="Times New Roman" w:cs="Times New Roman" w:eastAsia="Times New Roman" w:hAnsi="Times New Roman"/>
+                <w:b w:val="false"/>
+                <w:bCs w:val="false"/>
+                <w:sz w:val="20"/>
+                <w:szCs w:val="20"/>
+              </w:rPr>
+              <w:t xml:space="preserve">No fixed effects</w:t>
+            </w:r>
+          </w:p>
+        </w:tc>
+        <w:tc>
+          <w:tcPr>
+            <w:tcW w:type="dxa" w:w="1075"/>
+            <w:tcBorders>
+              <w:top w:val="none" w:color="FFFFFF" w:sz="0"/>
+              <w:left w:val="none" w:color="FFFFFF" w:sz="0"/>
+              <w:bottom w:val="none" w:color="FFFFFF" w:sz="0"/>
+              <w:right w:val="none" w:color="FFFFFF" w:sz="0"/>
+            </w:tcBorders>
+            <w:tcMar>
+              <w:top w:type="dxa" w:w="50"/>
+              <w:left w:type="dxa" w:w="90"/>
+              <w:bottom w:type="dxa" w:w="50"/>
+              <w:right w:type="dxa" w:w="90"/>
+            </w:tcMar>
+          </w:tcPr>
+          <w:p>
+            <w:pPr>
+              <w:spacing w:line="240" w:lineRule="auto"/>
+            </w:pPr>
+            <w:r>
+              <w:rPr>
+                <w:rFonts w:ascii="Times New Roman" w:cs="Times New Roman" w:eastAsia="Times New Roman" w:hAnsi="Times New Roman"/>
+                <w:b w:val="false"/>
+                <w:bCs w:val="false"/>
+                <w:sz w:val="20"/>
+                <w:szCs w:val="20"/>
+              </w:rPr>
+              <w:t xml:space="preserve">−0.005 (0.028)</w:t>
+            </w:r>
+          </w:p>
+        </w:tc>
+        <w:tc>
+          <w:tcPr>
+            <w:tcW w:type="dxa" w:w="1075"/>
+            <w:tcBorders>
+              <w:top w:val="none" w:color="FFFFFF" w:sz="0"/>
+              <w:left w:val="none" w:color="FFFFFF" w:sz="0"/>
+              <w:bottom w:val="none" w:color="FFFFFF" w:sz="0"/>
+              <w:right w:val="none" w:color="FFFFFF" w:sz="0"/>
+            </w:tcBorders>
+            <w:tcMar>
+              <w:top w:type="dxa" w:w="50"/>
+              <w:left w:type="dxa" w:w="90"/>
+              <w:bottom w:type="dxa" w:w="50"/>
+              <w:right w:type="dxa" w:w="90"/>
+            </w:tcMar>
+          </w:tcPr>
+          <w:p>
+            <w:pPr>
+              <w:spacing w:line="240" w:lineRule="auto"/>
+            </w:pPr>
+            <w:r>
+              <w:rPr>
+                <w:rFonts w:ascii="Times New Roman" w:cs="Times New Roman" w:eastAsia="Times New Roman" w:hAnsi="Times New Roman"/>
+                <w:b w:val="false"/>
+                <w:bCs w:val="false"/>
+                <w:sz w:val="20"/>
+                <w:szCs w:val="20"/>
+              </w:rPr>
+              <w:t xml:space="preserve">−0.009 (0.017)</w:t>
+            </w:r>
+          </w:p>
+        </w:tc>
+        <w:tc>
+          <w:tcPr>
+            <w:tcW w:type="dxa" w:w="1075"/>
+            <w:tcBorders>
+              <w:top w:val="none" w:color="FFFFFF" w:sz="0"/>
+              <w:left w:val="none" w:color="FFFFFF" w:sz="0"/>
+              <w:bottom w:val="none" w:color="FFFFFF" w:sz="0"/>
+              <w:right w:val="none" w:color="FFFFFF" w:sz="0"/>
+            </w:tcBorders>
+            <w:tcMar>
+              <w:top w:type="dxa" w:w="50"/>
+              <w:left w:type="dxa" w:w="90"/>
+              <w:bottom w:type="dxa" w:w="50"/>
+              <w:right w:type="dxa" w:w="90"/>
+            </w:tcMar>
+          </w:tcPr>
+          <w:p>
+            <w:pPr>
+              <w:spacing w:line="240" w:lineRule="auto"/>
+            </w:pPr>
+            <w:r>
+              <w:rPr>
+                <w:rFonts w:ascii="Times New Roman" w:cs="Times New Roman" w:eastAsia="Times New Roman" w:hAnsi="Times New Roman"/>
+                <w:b w:val="false"/>
+                <w:bCs w:val="false"/>
+                <w:sz w:val="20"/>
+                <w:szCs w:val="20"/>
+              </w:rPr>
+              <w:t xml:space="preserve">−0.037 (0.007)</w:t>
+            </w:r>
+          </w:p>
+        </w:tc>
+        <w:tc>
+          <w:tcPr>
+            <w:tcW w:type="dxa" w:w="1075"/>
+            <w:tcBorders>
+              <w:top w:val="none" w:color="FFFFFF" w:sz="0"/>
+              <w:left w:val="none" w:color="FFFFFF" w:sz="0"/>
+              <w:bottom w:val="none" w:color="FFFFFF" w:sz="0"/>
+              <w:right w:val="none" w:color="FFFFFF" w:sz="0"/>
+            </w:tcBorders>
+            <w:tcMar>
+              <w:top w:type="dxa" w:w="50"/>
+              <w:left w:type="dxa" w:w="90"/>
+              <w:bottom w:type="dxa" w:w="50"/>
+              <w:right w:type="dxa" w:w="90"/>
+            </w:tcMar>
+          </w:tcPr>
+          <w:p>
+            <w:pPr>
+              <w:spacing w:line="240" w:lineRule="auto"/>
+            </w:pPr>
+            <w:r>
+              <w:rPr>
+                <w:rFonts w:ascii="Times New Roman" w:cs="Times New Roman" w:eastAsia="Times New Roman" w:hAnsi="Times New Roman"/>
+                <w:b w:val="false"/>
+                <w:bCs w:val="false"/>
+                <w:sz w:val="20"/>
+                <w:szCs w:val="20"/>
+              </w:rPr>
+              <w:t xml:space="preserve">−0.034 (0.025)</w:t>
+            </w:r>
+          </w:p>
+        </w:tc>
+        <w:tc>
+          <w:tcPr>
+            <w:tcW w:type="dxa" w:w="1300"/>
+            <w:tcBorders>
+              <w:top w:val="none" w:color="FFFFFF" w:sz="0"/>
+              <w:left w:val="none" w:color="FFFFFF" w:sz="0"/>
+              <w:bottom w:val="none" w:color="FFFFFF" w:sz="0"/>
+              <w:right w:val="none" w:color="FFFFFF" w:sz="0"/>
+            </w:tcBorders>
+            <w:tcMar>
+              <w:top w:type="dxa" w:w="50"/>
+              <w:left w:type="dxa" w:w="90"/>
+              <w:bottom w:type="dxa" w:w="50"/>
+              <w:right w:type="dxa" w:w="90"/>
+            </w:tcMar>
+          </w:tcPr>
+          <w:p>
+            <w:pPr>
+              <w:spacing w:line="240" w:lineRule="auto"/>
+            </w:pPr>
+            <w:r>
+              <w:rPr>
+                <w:rFonts w:ascii="Times New Roman" w:cs="Times New Roman" w:eastAsia="Times New Roman" w:hAnsi="Times New Roman"/>
+                <w:b w:val="false"/>
+                <w:bCs w:val="false"/>
+                <w:sz w:val="20"/>
+                <w:szCs w:val="20"/>
+              </w:rPr>
+              <w:t xml:space="preserve">−0.052 (0.029) / −0.053 (0.026)</w:t>
+            </w:r>
+          </w:p>
+        </w:tc>
+      </w:tr>
+      <w:tr>
+        <w:trPr>
+          <w:cantSplit/>
+          <w:tblHeader w:val="false"/>
+        </w:trPr>
+        <w:tc>
+          <w:tcPr>
+            <w:tcW w:type="dxa" w:w="2760"/>
+            <w:tcBorders>
+              <w:top w:val="none" w:color="FFFFFF" w:sz="0"/>
+              <w:left w:val="none" w:color="FFFFFF" w:sz="0"/>
+              <w:bottom w:val="none" w:color="FFFFFF" w:sz="0"/>
+              <w:right w:val="none" w:color="FFFFFF" w:sz="0"/>
+            </w:tcBorders>
+            <w:tcMar>
+              <w:top w:type="dxa" w:w="50"/>
+              <w:left w:type="dxa" w:w="90"/>
+              <w:bottom w:type="dxa" w:w="50"/>
+              <w:right w:type="dxa" w:w="90"/>
+            </w:tcMar>
+          </w:tcPr>
+          <w:p>
+            <w:pPr>
+              <w:spacing w:line="240" w:lineRule="auto"/>
+            </w:pPr>
+            <w:r>
+              <w:rPr>
+                <w:rFonts w:ascii="Times New Roman" w:cs="Times New Roman" w:eastAsia="Times New Roman" w:hAnsi="Times New Roman"/>
+                <w:b w:val="false"/>
+                <w:bCs w:val="false"/>
+                <w:sz w:val="20"/>
+                <w:szCs w:val="20"/>
+              </w:rPr>
+              <w:t xml:space="preserve">NOC major-group FE</w:t>
+            </w:r>
+          </w:p>
+        </w:tc>
+        <w:tc>
+          <w:tcPr>
+            <w:tcW w:type="dxa" w:w="1075"/>
+            <w:tcBorders>
+              <w:top w:val="none" w:color="FFFFFF" w:sz="0"/>
+              <w:left w:val="none" w:color="FFFFFF" w:sz="0"/>
+              <w:bottom w:val="none" w:color="FFFFFF" w:sz="0"/>
+              <w:right w:val="none" w:color="FFFFFF" w:sz="0"/>
+            </w:tcBorders>
+            <w:tcMar>
+              <w:top w:type="dxa" w:w="50"/>
+              <w:left w:type="dxa" w:w="90"/>
+              <w:bottom w:type="dxa" w:w="50"/>
+              <w:right w:type="dxa" w:w="90"/>
+            </w:tcMar>
+          </w:tcPr>
+          <w:p>
+            <w:pPr>
+              <w:spacing w:line="240" w:lineRule="auto"/>
+            </w:pPr>
+            <w:r>
+              <w:rPr>
+                <w:rFonts w:ascii="Times New Roman" w:cs="Times New Roman" w:eastAsia="Times New Roman" w:hAnsi="Times New Roman"/>
+                <w:b w:val="false"/>
+                <w:bCs w:val="false"/>
+                <w:sz w:val="20"/>
+                <w:szCs w:val="20"/>
+              </w:rPr>
+              <w:t xml:space="preserve">−0.003 (0.035)</w:t>
+            </w:r>
+          </w:p>
+        </w:tc>
+        <w:tc>
+          <w:tcPr>
+            <w:tcW w:type="dxa" w:w="1075"/>
+            <w:tcBorders>
+              <w:top w:val="none" w:color="FFFFFF" w:sz="0"/>
+              <w:left w:val="none" w:color="FFFFFF" w:sz="0"/>
+              <w:bottom w:val="none" w:color="FFFFFF" w:sz="0"/>
+              <w:right w:val="none" w:color="FFFFFF" w:sz="0"/>
+            </w:tcBorders>
+            <w:tcMar>
+              <w:top w:type="dxa" w:w="50"/>
+              <w:left w:type="dxa" w:w="90"/>
+              <w:bottom w:type="dxa" w:w="50"/>
+              <w:right w:type="dxa" w:w="90"/>
+            </w:tcMar>
+          </w:tcPr>
+          <w:p>
+            <w:pPr>
+              <w:spacing w:line="240" w:lineRule="auto"/>
+            </w:pPr>
+            <w:r>
+              <w:rPr>
+                <w:rFonts w:ascii="Times New Roman" w:cs="Times New Roman" w:eastAsia="Times New Roman" w:hAnsi="Times New Roman"/>
+                <w:b w:val="false"/>
+                <w:bCs w:val="false"/>
+                <w:sz w:val="20"/>
+                <w:szCs w:val="20"/>
+              </w:rPr>
+              <w:t xml:space="preserve">−0.008 (0.022)</w:t>
+            </w:r>
+          </w:p>
+        </w:tc>
+        <w:tc>
+          <w:tcPr>
+            <w:tcW w:type="dxa" w:w="1075"/>
+            <w:tcBorders>
+              <w:top w:val="none" w:color="FFFFFF" w:sz="0"/>
+              <w:left w:val="none" w:color="FFFFFF" w:sz="0"/>
+              <w:bottom w:val="none" w:color="FFFFFF" w:sz="0"/>
+              <w:right w:val="none" w:color="FFFFFF" w:sz="0"/>
+            </w:tcBorders>
+            <w:tcMar>
+              <w:top w:type="dxa" w:w="50"/>
+              <w:left w:type="dxa" w:w="90"/>
+              <w:bottom w:type="dxa" w:w="50"/>
+              <w:right w:type="dxa" w:w="90"/>
+            </w:tcMar>
+          </w:tcPr>
+          <w:p>
+            <w:pPr>
+              <w:spacing w:line="240" w:lineRule="auto"/>
+            </w:pPr>
+            <w:r>
+              <w:rPr>
+                <w:rFonts w:ascii="Times New Roman" w:cs="Times New Roman" w:eastAsia="Times New Roman" w:hAnsi="Times New Roman"/>
+                <w:b w:val="false"/>
+                <w:bCs w:val="false"/>
+                <w:sz w:val="20"/>
+                <w:szCs w:val="20"/>
+              </w:rPr>
+              <w:t xml:space="preserve">−0.029 (0.007)</w:t>
+            </w:r>
+          </w:p>
+        </w:tc>
+        <w:tc>
+          <w:tcPr>
+            <w:tcW w:type="dxa" w:w="1075"/>
+            <w:tcBorders>
+              <w:top w:val="none" w:color="FFFFFF" w:sz="0"/>
+              <w:left w:val="none" w:color="FFFFFF" w:sz="0"/>
+              <w:bottom w:val="none" w:color="FFFFFF" w:sz="0"/>
+              <w:right w:val="none" w:color="FFFFFF" w:sz="0"/>
+            </w:tcBorders>
+            <w:tcMar>
+              <w:top w:type="dxa" w:w="50"/>
+              <w:left w:type="dxa" w:w="90"/>
+              <w:bottom w:type="dxa" w:w="50"/>
+              <w:right w:type="dxa" w:w="90"/>
+            </w:tcMar>
+          </w:tcPr>
+          <w:p>
+            <w:pPr>
+              <w:spacing w:line="240" w:lineRule="auto"/>
+            </w:pPr>
+            <w:r>
+              <w:rPr>
+                <w:rFonts w:ascii="Times New Roman" w:cs="Times New Roman" w:eastAsia="Times New Roman" w:hAnsi="Times New Roman"/>
+                <w:b w:val="false"/>
+                <w:bCs w:val="false"/>
+                <w:sz w:val="20"/>
+                <w:szCs w:val="20"/>
+              </w:rPr>
+              <w:t xml:space="preserve">−0.026 (0.022)</w:t>
+            </w:r>
+          </w:p>
+        </w:tc>
+        <w:tc>
+          <w:tcPr>
+            <w:tcW w:type="dxa" w:w="1300"/>
+            <w:tcBorders>
+              <w:top w:val="none" w:color="FFFFFF" w:sz="0"/>
+              <w:left w:val="none" w:color="FFFFFF" w:sz="0"/>
+              <w:bottom w:val="none" w:color="FFFFFF" w:sz="0"/>
+              <w:right w:val="none" w:color="FFFFFF" w:sz="0"/>
+            </w:tcBorders>
+            <w:tcMar>
+              <w:top w:type="dxa" w:w="50"/>
+              <w:left w:type="dxa" w:w="90"/>
+              <w:bottom w:type="dxa" w:w="50"/>
+              <w:right w:type="dxa" w:w="90"/>
+            </w:tcMar>
+          </w:tcPr>
+          <w:p>
+            <w:pPr>
+              <w:spacing w:line="240" w:lineRule="auto"/>
+            </w:pPr>
+            <w:r>
+              <w:rPr>
+                <w:rFonts w:ascii="Times New Roman" w:cs="Times New Roman" w:eastAsia="Times New Roman" w:hAnsi="Times New Roman"/>
+                <w:b w:val="false"/>
+                <w:bCs w:val="false"/>
+                <w:sz w:val="20"/>
+                <w:szCs w:val="20"/>
+              </w:rPr>
+              <w:t xml:space="preserve">−0.035 (0.024) / −0.034 (0.025)</w:t>
+            </w:r>
+          </w:p>
+        </w:tc>
+      </w:tr>
+      <w:tr>
+        <w:trPr>
+          <w:cantSplit/>
+          <w:tblHeader w:val="false"/>
+        </w:trPr>
+        <w:tc>
+          <w:tcPr>
+            <w:tcW w:type="dxa" w:w="2760"/>
+            <w:tcBorders>
+              <w:top w:val="none" w:color="FFFFFF" w:sz="0"/>
+              <w:left w:val="none" w:color="FFFFFF" w:sz="0"/>
+              <w:bottom w:val="none" w:color="FFFFFF" w:sz="0"/>
+              <w:right w:val="none" w:color="FFFFFF" w:sz="0"/>
+            </w:tcBorders>
+            <w:tcMar>
+              <w:top w:type="dxa" w:w="50"/>
+              <w:left w:type="dxa" w:w="90"/>
+              <w:bottom w:type="dxa" w:w="50"/>
+              <w:right w:type="dxa" w:w="90"/>
+            </w:tcMar>
+          </w:tcPr>
+          <w:p>
+            <w:pPr>
+              <w:spacing w:line="240" w:lineRule="auto"/>
+            </w:pPr>
+            <w:r>
+              <w:rPr>
+                <w:rFonts w:ascii="Times New Roman" w:cs="Times New Roman" w:eastAsia="Times New Roman" w:hAnsi="Times New Roman"/>
+                <w:b w:val="false"/>
+                <w:bCs w:val="false"/>
+                <w:sz w:val="20"/>
+                <w:szCs w:val="20"/>
+              </w:rPr>
+              <w:t xml:space="preserve">NOC two-digit FE</w:t>
+            </w:r>
+          </w:p>
+        </w:tc>
+        <w:tc>
+          <w:tcPr>
+            <w:tcW w:type="dxa" w:w="1075"/>
+            <w:tcBorders>
+              <w:top w:val="none" w:color="FFFFFF" w:sz="0"/>
+              <w:left w:val="none" w:color="FFFFFF" w:sz="0"/>
+              <w:bottom w:val="none" w:color="FFFFFF" w:sz="0"/>
+              <w:right w:val="none" w:color="FFFFFF" w:sz="0"/>
+            </w:tcBorders>
+            <w:tcMar>
+              <w:top w:type="dxa" w:w="50"/>
+              <w:left w:type="dxa" w:w="90"/>
+              <w:bottom w:type="dxa" w:w="50"/>
+              <w:right w:type="dxa" w:w="90"/>
+            </w:tcMar>
+          </w:tcPr>
+          <w:p>
+            <w:pPr>
+              <w:spacing w:line="240" w:lineRule="auto"/>
+            </w:pPr>
+            <w:r>
+              <w:rPr>
+                <w:rFonts w:ascii="Times New Roman" w:cs="Times New Roman" w:eastAsia="Times New Roman" w:hAnsi="Times New Roman"/>
+                <w:b w:val="false"/>
+                <w:bCs w:val="false"/>
+                <w:sz w:val="20"/>
+                <w:szCs w:val="20"/>
+              </w:rPr>
+              <w:t xml:space="preserve">+0.036 (0.038)</w:t>
+            </w:r>
+          </w:p>
+        </w:tc>
+        <w:tc>
+          <w:tcPr>
+            <w:tcW w:type="dxa" w:w="1075"/>
+            <w:tcBorders>
+              <w:top w:val="none" w:color="FFFFFF" w:sz="0"/>
+              <w:left w:val="none" w:color="FFFFFF" w:sz="0"/>
+              <w:bottom w:val="none" w:color="FFFFFF" w:sz="0"/>
+              <w:right w:val="none" w:color="FFFFFF" w:sz="0"/>
+            </w:tcBorders>
+            <w:tcMar>
+              <w:top w:type="dxa" w:w="50"/>
+              <w:left w:type="dxa" w:w="90"/>
+              <w:bottom w:type="dxa" w:w="50"/>
+              <w:right w:type="dxa" w:w="90"/>
+            </w:tcMar>
+          </w:tcPr>
+          <w:p>
+            <w:pPr>
+              <w:spacing w:line="240" w:lineRule="auto"/>
+            </w:pPr>
+            <w:r>
+              <w:rPr>
+                <w:rFonts w:ascii="Times New Roman" w:cs="Times New Roman" w:eastAsia="Times New Roman" w:hAnsi="Times New Roman"/>
+                <w:b w:val="false"/>
+                <w:bCs w:val="false"/>
+                <w:sz w:val="20"/>
+                <w:szCs w:val="20"/>
+              </w:rPr>
+              <w:t xml:space="preserve">+0.007 (0.026)</w:t>
+            </w:r>
+          </w:p>
+        </w:tc>
+        <w:tc>
+          <w:tcPr>
+            <w:tcW w:type="dxa" w:w="1075"/>
+            <w:tcBorders>
+              <w:top w:val="none" w:color="FFFFFF" w:sz="0"/>
+              <w:left w:val="none" w:color="FFFFFF" w:sz="0"/>
+              <w:bottom w:val="none" w:color="FFFFFF" w:sz="0"/>
+              <w:right w:val="none" w:color="FFFFFF" w:sz="0"/>
+            </w:tcBorders>
+            <w:tcMar>
+              <w:top w:type="dxa" w:w="50"/>
+              <w:left w:type="dxa" w:w="90"/>
+              <w:bottom w:type="dxa" w:w="50"/>
+              <w:right w:type="dxa" w:w="90"/>
+            </w:tcMar>
+          </w:tcPr>
+          <w:p>
+            <w:pPr>
+              <w:spacing w:line="240" w:lineRule="auto"/>
+            </w:pPr>
+            <w:r>
+              <w:rPr>
+                <w:rFonts w:ascii="Times New Roman" w:cs="Times New Roman" w:eastAsia="Times New Roman" w:hAnsi="Times New Roman"/>
+                <w:b w:val="false"/>
+                <w:bCs w:val="false"/>
+                <w:sz w:val="20"/>
+                <w:szCs w:val="20"/>
+              </w:rPr>
+              <w:t xml:space="preserve">−0.022 (0.009)</w:t>
+            </w:r>
+          </w:p>
+        </w:tc>
+        <w:tc>
+          <w:tcPr>
+            <w:tcW w:type="dxa" w:w="1075"/>
+            <w:tcBorders>
+              <w:top w:val="none" w:color="FFFFFF" w:sz="0"/>
+              <w:left w:val="none" w:color="FFFFFF" w:sz="0"/>
+              <w:bottom w:val="none" w:color="FFFFFF" w:sz="0"/>
+              <w:right w:val="none" w:color="FFFFFF" w:sz="0"/>
+            </w:tcBorders>
+            <w:tcMar>
+              <w:top w:type="dxa" w:w="50"/>
+              <w:left w:type="dxa" w:w="90"/>
+              <w:bottom w:type="dxa" w:w="50"/>
+              <w:right w:type="dxa" w:w="90"/>
+            </w:tcMar>
+          </w:tcPr>
+          <w:p>
+            <w:pPr>
+              <w:spacing w:line="240" w:lineRule="auto"/>
+            </w:pPr>
+            <w:r>
+              <w:rPr>
+                <w:rFonts w:ascii="Times New Roman" w:cs="Times New Roman" w:eastAsia="Times New Roman" w:hAnsi="Times New Roman"/>
+                <w:b w:val="false"/>
+                <w:bCs w:val="false"/>
+                <w:sz w:val="20"/>
+                <w:szCs w:val="20"/>
+              </w:rPr>
+              <w:t xml:space="preserve">−0.009 (0.025)</w:t>
+            </w:r>
+          </w:p>
+        </w:tc>
+        <w:tc>
+          <w:tcPr>
+            <w:tcW w:type="dxa" w:w="1300"/>
+            <w:tcBorders>
+              <w:top w:val="none" w:color="FFFFFF" w:sz="0"/>
+              <w:left w:val="none" w:color="FFFFFF" w:sz="0"/>
+              <w:bottom w:val="none" w:color="FFFFFF" w:sz="0"/>
+              <w:right w:val="none" w:color="FFFFFF" w:sz="0"/>
+            </w:tcBorders>
+            <w:tcMar>
+              <w:top w:type="dxa" w:w="50"/>
+              <w:left w:type="dxa" w:w="90"/>
+              <w:bottom w:type="dxa" w:w="50"/>
+              <w:right w:type="dxa" w:w="90"/>
+            </w:tcMar>
+          </w:tcPr>
+          <w:p>
+            <w:pPr>
+              <w:spacing w:line="240" w:lineRule="auto"/>
+            </w:pPr>
+            <w:r>
+              <w:rPr>
+                <w:rFonts w:ascii="Times New Roman" w:cs="Times New Roman" w:eastAsia="Times New Roman" w:hAnsi="Times New Roman"/>
+                <w:b w:val="false"/>
+                <w:bCs w:val="false"/>
+                <w:sz w:val="20"/>
+                <w:szCs w:val="20"/>
+              </w:rPr>
+              <w:t xml:space="preserve">+0.016 (0.027) / +0.011 (0.030)</w:t>
+            </w:r>
+          </w:p>
+        </w:tc>
+      </w:tr>
+      <w:tr>
+        <w:trPr>
+          <w:cantSplit/>
+          <w:tblHeader w:val="false"/>
+        </w:trPr>
+        <w:tc>
+          <w:tcPr>
+            <w:tcW w:type="dxa" w:w="2760"/>
+            <w:tcBorders>
+              <w:top w:val="none" w:color="FFFFFF" w:sz="0"/>
+              <w:left w:val="none" w:color="FFFFFF" w:sz="0"/>
+              <w:bottom w:val="single" w:color="000000" w:sz="4"/>
+              <w:right w:val="none" w:color="FFFFFF" w:sz="0"/>
+            </w:tcBorders>
+            <w:tcMar>
+              <w:top w:type="dxa" w:w="50"/>
+              <w:left w:type="dxa" w:w="90"/>
+              <w:bottom w:type="dxa" w:w="50"/>
+              <w:right w:type="dxa" w:w="90"/>
+            </w:tcMar>
+          </w:tcPr>
+          <w:p>
+            <w:pPr>
+              <w:spacing w:line="240" w:lineRule="auto"/>
+            </w:pPr>
+            <w:r>
+              <w:rPr>
+                <w:rFonts w:ascii="Times New Roman" w:cs="Times New Roman" w:eastAsia="Times New Roman" w:hAnsi="Times New Roman"/>
+                <w:b w:val="false"/>
+                <w:bCs w:val="false"/>
+                <w:sz w:val="20"/>
+                <w:szCs w:val="20"/>
+              </w:rPr>
+              <w:t xml:space="preserve">Randomization p (two-digit FE)</w:t>
+            </w:r>
+          </w:p>
+        </w:tc>
+        <w:tc>
+          <w:tcPr>
+            <w:tcW w:type="dxa" w:w="1075"/>
+            <w:tcBorders>
+              <w:top w:val="none" w:color="FFFFFF" w:sz="0"/>
+              <w:left w:val="none" w:color="FFFFFF" w:sz="0"/>
+              <w:bottom w:val="single" w:color="000000" w:sz="4"/>
+              <w:right w:val="none" w:color="FFFFFF" w:sz="0"/>
+            </w:tcBorders>
+            <w:tcMar>
+              <w:top w:type="dxa" w:w="50"/>
+              <w:left w:type="dxa" w:w="90"/>
+              <w:bottom w:type="dxa" w:w="50"/>
+              <w:right w:type="dxa" w:w="90"/>
+            </w:tcMar>
+          </w:tcPr>
+          <w:p>
+            <w:pPr>
+              <w:spacing w:line="240" w:lineRule="auto"/>
+            </w:pPr>
+          </w:p>
+        </w:tc>
+        <w:tc>
+          <w:tcPr>
+            <w:tcW w:type="dxa" w:w="1075"/>
+            <w:tcBorders>
+              <w:top w:val="none" w:color="FFFFFF" w:sz="0"/>
+              <w:left w:val="none" w:color="FFFFFF" w:sz="0"/>
+              <w:bottom w:val="single" w:color="000000" w:sz="4"/>
+              <w:right w:val="none" w:color="FFFFFF" w:sz="0"/>
+            </w:tcBorders>
+            <w:tcMar>
+              <w:top w:type="dxa" w:w="50"/>
+              <w:left w:type="dxa" w:w="90"/>
+              <w:bottom w:type="dxa" w:w="50"/>
+              <w:right w:type="dxa" w:w="90"/>
+            </w:tcMar>
+          </w:tcPr>
+          <w:p>
+            <w:pPr>
+              <w:spacing w:line="240" w:lineRule="auto"/>
+            </w:pPr>
+          </w:p>
+        </w:tc>
+        <w:tc>
+          <w:tcPr>
+            <w:tcW w:type="dxa" w:w="1075"/>
+            <w:tcBorders>
+              <w:top w:val="none" w:color="FFFFFF" w:sz="0"/>
+              <w:left w:val="none" w:color="FFFFFF" w:sz="0"/>
+              <w:bottom w:val="single" w:color="000000" w:sz="4"/>
+              <w:right w:val="none" w:color="FFFFFF" w:sz="0"/>
+            </w:tcBorders>
+            <w:tcMar>
+              <w:top w:type="dxa" w:w="50"/>
+              <w:left w:type="dxa" w:w="90"/>
+              <w:bottom w:type="dxa" w:w="50"/>
+              <w:right w:type="dxa" w:w="90"/>
+            </w:tcMar>
+          </w:tcPr>
+          <w:p>
+            <w:pPr>
+              <w:spacing w:line="240" w:lineRule="auto"/>
+            </w:pPr>
+            <w:r>
+              <w:rPr>
+                <w:rFonts w:ascii="Times New Roman" w:cs="Times New Roman" w:eastAsia="Times New Roman" w:hAnsi="Times New Roman"/>
+                <w:b w:val="false"/>
+                <w:bCs w:val="false"/>
+                <w:sz w:val="20"/>
+                <w:szCs w:val="20"/>
+              </w:rPr>
+              <w:t xml:space="preserve">0.100</w:t>
+            </w:r>
+          </w:p>
+        </w:tc>
+        <w:tc>
+          <w:tcPr>
+            <w:tcW w:type="dxa" w:w="1075"/>
+            <w:tcBorders>
+              <w:top w:val="none" w:color="FFFFFF" w:sz="0"/>
+              <w:left w:val="none" w:color="FFFFFF" w:sz="0"/>
+              <w:bottom w:val="single" w:color="000000" w:sz="4"/>
+              <w:right w:val="none" w:color="FFFFFF" w:sz="0"/>
+            </w:tcBorders>
+            <w:tcMar>
+              <w:top w:type="dxa" w:w="50"/>
+              <w:left w:type="dxa" w:w="90"/>
+              <w:bottom w:type="dxa" w:w="50"/>
+              <w:right w:type="dxa" w:w="90"/>
+            </w:tcMar>
+          </w:tcPr>
+          <w:p>
+            <w:pPr>
+              <w:spacing w:line="240" w:lineRule="auto"/>
+            </w:pPr>
+            <w:r>
+              <w:rPr>
+                <w:rFonts w:ascii="Times New Roman" w:cs="Times New Roman" w:eastAsia="Times New Roman" w:hAnsi="Times New Roman"/>
+                <w:b w:val="false"/>
+                <w:bCs w:val="false"/>
+                <w:sz w:val="20"/>
+                <w:szCs w:val="20"/>
+              </w:rPr>
+              <w:t xml:space="preserve">0.770</w:t>
+            </w:r>
+          </w:p>
+        </w:tc>
+        <w:tc>
+          <w:tcPr>
+            <w:tcW w:type="dxa" w:w="1300"/>
+            <w:tcBorders>
+              <w:top w:val="none" w:color="FFFFFF" w:sz="0"/>
+              <w:left w:val="none" w:color="FFFFFF" w:sz="0"/>
+              <w:bottom w:val="single" w:color="000000" w:sz="4"/>
+              <w:right w:val="none" w:color="FFFFFF" w:sz="0"/>
+            </w:tcBorders>
+            <w:tcMar>
+              <w:top w:type="dxa" w:w="50"/>
+              <w:left w:type="dxa" w:w="90"/>
+              <w:bottom w:type="dxa" w:w="50"/>
+              <w:right w:type="dxa" w:w="90"/>
+            </w:tcMar>
+          </w:tcPr>
+          <w:p>
+            <w:pPr>
+              <w:spacing w:line="240" w:lineRule="auto"/>
+            </w:pPr>
+            <w:r>
+              <w:rPr>
+                <w:rFonts w:ascii="Times New Roman" w:cs="Times New Roman" w:eastAsia="Times New Roman" w:hAnsi="Times New Roman"/>
+                <w:b w:val="false"/>
+                <w:bCs w:val="false"/>
+                <w:sz w:val="20"/>
+                <w:szCs w:val="20"/>
+              </w:rPr>
+              <w:t xml:space="preserve">0.592 / 0.734</w:t>
+            </w:r>
+          </w:p>
+        </w:tc>
+      </w:tr>
+    </w:tbl>
+    <w:p>
+      <w:pPr>
+        <w:spacing w:after="200" w:before="60" w:line="240" w:lineRule="auto"/>
+      </w:pPr>
+      <w:r>
+        <w:rPr>
+          <w:rFonts w:ascii="Times New Roman" w:cs="Times New Roman" w:eastAsia="Times New Roman" w:hAnsi="Times New Roman"/>
+          <w:i/>
+          <w:iCs/>
+          <w:sz w:val="20"/>
+          <w:szCs w:val="20"/>
+        </w:rPr>
+        <w:t xml:space="preserve">Note.</w:t>
+      </w:r>
+      <w:r>
+        <w:rPr>
+          <w:rFonts w:ascii="Times New Roman" w:cs="Times New Roman" w:eastAsia="Times New Roman" w:hAnsi="Times New Roman"/>
+          <w:sz w:val="20"/>
+          <w:szCs w:val="20"/>
+        </w:rPr>
+        <w:t xml:space="preserve"> Statistics Canada, Job Vacancy and Wage Survey, table 14-10-0444; 308 NOC 2021 unit groups. Windows are July to June; the windows ending in June 2020 and June 2021 are unavailable because 2020Q2 and 2020Q3 were not collected. Standard errors clustered by NOC three-digit group in parentheses. No control for LLM exposure.</w:t>
+      </w:r>
+    </w:p>
+    <w:p>
+      <w:pPr>
+        <w:pStyle w:val="Heading2"/>
+        <w:keepNext/>
+        <w:spacing w:after="120" w:before="240" w:line="240" w:lineRule="auto"/>
+      </w:pPr>
+      <w:r>
+        <w:rPr>
+          <w:rFonts w:ascii="Times New Roman" w:cs="Times New Roman" w:eastAsia="Times New Roman" w:hAnsi="Times New Roman"/>
+          <w:b/>
+          <w:bCs/>
+          <w:sz w:val="24"/>
+          <w:szCs w:val="24"/>
+        </w:rPr>
+        <w:t xml:space="preserve">6.5 UK Adverts: Occupation Groups</w:t>
+      </w:r>
+    </w:p>
+    <w:p>
+      <w:pPr>
+        <w:spacing w:after="0" w:line="480" w:lineRule="auto"/>
+        <w:ind w:firstLine="720"/>
+        <w:jc w:val="left"/>
+      </w:pPr>
+      <w:r>
+        <w:rPr>
+          <w:rFonts w:ascii="Times New Roman" w:cs="Times New Roman" w:eastAsia="Times New Roman" w:hAnsi="Times New Roman"/>
+          <w:sz w:val="24"/>
+          <w:szCs w:val="24"/>
+        </w:rPr>
+        <w:t xml:space="preserve">The three groups chosen from occupation labels show a similar story with larger numbers (Table 7). Relative to other occupations, adverts for image and video production occupations fell by 0.20 log points in the first year after the base year (randomization p = 0.032) and by 0.38 in the third and fourth (p = 0.011). Creative direction occupations fell by less (−0.11 in the first year and −0.23 in the third; p between 0.15 and 0.27). Text production occupations did not differ from others in the first two years (−0.10 and +0.03) and fell later (−0.33 in the third year, p = 0.046; −0.47 in the fourth, p = 0.008), led by journalists and editors. The decline in image and video production is concentrated in web design professionals, who rank first or third among 405 occupations in the later years (log changes of −1.45 and −1.36 against a comparison median of −0.43 and −0.46); graphic and multimedia designers rank 32nd to 38th (−0.86 and −0.89), and artists and photographers are close to the median. Without web design professionals the third- and fourth-year differences fall to −0.16 and −0.21. Placebo design occupations that image generators do not target (interior designers, fashion and accessories designers, design occupations not elsewhere classified) also fell relative to others (−0.16, −0.20, and −0.06 in the first, third, and fourth years). Between June 2019 and June 2021 the image and video production group had already fallen by 0.32 log points relative to others, and the other two groups by 0.36 and 0.31.</w:t>
+      </w:r>
+    </w:p>
+    <w:p>
+      <w:pPr>
+        <w:keepNext/>
+        <w:spacing w:after="80" w:before="240" w:line="240" w:lineRule="auto"/>
+        <w:jc w:val="center"/>
+      </w:pPr>
+      <w:r>
+        <w:rPr>
+          <w:rFonts w:ascii="Times New Roman" w:cs="Times New Roman" w:eastAsia="Times New Roman" w:hAnsi="Times New Roman"/>
+          <w:b/>
+          <w:bCs/>
+          <w:sz w:val="22"/>
+          <w:szCs w:val="22"/>
+        </w:rPr>
+        <w:t xml:space="preserve">Table 7.</w:t>
       </w:r>
       <w:r>
         <w:rPr>
@@ -7386,7 +8478,7 @@
           <w:sz w:val="24"/>
           <w:szCs w:val="24"/>
         </w:rPr>
-        <w:t xml:space="preserve">6.5 Quality-Requirement Heterogeneity (H2)</w:t>
+        <w:t xml:space="preserve">6.6 Quality-Requirement Heterogeneity (H2)</w:t>
       </w:r>
     </w:p>
     <w:p>
@@ -7401,7 +8493,7 @@
           <w:sz w:val="24"/>
           <w:szCs w:val="24"/>
         </w:rPr>
-        <w:t xml:space="preserve">H2 is not supported. Exposure to low-quality-requirement creation tasks is associated with declines in 2023 and 2024 (−0.026 and −0.019, standard errors 0.016 and 0.023), but the coefficient is close to zero in 2025 (−0.005) and small in 2026 (−0.017). Exposure to high-requirement tasks has coefficients near zero throughout. The difference between the low and high coefficients is −0.029 (standard error 0.025) in 2023, −0.028 (0.036) in 2024, 0.000 (0.033) in 2025, and −0.014 (0.036) in 2026 (Table 7). The difference has the same sign in the pre-period (−0.046 in 2018 and −0.031 in 2019), and none of the differences is statistically distinguishable from zero. Low- and high-requirement exposure are correlated across occupations (0.48), which limits power. We cannot reject that quality requirements matter, but we find no support for it.</w:t>
+        <w:t xml:space="preserve">H2 is not supported. Exposure to low-quality-requirement creation tasks is associated with declines in 2023 and 2024 (−0.026 and −0.019, standard errors 0.016 and 0.023), but the coefficient is close to zero in 2025 (−0.005) and small in 2026 (−0.017). Exposure to high-requirement tasks has coefficients near zero throughout. The difference between the low and high coefficients is −0.029 (standard error 0.025) in 2023, −0.028 (0.036) in 2024, 0.000 (0.033) in 2025, and −0.014 (0.036) in 2026 (Table 8). The difference has the same sign in the pre-period (−0.046 in 2018 and −0.031 in 2019), and none of the differences is statistically distinguishable from zero. Low- and high-requirement exposure are correlated across occupations (0.48), which limits power. We cannot reject that quality requirements matter, but we find no support for it.</w:t>
       </w:r>
     </w:p>
     <w:p>
@@ -7418,7 +8510,7 @@
           <w:sz w:val="22"/>
           <w:szCs w:val="22"/>
         </w:rPr>
-        <w:t xml:space="preserve">Table 7.</w:t>
+        <w:t xml:space="preserve">Table 8.</w:t>
       </w:r>
       <w:r>
         <w:rPr>
@@ -8653,7 +9745,7 @@
           <w:sz w:val="24"/>
           <w:szCs w:val="24"/>
         </w:rPr>
-        <w:t xml:space="preserve">6.6 Scaling by Adoption</w:t>
+        <w:t xml:space="preserve">6.7 Scaling by Adoption</w:t>
       </w:r>
     </w:p>
     <w:p>
@@ -8668,7 +9760,7 @@
           <w:sz w:val="24"/>
           <w:szCs w:val="24"/>
         </w:rPr>
-        <w:t xml:space="preserve">Table 8 applies equation (2). For graphic and multimedia designers, who have the highest exposure (8.0 standard deviations above the mean), the coefficients imply a predicted log change of −0.17 in 2025 and −0.26 in 2026 (specification with the language control). If 36% of employers of this occupation had adopted, which is the EU27 rate in publishing, film, and broadcasting, the implied effect among adopters would be −0.46 and −0.73 log points, a fall in adverts of 37% to 52% among adopters. At the EU27 average adoption rate of 10% the implied effect among adopters is −1.7 and −2.6 log points, which means 81% to 93% fewer adverts. The lower end of the 95% interval is larger still. Without the language control the implied numbers are about twice as large. These magnitudes are implausibly large for substitution among adopters, who would have to cut hiring for the occupation sharply and persistently within a few years of a technology’s release, while still adopting less than the average firm in the professions that employ designers. Either adoption among employers of these occupations is far higher than the sector averages in Table 2, or most of the observed decline is not due to adoption of generative visual AI. The first reading is possible because designers are concentrated in sectors with higher adoption and in small firms that buy tools off the shelf. The second reading is consistent with the COVID-era pattern in Section 6.2 and with the decline of design occupations that image generators do not target.</w:t>
+        <w:t xml:space="preserve">Table 9 applies equation (2). For graphic and multimedia designers, who have the highest exposure (8.0 standard deviations above the mean), the coefficients imply a predicted log change of −0.17 in 2025 and −0.26 in 2026 (specification with the language control). If 36% of employers of this occupation had adopted, which is the EU27 rate in publishing, film, and broadcasting, the implied effect among adopters would be −0.46 and −0.73 log points, a fall in adverts of 37% to 52% among adopters. At the EU27 average adoption rate of 10% the implied effect among adopters is −1.7 and −2.6 log points, which means 81% to 93% fewer adverts. The lower end of the 95% interval is larger still. Without the language control the implied numbers are about twice as large. These magnitudes are implausibly large for substitution among adopters, who would have to cut hiring for the occupation sharply and persistently within a few years of a technology’s release, while still adopting less than the average firm in the professions that employ designers. Either adoption among employers of these occupations is far higher than the sector averages in Table 2, or most of the observed decline is not due to adoption of generative visual AI. The first reading is possible because designers are concentrated in sectors with higher adoption and in small firms that buy tools off the shelf. The second reading is consistent with the COVID-era pattern in Section 6.2 and with the decline of design occupations that image generators do not target.</w:t>
       </w:r>
     </w:p>
     <w:p>
@@ -8685,7 +9777,7 @@
           <w:sz w:val="22"/>
           <w:szCs w:val="22"/>
         </w:rPr>
-        <w:t xml:space="preserve">Table 8.</w:t>
+        <w:t xml:space="preserve">Table 9.</w:t>
       </w:r>
       <w:r>
         <w:rPr>
@@ -9588,7 +10680,7 @@
           <w:sz w:val="24"/>
           <w:szCs w:val="24"/>
         </w:rPr>
-        <w:t xml:space="preserve">6.7 Supplementary Evidence: US Sectors and European Employment</w:t>
+        <w:t xml:space="preserve">6.8 Supplementary Evidence: US Sectors and European Employment</w:t>
       </w:r>
     </w:p>
     <w:p>
@@ -9620,7 +10712,7 @@
           <w:sz w:val="24"/>
           <w:szCs w:val="24"/>
         </w:rPr>
-        <w:t xml:space="preserve">6.8 Summary of Evidence Against the Hypotheses</w:t>
+        <w:t xml:space="preserve">6.9 Summary of Evidence Against the Hypotheses</w:t>
       </w:r>
     </w:p>
     <w:p>
@@ -9635,7 +10727,7 @@
           <w:sz w:val="24"/>
           <w:szCs w:val="24"/>
         </w:rPr>
-        <w:t xml:space="preserve">H1 is supported in a limited sense: adoption is substantial and rising, while estimated labor-demand effects are small, imprecise, and partly a reversal of earlier trends; the scaling exercise shows that the largest observed declines are too large for current adoption to explain through substitution. H2 is not supported. H3 is partly supported: firms cite expertise and legal and privacy uncertainty far more than usefulness, but cross-country variation in these concerns does not clearly explain adoption. H4 is weakly supported: in the UK the coefficients are most negative in 2026 and in Europe without the language control they grow from 2023 to 2024, but in both the pattern is not clearly monotone and in the UK the effect cannot be separated from the pre-existing pattern. The European replication strengthens the direction of the result and removes the pre-trend concern, but it covers only two post-2022 years.</w:t>
+        <w:t xml:space="preserve">H1 is supported in a limited sense: adoption is substantial and rising, while estimated labor-demand effects are small, imprecise, and partly a reversal of earlier trends; the scaling exercise shows that the largest observed declines are too large for current adoption to explain through substitution. H2 is not supported. H3 is partly supported: firms cite expertise and legal and privacy uncertainty far more than usefulness, but cross-country variation in these concerns does not clearly explain adoption. H4 is weakly supported: in the UK the coefficients are most negative in 2026 and in Europe without the language control they grow from 2023 to 2024, but in both the pattern is not clearly monotone and in the UK the effect cannot be separated from the pre-existing pattern. The European replication strengthens the direction of the result and removes the pre-trend concern, but it covers only two post-2022 years. In Canada the first post-2022 year agrees in sign, and later years show no clear pattern within narrow occupation groups.</w:t>
       </w:r>
     </w:p>
     <w:p>
@@ -9749,7 +10841,7 @@
           <w:sz w:val="24"/>
           <w:szCs w:val="24"/>
         </w:rPr>
-        <w:t xml:space="preserve">The identification is weak. Exposure is a continuous measure, but the pre-period contains the COVID shock, and the post-2022 pattern resembles a reversal of the 2022 recovery; the coefficients are small and rely on a few occupations. We do not observe adoption by employers of each occupation, so the scaling exercise is a stylized check. The adoption survey covers Europe and asks about AI in general for the barriers, whereas the hiring data are for the United Kingdom, so we link them only through sector averages. The Eurostat indicator for generative visual AI is available for one year, so we cannot show its growth. The European replication uses experimental statistics that cover 16 countries, ISCO three-digit occupations, and only two post-2022 years, and it ends in 2024. The exposure measure is LLM-coded and has not been validated against human coders, although a rule-based score gives similar results. The mapping from O*NET to UK occupations goes through ISCO-08 and is approximate. The ONS series is experimental and has missing months that we interpolate. Adverts measure hiring intent, not employment, and substitution may occur through hours, outsourcing, or freelancing, which adverts cannot show. Model release dates are approximate. Finally, our model abstracts from changes in the quality and variety of assets and from price effects.</w:t>
+        <w:t xml:space="preserve">The identification is weak. Exposure is a continuous measure, but the pre-period contains the COVID shock, and the post-2022 pattern resembles a reversal of the 2022 recovery; the coefficients are small and rely on a few occupations. We do not observe adoption by employers of each occupation, so the scaling exercise is a stylized check. The adoption survey covers Europe and asks about AI in general for the barriers, whereas the hiring data are for the United Kingdom, so we link them only through sector averages. The Eurostat indicator for generative visual AI is available for one year, so we cannot show its growth. The European replication uses experimental statistics that cover 16 countries, ISCO three-digit occupations, and only two post-2022 years, and it ends in 2024. The Canadian data are an employer survey of vacancies rather than job adverts, lack two quarters in 2020, use exposure scored from NOC duty statements without a control for LLM exposure, and give imprecise estimates after 2023. The exposure measure is LLM-coded and has not been validated against human coders, although a rule-based score gives similar results. The mapping from O*NET to UK occupations goes through ISCO-08 and is approximate. The ONS series is experimental and has missing months that we interpolate. Adverts measure hiring intent, not employment, and substitution may occur through hours, outsourcing, or freelancing, which adverts cannot show. Model release dates are approximate. Finally, our model abstracts from changes in the quality and variety of assets and from price effects.</w:t>
       </w:r>
     </w:p>
     <w:p>
@@ -10206,6 +11298,20 @@
           <w:szCs w:val="24"/>
         </w:rPr>
         <w:t xml:space="preserve">Office for National Statistics. Labour demand volumes by Standard Occupation Classification (SOC 2020), UK: January 2017 to August 2026 (experimental statistics based on Textkernel data); and SOC 2020 Volume 2: the coding index. Open Government Licence.</w:t>
+      </w:r>
+    </w:p>
+    <w:p>
+      <w:pPr>
+        <w:spacing w:after="120" w:line="240" w:lineRule="auto"/>
+        <w:ind w:left="720" w:hanging="720"/>
+      </w:pPr>
+      <w:r>
+        <w:rPr>
+          <w:rFonts w:ascii="Times New Roman" w:cs="Times New Roman" w:eastAsia="Times New Roman" w:hAnsi="Times New Roman"/>
+          <w:sz w:val="24"/>
+          <w:szCs w:val="24"/>
+        </w:rPr>
+        <w:t xml:space="preserve">Statistics Canada. Job vacancies and average offered hourly wage by occupation (unit group), quarterly, unadjusted for seasonality, table 14-10-0444; and National Occupational Classification (NOC) 2021 Version 1.0, elements file. Statistics Canada Open Licence.</w:t>
       </w:r>
     </w:p>
     <w:p>

</xml_diff>

<commit_message>
Add conditional projection (when could displacement become detectable) to manuscript
Co-Authored-By: Claude Sonnet 5.5 <noreply@anthropic.com>
Claude-Session: https://claude.ai/code/session_01H4JvRLBkzRHsy6jU5TcEWv
</commit_message>
<xml_diff>
--- a/isr_paper/ISR_Paper_Early_Adoption_Delayed_Displacement.docx
+++ b/isr_paper/ISR_Paper_Early_Adoption_Delayed_Displacement.docx
@@ -102,7 +102,7 @@
           <w:sz w:val="24"/>
           <w:szCs w:val="24"/>
         </w:rPr>
-        <w:t xml:space="preserve">Does generative AI that creates images and video displace creative workers, or is its effect delayed? We model labor demand in visual-content occupations as the share of employers who have adopted times the net effect among adopters, where adoption requires acceptable output quality at low review cost and is held back by expertise and legal frictions. Eurostat data show that 9.6% of European firms with ten or more employees use AI that generates pictures, video, or audio, and that firms cite lack of expertise and legal and privacy uncertainty far more than lack of usefulness. In job-posting data for 403 UK occupations, 96 occupations in 16 European countries, and 308 Canadian occupations, exposure to visual content creation predicts small, fragile declines after 2022 (about 1 to 3% per standard deviation) that are not concentrated in low-quality-requirement tasks and, for the most exposed UK occupations, exceed what current adoption could explain.</w:t>
+        <w:t xml:space="preserve">Does generative AI that creates images and video displace creative workers, or is its effect delayed? We model labor demand in visual-content occupations as the share of employers who have adopted times the net effect among adopters; adoption requires acceptable output quality at low review cost and is held back by expertise and legal frictions. Eurostat data show that 9.6% of European firms with ten or more employees use AI that generates pictures, video, or audio, and that firms cite expertise and legal and privacy uncertainty far more than lack of usefulness. In job-posting data for UK, European, and Canadian occupations, exposure to visual content creation predicts small, fragile declines after 2022 (about 1 to 3% per standard deviation), not concentrated in low-quality-requirement tasks. A conditional projection suggests that a 40% cut in demand among adopters would become detectable around 2029–2030.</w:t>
       </w:r>
     </w:p>
     <w:p>
@@ -231,7 +231,7 @@
           <w:sz w:val="24"/>
           <w:szCs w:val="24"/>
         </w:rPr>
-        <w:t xml:space="preserve">Our findings are as follows. Adoption is already substantial: 9.6% of European firms with ten or more employees use AI that generates pictures, video, or audio, rising to 27.9% among firms with 250 or more employees and to about 36% in publishing, film, and broadcasting. Among firms that considered AI but did not adopt it, 70% cite lack of expertise, 54% unclear legal consequences, and 53% data protection and privacy concerns, against 18% who consider AI not useful. In UK adverts, occupations with higher exposure to visual content creation show small declines after 2022 (about 2 to 3% per standard deviation of exposure by 2025 and 2026, with randomization p-values from 0.03 to 0.47 across years and specifications), but these declines resemble a reversal of a COVID-era pattern, are not concentrated in tasks with low quality requirements, vanish when one occupation is dropped, and are far too large, for the occupations with the highest exposure, to be explained by the observed adoption levels. In the European replication the pattern has the same sign and similar size, with flat pre-period coefficients and two post-2022 years (about −1.6% per standard deviation in 2023 and −1.2% in 2024 with the language control; −3.7% and −5.9% without). In Canada the coefficient is negative in the first post-2022 year (−2.2% per standard deviation, with occupation-group fixed effects) but not afterward. We read the evidence as consistent with early adoption and little detectable displacement so far, and we do not claim that displacement is absent or will not come.</w:t>
+        <w:t xml:space="preserve">Our findings are as follows. Adoption is already substantial: 9.6% of European firms with ten or more employees use AI that generates pictures, video, or audio, rising to 27.9% among firms with 250 or more employees and to about 36% in publishing, film, and broadcasting. Among firms that considered AI but did not adopt it, 70% cite lack of expertise, 54% unclear legal consequences, and 53% data protection and privacy concerns, against 18% who consider AI not useful. In UK adverts, occupations with higher exposure to visual content creation show small declines after 2022 (about 2 to 3% per standard deviation of exposure by 2025 and 2026, with randomization p-values from 0.03 to 0.47 across years and specifications), but these declines resemble a reversal of a COVID-era pattern, are not concentrated in tasks with low quality requirements, vanish when one occupation is dropped, and are far too large, for the occupations with the highest exposure, to be explained by the observed adoption levels. In the European replication the pattern has the same sign and similar size, with flat pre-period coefficients and two post-2022 years (about −1.6% per standard deviation in 2023 and −1.2% in 2024 with the language control; −3.7% and −5.9% without). In Canada the coefficient is negative in the first post-2022 year (−2.2% per standard deviation, with occupation-group fixed effects) but not afterward. We also use the model to ask when displacement would become detectable: if demand among adopters fell by about 40% and adoption followed the recent path of text-generation AI, the effect would reach the detection threshold of our design around 2029 to 2030, and much later or never for smaller effects. We read the evidence as consistent with early adoption and little detectable displacement so far, and we do not claim that displacement is absent or will not come.</w:t>
       </w:r>
     </w:p>
     <w:p>
@@ -246,7 +246,7 @@
           <w:sz w:val="24"/>
           <w:szCs w:val="24"/>
         </w:rPr>
-        <w:t xml:space="preserve">The paper contributes to information systems research in three ways. First, it offers a model that decomposes labor-demand effects into adoption and net effect among adopters, and uses it to turn a null-like estimate into a bound: the observed decline in the most exposed occupations is too large for current adoption to explain through substitution among adopters, which points to other causes. Second, it brings direct survey evidence on the frictions that delay adoption, expertise and legal and privacy uncertainty, rather than assuming them. Third, it documents a measurement strategy that links task-level data on visual content creation to occupation-level hiring data across countries, and is open and reproducible.</w:t>
+        <w:t xml:space="preserve">The paper contributes to information systems research in four ways. First, it offers a model that decomposes labor-demand effects into adoption and net effect among adopters, and uses it to turn a null-like estimate into a bound: the observed decline in the most exposed occupations is too large for current adoption to explain through substitution among adopters, which points to other causes. Second, it brings direct survey evidence on the frictions that delay adoption, expertise and legal and privacy uncertainty, rather than assuming them. Third, it turns the model into a conditional projection of when displacement would become visible in data of this kind, with falsifiable criteria for later years. Fourth, it documents a measurement strategy that links task-level data on visual content creation to occupation-level hiring data across countries, and is open and reproducible.</w:t>
       </w:r>
     </w:p>
     <w:p>
@@ -2204,6 +2204,110 @@
           <w:szCs w:val="24"/>
         </w:rPr>
         <w:t xml:space="preserve">To assess whether the observed declines are of a size that adoption could explain, we use equation (2). For selected occupations, we compute the predicted log change from the estimated coefficient and the occupation’s exposure, and divide it by assumed adoption shares of 10% (the EU27 average for firms using AI that generates pictures, video, or audio), 20% (professional, scientific and technical services), and 36% (publishing, film, and broadcasting). The calculation is a stylized plausibility check because adoption among employers of a specific occupation is not observed.</w:t>
+      </w:r>
+    </w:p>
+    <w:p>
+      <w:pPr>
+        <w:pStyle w:val="Heading2"/>
+        <w:keepNext/>
+        <w:spacing w:after="120" w:before="240" w:line="240" w:lineRule="auto"/>
+      </w:pPr>
+      <w:r>
+        <w:rPr>
+          <w:rFonts w:ascii="Times New Roman" w:cs="Times New Roman" w:eastAsia="Times New Roman" w:hAnsi="Times New Roman"/>
+          <w:b/>
+          <w:bCs/>
+          <w:sz w:val="24"/>
+          <w:szCs w:val="24"/>
+        </w:rPr>
+        <w:t xml:space="preserve">5.5 Conditional Projection</w:t>
+      </w:r>
+    </w:p>
+    <w:p>
+      <w:pPr>
+        <w:spacing w:after="0" w:line="480" w:lineRule="auto"/>
+        <w:ind w:firstLine="720"/>
+        <w:jc w:val="left"/>
+      </w:pPr>
+      <w:r>
+        <w:rPr>
+          <w:rFonts w:ascii="Times New Roman" w:cs="Times New Roman" w:eastAsia="Times New Roman" w:hAnsi="Times New Roman"/>
+          <w:sz w:val="24"/>
+          <w:szCs w:val="24"/>
+        </w:rPr>
+        <w:t xml:space="preserve">The effect among adopters </w:t>
+      </w:r>
+      <w:r>
+        <w:rPr>
+          <w:rFonts w:ascii="Times New Roman" w:cs="Times New Roman" w:eastAsia="Times New Roman" w:hAnsi="Times New Roman"/>
+          <w:i/>
+          <w:iCs/>
+          <w:sz w:val="24"/>
+          <w:szCs w:val="24"/>
+        </w:rPr>
+        <w:t xml:space="preserve">β</w:t>
+      </w:r>
+      <w:r>
+        <w:rPr>
+          <w:rFonts w:ascii="Times New Roman" w:cs="Times New Roman" w:eastAsia="Times New Roman" w:hAnsi="Times New Roman"/>
+          <w:sz w:val="24"/>
+          <w:szCs w:val="24"/>
+        </w:rPr>
+        <w:t xml:space="preserve"> in equation (2) is not identified by our data, so we do not forecast displacement. Instead we ask when a given </w:t>
+      </w:r>
+      <w:r>
+        <w:rPr>
+          <w:rFonts w:ascii="Times New Roman" w:cs="Times New Roman" w:eastAsia="Times New Roman" w:hAnsi="Times New Roman"/>
+          <w:i/>
+          <w:iCs/>
+          <w:sz w:val="24"/>
+          <w:szCs w:val="24"/>
+        </w:rPr>
+        <w:t xml:space="preserve">β</w:t>
+      </w:r>
+      <w:r>
+        <w:rPr>
+          <w:rFonts w:ascii="Times New Roman" w:cs="Times New Roman" w:eastAsia="Times New Roman" w:hAnsi="Times New Roman"/>
+          <w:sz w:val="24"/>
+          <w:szCs w:val="24"/>
+        </w:rPr>
+        <w:t xml:space="preserve"> would become detectable with the design of Section 5.2. We model adoption as logistic: the log-odds of the adoption share rise linearly after 2025 at a scenario-specific rate. The rates are anchored on the Eurostat series: the log-odds of text-generation AI adoption rose by 0.98 between 2023 and 2024, by 0.52 between 2024 and 2025, and by 0.75 per year on average between 2023 and 2025, and those of any AI use by 0.52 per year. We use 0.75 (fast), 0.50 (medium), and 0.25 (slow) per year, starting from 9.6% (all European firms with ten or more employees) or 36.2% (publishing, film, and broadcasting). The predicted coefficient per standard deviation of exposure is </w:t>
+      </w:r>
+      <w:r>
+        <w:rPr>
+          <w:rFonts w:ascii="Times New Roman" w:cs="Times New Roman" w:eastAsia="Times New Roman" w:hAnsi="Times New Roman"/>
+          <w:i/>
+          <w:iCs/>
+          <w:sz w:val="24"/>
+          <w:szCs w:val="24"/>
+        </w:rPr>
+        <w:t xml:space="preserve">A_t</w:t>
+      </w:r>
+      <w:r>
+        <w:rPr>
+          <w:rFonts w:ascii="Times New Roman" w:cs="Times New Roman" w:eastAsia="Times New Roman" w:hAnsi="Times New Roman"/>
+          <w:sz w:val="24"/>
+          <w:szCs w:val="24"/>
+        </w:rPr>
+        <w:t xml:space="preserve"> · </w:t>
+      </w:r>
+      <w:r>
+        <w:rPr>
+          <w:rFonts w:ascii="Times New Roman" w:cs="Times New Roman" w:eastAsia="Times New Roman" w:hAnsi="Times New Roman"/>
+          <w:i/>
+          <w:iCs/>
+          <w:sz w:val="24"/>
+          <w:szCs w:val="24"/>
+        </w:rPr>
+        <w:t xml:space="preserve">β</w:t>
+      </w:r>
+      <w:r>
+        <w:rPr>
+          <w:rFonts w:ascii="Times New Roman" w:cs="Times New Roman" w:eastAsia="Times New Roman" w:hAnsi="Times New Roman"/>
+          <w:sz w:val="24"/>
+          <w:szCs w:val="24"/>
+        </w:rPr>
+        <w:t xml:space="preserve"> divided by the exposure of the most exposed occupation (8.0 standard deviations for graphic and multimedia designers). We call the effect detectable when the coefficient exceeds 1.96 times the standard error of the UK estimate for 2026 (0.017), that is 0.033 per standard deviation, which corresponds to an aggregate log change of 0.27 for that occupation. The calculation is a scenario analysis: it depends on a linear extrapolation of exposure, on an adoption path fitted to few data points, and on adoption among employers of the occupation being close to the sector figure.</w:t>
       </w:r>
     </w:p>
     <w:p>
@@ -10732,6 +10836,1100 @@
     </w:p>
     <w:p>
       <w:pPr>
+        <w:pStyle w:val="Heading2"/>
+        <w:keepNext/>
+        <w:spacing w:after="120" w:before="240" w:line="240" w:lineRule="auto"/>
+      </w:pPr>
+      <w:r>
+        <w:rPr>
+          <w:rFonts w:ascii="Times New Roman" w:cs="Times New Roman" w:eastAsia="Times New Roman" w:hAnsi="Times New Roman"/>
+          <w:b/>
+          <w:bCs/>
+          <w:sz w:val="24"/>
+          <w:szCs w:val="24"/>
+        </w:rPr>
+        <w:t xml:space="preserve">6.10 Projection: When Could Displacement Become Detectable?</w:t>
+      </w:r>
+    </w:p>
+    <w:p>
+      <w:pPr>
+        <w:spacing w:after="0" w:line="480" w:lineRule="auto"/>
+        <w:ind w:firstLine="720"/>
+        <w:jc w:val="left"/>
+      </w:pPr>
+      <w:r>
+        <w:rPr>
+          <w:rFonts w:ascii="Times New Roman" w:cs="Times New Roman" w:eastAsia="Times New Roman" w:hAnsi="Times New Roman"/>
+          <w:sz w:val="24"/>
+          <w:szCs w:val="24"/>
+        </w:rPr>
+        <w:t xml:space="preserve">Table 10 reports the share of employers that would have to adopt for the effect to reach the detection threshold, and the first year in which each adoption scenario gets there. The threshold requires adoption times </w:t>
+      </w:r>
+      <w:r>
+        <w:rPr>
+          <w:rFonts w:ascii="Times New Roman" w:cs="Times New Roman" w:eastAsia="Times New Roman" w:hAnsi="Times New Roman"/>
+          <w:i/>
+          <w:iCs/>
+          <w:sz w:val="24"/>
+          <w:szCs w:val="24"/>
+        </w:rPr>
+        <w:t xml:space="preserve">β</w:t>
+      </w:r>
+      <w:r>
+        <w:rPr>
+          <w:rFonts w:ascii="Times New Roman" w:cs="Times New Roman" w:eastAsia="Times New Roman" w:hAnsi="Times New Roman"/>
+          <w:sz w:val="24"/>
+          <w:szCs w:val="24"/>
+        </w:rPr>
+        <w:t xml:space="preserve"> to reach −0.27. If demand among adopters falls by 39% (</w:t>
+      </w:r>
+      <w:r>
+        <w:rPr>
+          <w:rFonts w:ascii="Times New Roman" w:cs="Times New Roman" w:eastAsia="Times New Roman" w:hAnsi="Times New Roman"/>
+          <w:i/>
+          <w:iCs/>
+          <w:sz w:val="24"/>
+          <w:szCs w:val="24"/>
+        </w:rPr>
+        <w:t xml:space="preserve">β</w:t>
+      </w:r>
+      <w:r>
+        <w:rPr>
+          <w:rFonts w:ascii="Times New Roman" w:cs="Times New Roman" w:eastAsia="Times New Roman" w:hAnsi="Times New Roman"/>
+          <w:sz w:val="24"/>
+          <w:szCs w:val="24"/>
+        </w:rPr>
+        <w:t xml:space="preserve"> = −0.5), adoption must reach 53%. Starting from the EU27 average of 9.6%, this happens in 2029 under fast diffusion, 2030 under medium diffusion, and 2035 under slow diffusion. Starting from the 36% adoption observed in publishing, film, and broadcasting, it happens in 2026, 2027, and 2028. If demand among adopters falls by 26% (</w:t>
+      </w:r>
+      <w:r>
+        <w:rPr>
+          <w:rFonts w:ascii="Times New Roman" w:cs="Times New Roman" w:eastAsia="Times New Roman" w:hAnsi="Times New Roman"/>
+          <w:i/>
+          <w:iCs/>
+          <w:sz w:val="24"/>
+          <w:szCs w:val="24"/>
+        </w:rPr>
+        <w:t xml:space="preserve">β</w:t>
+      </w:r>
+      <w:r>
+        <w:rPr>
+          <w:rFonts w:ascii="Times New Roman" w:cs="Times New Roman" w:eastAsia="Times New Roman" w:hAnsi="Times New Roman"/>
+          <w:sz w:val="24"/>
+          <w:szCs w:val="24"/>
+        </w:rPr>
+        <w:t xml:space="preserve"> = −0.3), adoption must reach 89%, which occurs between 2031 and 2034 for the average firm under fast and medium diffusion and between 2029 and 2031 in media-related sectors, and not within the horizon under slow diffusion. If demand falls by 10% (</w:t>
+      </w:r>
+      <w:r>
+        <w:rPr>
+          <w:rFonts w:ascii="Times New Roman" w:cs="Times New Roman" w:eastAsia="Times New Roman" w:hAnsi="Times New Roman"/>
+          <w:i/>
+          <w:iCs/>
+          <w:sz w:val="24"/>
+          <w:szCs w:val="24"/>
+        </w:rPr>
+        <w:t xml:space="preserve">β</w:t>
+      </w:r>
+      <w:r>
+        <w:rPr>
+          <w:rFonts w:ascii="Times New Roman" w:cs="Times New Roman" w:eastAsia="Times New Roman" w:hAnsi="Times New Roman"/>
+          <w:sz w:val="24"/>
+          <w:szCs w:val="24"/>
+        </w:rPr>
+        <w:t xml:space="preserve"> = −0.1), the threshold would require adoption above 100%: such an effect would not be detectable with this design at any adoption level. If demand among adopters fell by 55% (</w:t>
+      </w:r>
+      <w:r>
+        <w:rPr>
+          <w:rFonts w:ascii="Times New Roman" w:cs="Times New Roman" w:eastAsia="Times New Roman" w:hAnsi="Times New Roman"/>
+          <w:i/>
+          <w:iCs/>
+          <w:sz w:val="24"/>
+          <w:szCs w:val="24"/>
+        </w:rPr>
+        <w:t xml:space="preserve">β</w:t>
+      </w:r>
+      <w:r>
+        <w:rPr>
+          <w:rFonts w:ascii="Times New Roman" w:cs="Times New Roman" w:eastAsia="Times New Roman" w:hAnsi="Times New Roman"/>
+          <w:sz w:val="24"/>
+          <w:szCs w:val="24"/>
+        </w:rPr>
+        <w:t xml:space="preserve"> = −0.8), detection would occur in 2028 to 2032 for the average firm and already in 2025 in media-related sectors. The present UK coefficient for 2026 (−0.033) is at the detection threshold, so it is consistent either with such a large effect among adopters in a high-adoption sector or with a decline that is not caused by adoption, as Section 6.7 suggests.</w:t>
+      </w:r>
+    </w:p>
+    <w:p>
+      <w:pPr>
+        <w:keepNext/>
+        <w:spacing w:after="80" w:before="240" w:line="240" w:lineRule="auto"/>
+        <w:jc w:val="center"/>
+      </w:pPr>
+      <w:r>
+        <w:rPr>
+          <w:rFonts w:ascii="Times New Roman" w:cs="Times New Roman" w:eastAsia="Times New Roman" w:hAnsi="Times New Roman"/>
+          <w:b/>
+          <w:bCs/>
+          <w:sz w:val="22"/>
+          <w:szCs w:val="22"/>
+        </w:rPr>
+        <w:t xml:space="preserve">Table 10.</w:t>
+      </w:r>
+      <w:r>
+        <w:rPr>
+          <w:rFonts w:ascii="Times New Roman" w:cs="Times New Roman" w:eastAsia="Times New Roman" w:hAnsi="Times New Roman"/>
+          <w:sz w:val="22"/>
+          <w:szCs w:val="22"/>
+        </w:rPr>
+        <w:t xml:space="preserve"> Adoption needed for detectability and first year of detectability by scenario</w:t>
+      </w:r>
+    </w:p>
+    <w:tbl>
+      <w:tblPr>
+        <w:tblW w:type="dxa" w:w="9360"/>
+        <w:tblBorders>
+          <w:top w:val="single" w:color="auto" w:sz="4"/>
+          <w:left w:val="single" w:color="auto" w:sz="4"/>
+          <w:bottom w:val="single" w:color="auto" w:sz="4"/>
+          <w:right w:val="single" w:color="auto" w:sz="4"/>
+          <w:insideH w:val="single" w:color="auto" w:sz="4"/>
+          <w:insideV w:val="single" w:color="auto" w:sz="4"/>
+        </w:tblBorders>
+      </w:tblPr>
+      <w:tblGrid>
+        <w:gridCol w:w="2960"/>
+        <w:gridCol w:w="1600"/>
+        <w:gridCol w:w="1600"/>
+        <w:gridCol w:w="1600"/>
+        <w:gridCol w:w="1600"/>
+      </w:tblGrid>
+      <w:tr>
+        <w:trPr>
+          <w:cantSplit/>
+          <w:tblHeader/>
+        </w:trPr>
+        <w:tc>
+          <w:tcPr>
+            <w:tcW w:type="dxa" w:w="2960"/>
+            <w:tcBorders>
+              <w:top w:val="single" w:color="000000" w:sz="4"/>
+              <w:left w:val="none" w:color="FFFFFF" w:sz="0"/>
+              <w:bottom w:val="single" w:color="000000" w:sz="4"/>
+              <w:right w:val="none" w:color="FFFFFF" w:sz="0"/>
+            </w:tcBorders>
+            <w:shd w:fill="EDEDED" w:color="auto" w:val="clear"/>
+            <w:tcMar>
+              <w:top w:type="dxa" w:w="50"/>
+              <w:left w:type="dxa" w:w="90"/>
+              <w:bottom w:type="dxa" w:w="50"/>
+              <w:right w:type="dxa" w:w="90"/>
+            </w:tcMar>
+          </w:tcPr>
+          <w:p>
+            <w:pPr>
+              <w:spacing w:line="240" w:lineRule="auto"/>
+            </w:pPr>
+            <w:r>
+              <w:rPr>
+                <w:rFonts w:ascii="Times New Roman" w:cs="Times New Roman" w:eastAsia="Times New Roman" w:hAnsi="Times New Roman"/>
+                <w:b/>
+                <w:bCs/>
+                <w:sz w:val="20"/>
+                <w:szCs w:val="20"/>
+              </w:rPr>
+              <w:t xml:space="preserve">Effect among adopters β (demand change)</w:t>
+            </w:r>
+          </w:p>
+        </w:tc>
+        <w:tc>
+          <w:tcPr>
+            <w:tcW w:type="dxa" w:w="1600"/>
+            <w:tcBorders>
+              <w:top w:val="single" w:color="000000" w:sz="4"/>
+              <w:left w:val="none" w:color="FFFFFF" w:sz="0"/>
+              <w:bottom w:val="single" w:color="000000" w:sz="4"/>
+              <w:right w:val="none" w:color="FFFFFF" w:sz="0"/>
+            </w:tcBorders>
+            <w:shd w:fill="EDEDED" w:color="auto" w:val="clear"/>
+            <w:tcMar>
+              <w:top w:type="dxa" w:w="50"/>
+              <w:left w:type="dxa" w:w="90"/>
+              <w:bottom w:type="dxa" w:w="50"/>
+              <w:right w:type="dxa" w:w="90"/>
+            </w:tcMar>
+          </w:tcPr>
+          <w:p>
+            <w:pPr>
+              <w:spacing w:line="240" w:lineRule="auto"/>
+            </w:pPr>
+            <w:r>
+              <w:rPr>
+                <w:rFonts w:ascii="Times New Roman" w:cs="Times New Roman" w:eastAsia="Times New Roman" w:hAnsi="Times New Roman"/>
+                <w:b/>
+                <w:bCs/>
+                <w:sz w:val="20"/>
+                <w:szCs w:val="20"/>
+              </w:rPr>
+              <w:t xml:space="preserve">Adoption needed</w:t>
+            </w:r>
+          </w:p>
+        </w:tc>
+        <w:tc>
+          <w:tcPr>
+            <w:tcW w:type="dxa" w:w="1600"/>
+            <w:tcBorders>
+              <w:top w:val="single" w:color="000000" w:sz="4"/>
+              <w:left w:val="none" w:color="FFFFFF" w:sz="0"/>
+              <w:bottom w:val="single" w:color="000000" w:sz="4"/>
+              <w:right w:val="none" w:color="FFFFFF" w:sz="0"/>
+            </w:tcBorders>
+            <w:shd w:fill="EDEDED" w:color="auto" w:val="clear"/>
+            <w:tcMar>
+              <w:top w:type="dxa" w:w="50"/>
+              <w:left w:type="dxa" w:w="90"/>
+              <w:bottom w:type="dxa" w:w="50"/>
+              <w:right w:type="dxa" w:w="90"/>
+            </w:tcMar>
+          </w:tcPr>
+          <w:p>
+            <w:pPr>
+              <w:spacing w:line="240" w:lineRule="auto"/>
+            </w:pPr>
+            <w:r>
+              <w:rPr>
+                <w:rFonts w:ascii="Times New Roman" w:cs="Times New Roman" w:eastAsia="Times New Roman" w:hAnsi="Times New Roman"/>
+                <w:b/>
+                <w:bCs/>
+                <w:sz w:val="20"/>
+                <w:szCs w:val="20"/>
+              </w:rPr>
+              <w:t xml:space="preserve">Fast diffusion (all firms / media)</w:t>
+            </w:r>
+          </w:p>
+        </w:tc>
+        <w:tc>
+          <w:tcPr>
+            <w:tcW w:type="dxa" w:w="1600"/>
+            <w:tcBorders>
+              <w:top w:val="single" w:color="000000" w:sz="4"/>
+              <w:left w:val="none" w:color="FFFFFF" w:sz="0"/>
+              <w:bottom w:val="single" w:color="000000" w:sz="4"/>
+              <w:right w:val="none" w:color="FFFFFF" w:sz="0"/>
+            </w:tcBorders>
+            <w:shd w:fill="EDEDED" w:color="auto" w:val="clear"/>
+            <w:tcMar>
+              <w:top w:type="dxa" w:w="50"/>
+              <w:left w:type="dxa" w:w="90"/>
+              <w:bottom w:type="dxa" w:w="50"/>
+              <w:right w:type="dxa" w:w="90"/>
+            </w:tcMar>
+          </w:tcPr>
+          <w:p>
+            <w:pPr>
+              <w:spacing w:line="240" w:lineRule="auto"/>
+            </w:pPr>
+            <w:r>
+              <w:rPr>
+                <w:rFonts w:ascii="Times New Roman" w:cs="Times New Roman" w:eastAsia="Times New Roman" w:hAnsi="Times New Roman"/>
+                <w:b/>
+                <w:bCs/>
+                <w:sz w:val="20"/>
+                <w:szCs w:val="20"/>
+              </w:rPr>
+              <w:t xml:space="preserve">Medium diffusion (all firms / media)</w:t>
+            </w:r>
+          </w:p>
+        </w:tc>
+        <w:tc>
+          <w:tcPr>
+            <w:tcW w:type="dxa" w:w="1600"/>
+            <w:tcBorders>
+              <w:top w:val="single" w:color="000000" w:sz="4"/>
+              <w:left w:val="none" w:color="FFFFFF" w:sz="0"/>
+              <w:bottom w:val="single" w:color="000000" w:sz="4"/>
+              <w:right w:val="none" w:color="FFFFFF" w:sz="0"/>
+            </w:tcBorders>
+            <w:shd w:fill="EDEDED" w:color="auto" w:val="clear"/>
+            <w:tcMar>
+              <w:top w:type="dxa" w:w="50"/>
+              <w:left w:type="dxa" w:w="90"/>
+              <w:bottom w:type="dxa" w:w="50"/>
+              <w:right w:type="dxa" w:w="90"/>
+            </w:tcMar>
+          </w:tcPr>
+          <w:p>
+            <w:pPr>
+              <w:spacing w:line="240" w:lineRule="auto"/>
+            </w:pPr>
+            <w:r>
+              <w:rPr>
+                <w:rFonts w:ascii="Times New Roman" w:cs="Times New Roman" w:eastAsia="Times New Roman" w:hAnsi="Times New Roman"/>
+                <w:b/>
+                <w:bCs/>
+                <w:sz w:val="20"/>
+                <w:szCs w:val="20"/>
+              </w:rPr>
+              <w:t xml:space="preserve">Slow diffusion (all firms / media)</w:t>
+            </w:r>
+          </w:p>
+        </w:tc>
+      </w:tr>
+      <w:tr>
+        <w:trPr>
+          <w:cantSplit/>
+          <w:tblHeader w:val="false"/>
+        </w:trPr>
+        <w:tc>
+          <w:tcPr>
+            <w:tcW w:type="dxa" w:w="2960"/>
+            <w:tcBorders>
+              <w:top w:val="none" w:color="FFFFFF" w:sz="0"/>
+              <w:left w:val="none" w:color="FFFFFF" w:sz="0"/>
+              <w:bottom w:val="none" w:color="FFFFFF" w:sz="0"/>
+              <w:right w:val="none" w:color="FFFFFF" w:sz="0"/>
+            </w:tcBorders>
+            <w:tcMar>
+              <w:top w:type="dxa" w:w="50"/>
+              <w:left w:type="dxa" w:w="90"/>
+              <w:bottom w:type="dxa" w:w="50"/>
+              <w:right w:type="dxa" w:w="90"/>
+            </w:tcMar>
+          </w:tcPr>
+          <w:p>
+            <w:pPr>
+              <w:spacing w:line="240" w:lineRule="auto"/>
+            </w:pPr>
+            <w:r>
+              <w:rPr>
+                <w:rFonts w:ascii="Times New Roman" w:cs="Times New Roman" w:eastAsia="Times New Roman" w:hAnsi="Times New Roman"/>
+                <w:b w:val="false"/>
+                <w:bCs w:val="false"/>
+                <w:sz w:val="20"/>
+                <w:szCs w:val="20"/>
+              </w:rPr>
+              <w:t xml:space="preserve">−0.1 (−10%)</w:t>
+            </w:r>
+          </w:p>
+        </w:tc>
+        <w:tc>
+          <w:tcPr>
+            <w:tcW w:type="dxa" w:w="1600"/>
+            <w:tcBorders>
+              <w:top w:val="none" w:color="FFFFFF" w:sz="0"/>
+              <w:left w:val="none" w:color="FFFFFF" w:sz="0"/>
+              <w:bottom w:val="none" w:color="FFFFFF" w:sz="0"/>
+              <w:right w:val="none" w:color="FFFFFF" w:sz="0"/>
+            </w:tcBorders>
+            <w:tcMar>
+              <w:top w:type="dxa" w:w="50"/>
+              <w:left w:type="dxa" w:w="90"/>
+              <w:bottom w:type="dxa" w:w="50"/>
+              <w:right w:type="dxa" w:w="90"/>
+            </w:tcMar>
+          </w:tcPr>
+          <w:p>
+            <w:pPr>
+              <w:spacing w:line="240" w:lineRule="auto"/>
+            </w:pPr>
+            <w:r>
+              <w:rPr>
+                <w:rFonts w:ascii="Times New Roman" w:cs="Times New Roman" w:eastAsia="Times New Roman" w:hAnsi="Times New Roman"/>
+                <w:b w:val="false"/>
+                <w:bCs w:val="false"/>
+                <w:sz w:val="20"/>
+                <w:szCs w:val="20"/>
+              </w:rPr>
+              <w:t xml:space="preserve">above 100%</w:t>
+            </w:r>
+          </w:p>
+        </w:tc>
+        <w:tc>
+          <w:tcPr>
+            <w:tcW w:type="dxa" w:w="1600"/>
+            <w:tcBorders>
+              <w:top w:val="none" w:color="FFFFFF" w:sz="0"/>
+              <w:left w:val="none" w:color="FFFFFF" w:sz="0"/>
+              <w:bottom w:val="none" w:color="FFFFFF" w:sz="0"/>
+              <w:right w:val="none" w:color="FFFFFF" w:sz="0"/>
+            </w:tcBorders>
+            <w:tcMar>
+              <w:top w:type="dxa" w:w="50"/>
+              <w:left w:type="dxa" w:w="90"/>
+              <w:bottom w:type="dxa" w:w="50"/>
+              <w:right w:type="dxa" w:w="90"/>
+            </w:tcMar>
+          </w:tcPr>
+          <w:p>
+            <w:pPr>
+              <w:spacing w:line="240" w:lineRule="auto"/>
+            </w:pPr>
+            <w:r>
+              <w:rPr>
+                <w:rFonts w:ascii="Times New Roman" w:cs="Times New Roman" w:eastAsia="Times New Roman" w:hAnsi="Times New Roman"/>
+                <w:b w:val="false"/>
+                <w:bCs w:val="false"/>
+                <w:sz w:val="20"/>
+                <w:szCs w:val="20"/>
+              </w:rPr>
+              <w:t xml:space="preserve">not detectable / not detectable</w:t>
+            </w:r>
+          </w:p>
+        </w:tc>
+        <w:tc>
+          <w:tcPr>
+            <w:tcW w:type="dxa" w:w="1600"/>
+            <w:tcBorders>
+              <w:top w:val="none" w:color="FFFFFF" w:sz="0"/>
+              <w:left w:val="none" w:color="FFFFFF" w:sz="0"/>
+              <w:bottom w:val="none" w:color="FFFFFF" w:sz="0"/>
+              <w:right w:val="none" w:color="FFFFFF" w:sz="0"/>
+            </w:tcBorders>
+            <w:tcMar>
+              <w:top w:type="dxa" w:w="50"/>
+              <w:left w:type="dxa" w:w="90"/>
+              <w:bottom w:type="dxa" w:w="50"/>
+              <w:right w:type="dxa" w:w="90"/>
+            </w:tcMar>
+          </w:tcPr>
+          <w:p>
+            <w:pPr>
+              <w:spacing w:line="240" w:lineRule="auto"/>
+            </w:pPr>
+            <w:r>
+              <w:rPr>
+                <w:rFonts w:ascii="Times New Roman" w:cs="Times New Roman" w:eastAsia="Times New Roman" w:hAnsi="Times New Roman"/>
+                <w:b w:val="false"/>
+                <w:bCs w:val="false"/>
+                <w:sz w:val="20"/>
+                <w:szCs w:val="20"/>
+              </w:rPr>
+              <w:t xml:space="preserve">not detectable / not detectable</w:t>
+            </w:r>
+          </w:p>
+        </w:tc>
+        <w:tc>
+          <w:tcPr>
+            <w:tcW w:type="dxa" w:w="1600"/>
+            <w:tcBorders>
+              <w:top w:val="none" w:color="FFFFFF" w:sz="0"/>
+              <w:left w:val="none" w:color="FFFFFF" w:sz="0"/>
+              <w:bottom w:val="none" w:color="FFFFFF" w:sz="0"/>
+              <w:right w:val="none" w:color="FFFFFF" w:sz="0"/>
+            </w:tcBorders>
+            <w:tcMar>
+              <w:top w:type="dxa" w:w="50"/>
+              <w:left w:type="dxa" w:w="90"/>
+              <w:bottom w:type="dxa" w:w="50"/>
+              <w:right w:type="dxa" w:w="90"/>
+            </w:tcMar>
+          </w:tcPr>
+          <w:p>
+            <w:pPr>
+              <w:spacing w:line="240" w:lineRule="auto"/>
+            </w:pPr>
+            <w:r>
+              <w:rPr>
+                <w:rFonts w:ascii="Times New Roman" w:cs="Times New Roman" w:eastAsia="Times New Roman" w:hAnsi="Times New Roman"/>
+                <w:b w:val="false"/>
+                <w:bCs w:val="false"/>
+                <w:sz w:val="20"/>
+                <w:szCs w:val="20"/>
+              </w:rPr>
+              <w:t xml:space="preserve">not detectable / not detectable</w:t>
+            </w:r>
+          </w:p>
+        </w:tc>
+      </w:tr>
+      <w:tr>
+        <w:trPr>
+          <w:cantSplit/>
+          <w:tblHeader w:val="false"/>
+        </w:trPr>
+        <w:tc>
+          <w:tcPr>
+            <w:tcW w:type="dxa" w:w="2960"/>
+            <w:tcBorders>
+              <w:top w:val="none" w:color="FFFFFF" w:sz="0"/>
+              <w:left w:val="none" w:color="FFFFFF" w:sz="0"/>
+              <w:bottom w:val="none" w:color="FFFFFF" w:sz="0"/>
+              <w:right w:val="none" w:color="FFFFFF" w:sz="0"/>
+            </w:tcBorders>
+            <w:tcMar>
+              <w:top w:type="dxa" w:w="50"/>
+              <w:left w:type="dxa" w:w="90"/>
+              <w:bottom w:type="dxa" w:w="50"/>
+              <w:right w:type="dxa" w:w="90"/>
+            </w:tcMar>
+          </w:tcPr>
+          <w:p>
+            <w:pPr>
+              <w:spacing w:line="240" w:lineRule="auto"/>
+            </w:pPr>
+            <w:r>
+              <w:rPr>
+                <w:rFonts w:ascii="Times New Roman" w:cs="Times New Roman" w:eastAsia="Times New Roman" w:hAnsi="Times New Roman"/>
+                <w:b w:val="false"/>
+                <w:bCs w:val="false"/>
+                <w:sz w:val="20"/>
+                <w:szCs w:val="20"/>
+              </w:rPr>
+              <w:t xml:space="preserve">−0.3 (−26%)</w:t>
+            </w:r>
+          </w:p>
+        </w:tc>
+        <w:tc>
+          <w:tcPr>
+            <w:tcW w:type="dxa" w:w="1600"/>
+            <w:tcBorders>
+              <w:top w:val="none" w:color="FFFFFF" w:sz="0"/>
+              <w:left w:val="none" w:color="FFFFFF" w:sz="0"/>
+              <w:bottom w:val="none" w:color="FFFFFF" w:sz="0"/>
+              <w:right w:val="none" w:color="FFFFFF" w:sz="0"/>
+            </w:tcBorders>
+            <w:tcMar>
+              <w:top w:type="dxa" w:w="50"/>
+              <w:left w:type="dxa" w:w="90"/>
+              <w:bottom w:type="dxa" w:w="50"/>
+              <w:right w:type="dxa" w:w="90"/>
+            </w:tcMar>
+          </w:tcPr>
+          <w:p>
+            <w:pPr>
+              <w:spacing w:line="240" w:lineRule="auto"/>
+            </w:pPr>
+            <w:r>
+              <w:rPr>
+                <w:rFonts w:ascii="Times New Roman" w:cs="Times New Roman" w:eastAsia="Times New Roman" w:hAnsi="Times New Roman"/>
+                <w:b w:val="false"/>
+                <w:bCs w:val="false"/>
+                <w:sz w:val="20"/>
+                <w:szCs w:val="20"/>
+              </w:rPr>
+              <w:t xml:space="preserve">89%</w:t>
+            </w:r>
+          </w:p>
+        </w:tc>
+        <w:tc>
+          <w:tcPr>
+            <w:tcW w:type="dxa" w:w="1600"/>
+            <w:tcBorders>
+              <w:top w:val="none" w:color="FFFFFF" w:sz="0"/>
+              <w:left w:val="none" w:color="FFFFFF" w:sz="0"/>
+              <w:bottom w:val="none" w:color="FFFFFF" w:sz="0"/>
+              <w:right w:val="none" w:color="FFFFFF" w:sz="0"/>
+            </w:tcBorders>
+            <w:tcMar>
+              <w:top w:type="dxa" w:w="50"/>
+              <w:left w:type="dxa" w:w="90"/>
+              <w:bottom w:type="dxa" w:w="50"/>
+              <w:right w:type="dxa" w:w="90"/>
+            </w:tcMar>
+          </w:tcPr>
+          <w:p>
+            <w:pPr>
+              <w:spacing w:line="240" w:lineRule="auto"/>
+            </w:pPr>
+            <w:r>
+              <w:rPr>
+                <w:rFonts w:ascii="Times New Roman" w:cs="Times New Roman" w:eastAsia="Times New Roman" w:hAnsi="Times New Roman"/>
+                <w:b w:val="false"/>
+                <w:bCs w:val="false"/>
+                <w:sz w:val="20"/>
+                <w:szCs w:val="20"/>
+              </w:rPr>
+              <w:t xml:space="preserve">2031 / 2029</w:t>
+            </w:r>
+          </w:p>
+        </w:tc>
+        <w:tc>
+          <w:tcPr>
+            <w:tcW w:type="dxa" w:w="1600"/>
+            <w:tcBorders>
+              <w:top w:val="none" w:color="FFFFFF" w:sz="0"/>
+              <w:left w:val="none" w:color="FFFFFF" w:sz="0"/>
+              <w:bottom w:val="none" w:color="FFFFFF" w:sz="0"/>
+              <w:right w:val="none" w:color="FFFFFF" w:sz="0"/>
+            </w:tcBorders>
+            <w:tcMar>
+              <w:top w:type="dxa" w:w="50"/>
+              <w:left w:type="dxa" w:w="90"/>
+              <w:bottom w:type="dxa" w:w="50"/>
+              <w:right w:type="dxa" w:w="90"/>
+            </w:tcMar>
+          </w:tcPr>
+          <w:p>
+            <w:pPr>
+              <w:spacing w:line="240" w:lineRule="auto"/>
+            </w:pPr>
+            <w:r>
+              <w:rPr>
+                <w:rFonts w:ascii="Times New Roman" w:cs="Times New Roman" w:eastAsia="Times New Roman" w:hAnsi="Times New Roman"/>
+                <w:b w:val="false"/>
+                <w:bCs w:val="false"/>
+                <w:sz w:val="20"/>
+                <w:szCs w:val="20"/>
+              </w:rPr>
+              <w:t xml:space="preserve">2034 / 2031</w:t>
+            </w:r>
+          </w:p>
+        </w:tc>
+        <w:tc>
+          <w:tcPr>
+            <w:tcW w:type="dxa" w:w="1600"/>
+            <w:tcBorders>
+              <w:top w:val="none" w:color="FFFFFF" w:sz="0"/>
+              <w:left w:val="none" w:color="FFFFFF" w:sz="0"/>
+              <w:bottom w:val="none" w:color="FFFFFF" w:sz="0"/>
+              <w:right w:val="none" w:color="FFFFFF" w:sz="0"/>
+            </w:tcBorders>
+            <w:tcMar>
+              <w:top w:type="dxa" w:w="50"/>
+              <w:left w:type="dxa" w:w="90"/>
+              <w:bottom w:type="dxa" w:w="50"/>
+              <w:right w:type="dxa" w:w="90"/>
+            </w:tcMar>
+          </w:tcPr>
+          <w:p>
+            <w:pPr>
+              <w:spacing w:line="240" w:lineRule="auto"/>
+            </w:pPr>
+            <w:r>
+              <w:rPr>
+                <w:rFonts w:ascii="Times New Roman" w:cs="Times New Roman" w:eastAsia="Times New Roman" w:hAnsi="Times New Roman"/>
+                <w:b w:val="false"/>
+                <w:bCs w:val="false"/>
+                <w:sz w:val="20"/>
+                <w:szCs w:val="20"/>
+              </w:rPr>
+              <w:t xml:space="preserve">after 2035 / after 2035</w:t>
+            </w:r>
+          </w:p>
+        </w:tc>
+      </w:tr>
+      <w:tr>
+        <w:trPr>
+          <w:cantSplit/>
+          <w:tblHeader w:val="false"/>
+        </w:trPr>
+        <w:tc>
+          <w:tcPr>
+            <w:tcW w:type="dxa" w:w="2960"/>
+            <w:tcBorders>
+              <w:top w:val="none" w:color="FFFFFF" w:sz="0"/>
+              <w:left w:val="none" w:color="FFFFFF" w:sz="0"/>
+              <w:bottom w:val="none" w:color="FFFFFF" w:sz="0"/>
+              <w:right w:val="none" w:color="FFFFFF" w:sz="0"/>
+            </w:tcBorders>
+            <w:tcMar>
+              <w:top w:type="dxa" w:w="50"/>
+              <w:left w:type="dxa" w:w="90"/>
+              <w:bottom w:type="dxa" w:w="50"/>
+              <w:right w:type="dxa" w:w="90"/>
+            </w:tcMar>
+          </w:tcPr>
+          <w:p>
+            <w:pPr>
+              <w:spacing w:line="240" w:lineRule="auto"/>
+            </w:pPr>
+            <w:r>
+              <w:rPr>
+                <w:rFonts w:ascii="Times New Roman" w:cs="Times New Roman" w:eastAsia="Times New Roman" w:hAnsi="Times New Roman"/>
+                <w:b w:val="false"/>
+                <w:bCs w:val="false"/>
+                <w:sz w:val="20"/>
+                <w:szCs w:val="20"/>
+              </w:rPr>
+              <w:t xml:space="preserve">−0.5 (−39%)</w:t>
+            </w:r>
+          </w:p>
+        </w:tc>
+        <w:tc>
+          <w:tcPr>
+            <w:tcW w:type="dxa" w:w="1600"/>
+            <w:tcBorders>
+              <w:top w:val="none" w:color="FFFFFF" w:sz="0"/>
+              <w:left w:val="none" w:color="FFFFFF" w:sz="0"/>
+              <w:bottom w:val="none" w:color="FFFFFF" w:sz="0"/>
+              <w:right w:val="none" w:color="FFFFFF" w:sz="0"/>
+            </w:tcBorders>
+            <w:tcMar>
+              <w:top w:type="dxa" w:w="50"/>
+              <w:left w:type="dxa" w:w="90"/>
+              <w:bottom w:type="dxa" w:w="50"/>
+              <w:right w:type="dxa" w:w="90"/>
+            </w:tcMar>
+          </w:tcPr>
+          <w:p>
+            <w:pPr>
+              <w:spacing w:line="240" w:lineRule="auto"/>
+            </w:pPr>
+            <w:r>
+              <w:rPr>
+                <w:rFonts w:ascii="Times New Roman" w:cs="Times New Roman" w:eastAsia="Times New Roman" w:hAnsi="Times New Roman"/>
+                <w:b w:val="false"/>
+                <w:bCs w:val="false"/>
+                <w:sz w:val="20"/>
+                <w:szCs w:val="20"/>
+              </w:rPr>
+              <w:t xml:space="preserve">53%</w:t>
+            </w:r>
+          </w:p>
+        </w:tc>
+        <w:tc>
+          <w:tcPr>
+            <w:tcW w:type="dxa" w:w="1600"/>
+            <w:tcBorders>
+              <w:top w:val="none" w:color="FFFFFF" w:sz="0"/>
+              <w:left w:val="none" w:color="FFFFFF" w:sz="0"/>
+              <w:bottom w:val="none" w:color="FFFFFF" w:sz="0"/>
+              <w:right w:val="none" w:color="FFFFFF" w:sz="0"/>
+            </w:tcBorders>
+            <w:tcMar>
+              <w:top w:type="dxa" w:w="50"/>
+              <w:left w:type="dxa" w:w="90"/>
+              <w:bottom w:type="dxa" w:w="50"/>
+              <w:right w:type="dxa" w:w="90"/>
+            </w:tcMar>
+          </w:tcPr>
+          <w:p>
+            <w:pPr>
+              <w:spacing w:line="240" w:lineRule="auto"/>
+            </w:pPr>
+            <w:r>
+              <w:rPr>
+                <w:rFonts w:ascii="Times New Roman" w:cs="Times New Roman" w:eastAsia="Times New Roman" w:hAnsi="Times New Roman"/>
+                <w:b w:val="false"/>
+                <w:bCs w:val="false"/>
+                <w:sz w:val="20"/>
+                <w:szCs w:val="20"/>
+              </w:rPr>
+              <w:t xml:space="preserve">2029 / 2026</w:t>
+            </w:r>
+          </w:p>
+        </w:tc>
+        <w:tc>
+          <w:tcPr>
+            <w:tcW w:type="dxa" w:w="1600"/>
+            <w:tcBorders>
+              <w:top w:val="none" w:color="FFFFFF" w:sz="0"/>
+              <w:left w:val="none" w:color="FFFFFF" w:sz="0"/>
+              <w:bottom w:val="none" w:color="FFFFFF" w:sz="0"/>
+              <w:right w:val="none" w:color="FFFFFF" w:sz="0"/>
+            </w:tcBorders>
+            <w:tcMar>
+              <w:top w:type="dxa" w:w="50"/>
+              <w:left w:type="dxa" w:w="90"/>
+              <w:bottom w:type="dxa" w:w="50"/>
+              <w:right w:type="dxa" w:w="90"/>
+            </w:tcMar>
+          </w:tcPr>
+          <w:p>
+            <w:pPr>
+              <w:spacing w:line="240" w:lineRule="auto"/>
+            </w:pPr>
+            <w:r>
+              <w:rPr>
+                <w:rFonts w:ascii="Times New Roman" w:cs="Times New Roman" w:eastAsia="Times New Roman" w:hAnsi="Times New Roman"/>
+                <w:b w:val="false"/>
+                <w:bCs w:val="false"/>
+                <w:sz w:val="20"/>
+                <w:szCs w:val="20"/>
+              </w:rPr>
+              <w:t xml:space="preserve">2030 / 2027</w:t>
+            </w:r>
+          </w:p>
+        </w:tc>
+        <w:tc>
+          <w:tcPr>
+            <w:tcW w:type="dxa" w:w="1600"/>
+            <w:tcBorders>
+              <w:top w:val="none" w:color="FFFFFF" w:sz="0"/>
+              <w:left w:val="none" w:color="FFFFFF" w:sz="0"/>
+              <w:bottom w:val="none" w:color="FFFFFF" w:sz="0"/>
+              <w:right w:val="none" w:color="FFFFFF" w:sz="0"/>
+            </w:tcBorders>
+            <w:tcMar>
+              <w:top w:type="dxa" w:w="50"/>
+              <w:left w:type="dxa" w:w="90"/>
+              <w:bottom w:type="dxa" w:w="50"/>
+              <w:right w:type="dxa" w:w="90"/>
+            </w:tcMar>
+          </w:tcPr>
+          <w:p>
+            <w:pPr>
+              <w:spacing w:line="240" w:lineRule="auto"/>
+            </w:pPr>
+            <w:r>
+              <w:rPr>
+                <w:rFonts w:ascii="Times New Roman" w:cs="Times New Roman" w:eastAsia="Times New Roman" w:hAnsi="Times New Roman"/>
+                <w:b w:val="false"/>
+                <w:bCs w:val="false"/>
+                <w:sz w:val="20"/>
+                <w:szCs w:val="20"/>
+              </w:rPr>
+              <w:t xml:space="preserve">2035 / 2028</w:t>
+            </w:r>
+          </w:p>
+        </w:tc>
+      </w:tr>
+      <w:tr>
+        <w:trPr>
+          <w:cantSplit/>
+          <w:tblHeader w:val="false"/>
+        </w:trPr>
+        <w:tc>
+          <w:tcPr>
+            <w:tcW w:type="dxa" w:w="2960"/>
+            <w:tcBorders>
+              <w:top w:val="none" w:color="FFFFFF" w:sz="0"/>
+              <w:left w:val="none" w:color="FFFFFF" w:sz="0"/>
+              <w:bottom w:val="single" w:color="000000" w:sz="4"/>
+              <w:right w:val="none" w:color="FFFFFF" w:sz="0"/>
+            </w:tcBorders>
+            <w:tcMar>
+              <w:top w:type="dxa" w:w="50"/>
+              <w:left w:type="dxa" w:w="90"/>
+              <w:bottom w:type="dxa" w:w="50"/>
+              <w:right w:type="dxa" w:w="90"/>
+            </w:tcMar>
+          </w:tcPr>
+          <w:p>
+            <w:pPr>
+              <w:spacing w:line="240" w:lineRule="auto"/>
+            </w:pPr>
+            <w:r>
+              <w:rPr>
+                <w:rFonts w:ascii="Times New Roman" w:cs="Times New Roman" w:eastAsia="Times New Roman" w:hAnsi="Times New Roman"/>
+                <w:b w:val="false"/>
+                <w:bCs w:val="false"/>
+                <w:sz w:val="20"/>
+                <w:szCs w:val="20"/>
+              </w:rPr>
+              <w:t xml:space="preserve">−0.8 (−55%)</w:t>
+            </w:r>
+          </w:p>
+        </w:tc>
+        <w:tc>
+          <w:tcPr>
+            <w:tcW w:type="dxa" w:w="1600"/>
+            <w:tcBorders>
+              <w:top w:val="none" w:color="FFFFFF" w:sz="0"/>
+              <w:left w:val="none" w:color="FFFFFF" w:sz="0"/>
+              <w:bottom w:val="single" w:color="000000" w:sz="4"/>
+              <w:right w:val="none" w:color="FFFFFF" w:sz="0"/>
+            </w:tcBorders>
+            <w:tcMar>
+              <w:top w:type="dxa" w:w="50"/>
+              <w:left w:type="dxa" w:w="90"/>
+              <w:bottom w:type="dxa" w:w="50"/>
+              <w:right w:type="dxa" w:w="90"/>
+            </w:tcMar>
+          </w:tcPr>
+          <w:p>
+            <w:pPr>
+              <w:spacing w:line="240" w:lineRule="auto"/>
+            </w:pPr>
+            <w:r>
+              <w:rPr>
+                <w:rFonts w:ascii="Times New Roman" w:cs="Times New Roman" w:eastAsia="Times New Roman" w:hAnsi="Times New Roman"/>
+                <w:b w:val="false"/>
+                <w:bCs w:val="false"/>
+                <w:sz w:val="20"/>
+                <w:szCs w:val="20"/>
+              </w:rPr>
+              <w:t xml:space="preserve">33%</w:t>
+            </w:r>
+          </w:p>
+        </w:tc>
+        <w:tc>
+          <w:tcPr>
+            <w:tcW w:type="dxa" w:w="1600"/>
+            <w:tcBorders>
+              <w:top w:val="none" w:color="FFFFFF" w:sz="0"/>
+              <w:left w:val="none" w:color="FFFFFF" w:sz="0"/>
+              <w:bottom w:val="single" w:color="000000" w:sz="4"/>
+              <w:right w:val="none" w:color="FFFFFF" w:sz="0"/>
+            </w:tcBorders>
+            <w:tcMar>
+              <w:top w:type="dxa" w:w="50"/>
+              <w:left w:type="dxa" w:w="90"/>
+              <w:bottom w:type="dxa" w:w="50"/>
+              <w:right w:type="dxa" w:w="90"/>
+            </w:tcMar>
+          </w:tcPr>
+          <w:p>
+            <w:pPr>
+              <w:spacing w:line="240" w:lineRule="auto"/>
+            </w:pPr>
+            <w:r>
+              <w:rPr>
+                <w:rFonts w:ascii="Times New Roman" w:cs="Times New Roman" w:eastAsia="Times New Roman" w:hAnsi="Times New Roman"/>
+                <w:b w:val="false"/>
+                <w:bCs w:val="false"/>
+                <w:sz w:val="20"/>
+                <w:szCs w:val="20"/>
+              </w:rPr>
+              <w:t xml:space="preserve">2028 / 2025</w:t>
+            </w:r>
+          </w:p>
+        </w:tc>
+        <w:tc>
+          <w:tcPr>
+            <w:tcW w:type="dxa" w:w="1600"/>
+            <w:tcBorders>
+              <w:top w:val="none" w:color="FFFFFF" w:sz="0"/>
+              <w:left w:val="none" w:color="FFFFFF" w:sz="0"/>
+              <w:bottom w:val="single" w:color="000000" w:sz="4"/>
+              <w:right w:val="none" w:color="FFFFFF" w:sz="0"/>
+            </w:tcBorders>
+            <w:tcMar>
+              <w:top w:type="dxa" w:w="50"/>
+              <w:left w:type="dxa" w:w="90"/>
+              <w:bottom w:type="dxa" w:w="50"/>
+              <w:right w:type="dxa" w:w="90"/>
+            </w:tcMar>
+          </w:tcPr>
+          <w:p>
+            <w:pPr>
+              <w:spacing w:line="240" w:lineRule="auto"/>
+            </w:pPr>
+            <w:r>
+              <w:rPr>
+                <w:rFonts w:ascii="Times New Roman" w:cs="Times New Roman" w:eastAsia="Times New Roman" w:hAnsi="Times New Roman"/>
+                <w:b w:val="false"/>
+                <w:bCs w:val="false"/>
+                <w:sz w:val="20"/>
+                <w:szCs w:val="20"/>
+              </w:rPr>
+              <w:t xml:space="preserve">2029 / 2025</w:t>
+            </w:r>
+          </w:p>
+        </w:tc>
+        <w:tc>
+          <w:tcPr>
+            <w:tcW w:type="dxa" w:w="1600"/>
+            <w:tcBorders>
+              <w:top w:val="none" w:color="FFFFFF" w:sz="0"/>
+              <w:left w:val="none" w:color="FFFFFF" w:sz="0"/>
+              <w:bottom w:val="single" w:color="000000" w:sz="4"/>
+              <w:right w:val="none" w:color="FFFFFF" w:sz="0"/>
+            </w:tcBorders>
+            <w:tcMar>
+              <w:top w:type="dxa" w:w="50"/>
+              <w:left w:type="dxa" w:w="90"/>
+              <w:bottom w:type="dxa" w:w="50"/>
+              <w:right w:type="dxa" w:w="90"/>
+            </w:tcMar>
+          </w:tcPr>
+          <w:p>
+            <w:pPr>
+              <w:spacing w:line="240" w:lineRule="auto"/>
+            </w:pPr>
+            <w:r>
+              <w:rPr>
+                <w:rFonts w:ascii="Times New Roman" w:cs="Times New Roman" w:eastAsia="Times New Roman" w:hAnsi="Times New Roman"/>
+                <w:b w:val="false"/>
+                <w:bCs w:val="false"/>
+                <w:sz w:val="20"/>
+                <w:szCs w:val="20"/>
+              </w:rPr>
+              <w:t xml:space="preserve">2032 / 2025</w:t>
+            </w:r>
+          </w:p>
+        </w:tc>
+      </w:tr>
+    </w:tbl>
+    <w:p>
+      <w:pPr>
+        <w:spacing w:after="200" w:before="60" w:line="240" w:lineRule="auto"/>
+      </w:pPr>
+      <w:r>
+        <w:rPr>
+          <w:rFonts w:ascii="Times New Roman" w:cs="Times New Roman" w:eastAsia="Times New Roman" w:hAnsi="Times New Roman"/>
+          <w:i/>
+          <w:iCs/>
+          <w:sz w:val="20"/>
+          <w:szCs w:val="20"/>
+        </w:rPr>
+        <w:t xml:space="preserve">Note.</w:t>
+      </w:r>
+      <w:r>
+        <w:rPr>
+          <w:rFonts w:ascii="Times New Roman" w:cs="Times New Roman" w:eastAsia="Times New Roman" w:hAnsi="Times New Roman"/>
+          <w:sz w:val="20"/>
+          <w:szCs w:val="20"/>
+        </w:rPr>
+        <w:t xml:space="preserve"> Adoption starts from 9.6% (all firms with ten or more employees, EU27, 2025) or 36.2% (publishing, film, and broadcasting) and follows a logistic path with log-odds slopes of 0.75, 0.50, and 0.25 per year. Detection: predicted coefficient per standard deviation of exposure below −0.033 (1.96 times the UK standard error of 0.017) for an occupation with exposure 8.0 standard deviations above the mean. The medium-diffusion path for all firms reaches 56% adoption in 2030.</w:t>
+      </w:r>
+    </w:p>
+    <w:p>
+      <w:pPr>
+        <w:spacing w:after="0" w:line="480" w:lineRule="auto"/>
+        <w:ind w:firstLine="720"/>
+        <w:jc w:val="left"/>
+      </w:pPr>
+      <w:r>
+        <w:rPr>
+          <w:rFonts w:ascii="Times New Roman" w:cs="Times New Roman" w:eastAsia="Times New Roman" w:hAnsi="Times New Roman"/>
+          <w:sz w:val="24"/>
+          <w:szCs w:val="24"/>
+        </w:rPr>
+        <w:t xml:space="preserve">The projection yields criteria that later data can use to falsify it. Under medium diffusion from the average-firm baseline, adoption is 32% in 2028. A coefficient per standard deviation of exposure above −0.01 in 2028 in the UK and European data would then imply that </w:t>
+      </w:r>
+      <w:r>
+        <w:rPr>
+          <w:rFonts w:ascii="Times New Roman" w:cs="Times New Roman" w:eastAsia="Times New Roman" w:hAnsi="Times New Roman"/>
+          <w:i/>
+          <w:iCs/>
+          <w:sz w:val="24"/>
+          <w:szCs w:val="24"/>
+        </w:rPr>
+        <w:t xml:space="preserve">β</w:t>
+      </w:r>
+      <w:r>
+        <w:rPr>
+          <w:rFonts w:ascii="Times New Roman" w:cs="Times New Roman" w:eastAsia="Times New Roman" w:hAnsi="Times New Roman"/>
+          <w:sz w:val="24"/>
+          <w:szCs w:val="24"/>
+        </w:rPr>
+        <w:t xml:space="preserve"> is above about −0.25 for typical adopters (a demand reduction below roughly 22%). A coefficient at or below −0.035 in 2030, when adoption is 56%, would be consistent with </w:t>
+      </w:r>
+      <w:r>
+        <w:rPr>
+          <w:rFonts w:ascii="Times New Roman" w:cs="Times New Roman" w:eastAsia="Times New Roman" w:hAnsi="Times New Roman"/>
+          <w:i/>
+          <w:iCs/>
+          <w:sz w:val="24"/>
+          <w:szCs w:val="24"/>
+        </w:rPr>
+        <w:t xml:space="preserve">β</w:t>
+      </w:r>
+      <w:r>
+        <w:rPr>
+          <w:rFonts w:ascii="Times New Roman" w:cs="Times New Roman" w:eastAsia="Times New Roman" w:hAnsi="Times New Roman"/>
+          <w:sz w:val="24"/>
+          <w:szCs w:val="24"/>
+        </w:rPr>
+        <w:t xml:space="preserve"> of about −0.5 or less. These criteria are conditional on the adoption path; if adoption is slower, the same coefficients imply larger values of </w:t>
+      </w:r>
+      <w:r>
+        <w:rPr>
+          <w:rFonts w:ascii="Times New Roman" w:cs="Times New Roman" w:eastAsia="Times New Roman" w:hAnsi="Times New Roman"/>
+          <w:i/>
+          <w:iCs/>
+          <w:sz w:val="24"/>
+          <w:szCs w:val="24"/>
+        </w:rPr>
+        <w:t xml:space="preserve">β</w:t>
+      </w:r>
+      <w:r>
+        <w:rPr>
+          <w:rFonts w:ascii="Times New Roman" w:cs="Times New Roman" w:eastAsia="Times New Roman" w:hAnsi="Times New Roman"/>
+          <w:sz w:val="24"/>
+          <w:szCs w:val="24"/>
+        </w:rPr>
+        <w:t xml:space="preserve">.</w:t>
+      </w:r>
+    </w:p>
+    <w:p>
+      <w:pPr>
         <w:pStyle w:val="Heading1"/>
         <w:keepNext/>
         <w:spacing w:after="120" w:before="360" w:line="240" w:lineRule="auto"/>
@@ -10841,7 +12039,7 @@
           <w:sz w:val="24"/>
           <w:szCs w:val="24"/>
         </w:rPr>
-        <w:t xml:space="preserve">The identification is weak. Exposure is a continuous measure, but the pre-period contains the COVID shock, and the post-2022 pattern resembles a reversal of the 2022 recovery; the coefficients are small and rely on a few occupations. We do not observe adoption by employers of each occupation, so the scaling exercise is a stylized check. The adoption survey covers Europe and asks about AI in general for the barriers, whereas the hiring data are for the United Kingdom, so we link them only through sector averages. The Eurostat indicator for generative visual AI is available for one year, so we cannot show its growth. The European replication uses experimental statistics that cover 16 countries, ISCO three-digit occupations, and only two post-2022 years, and it ends in 2024. The Canadian data are an employer survey of vacancies rather than job adverts, lack two quarters in 2020, use exposure scored from NOC duty statements without a control for LLM exposure, and give imprecise estimates after 2023. The exposure measure is LLM-coded and has not been validated against human coders, although a rule-based score gives similar results. The mapping from O*NET to UK occupations goes through ISCO-08 and is approximate. The ONS series is experimental and has missing months that we interpolate. Adverts measure hiring intent, not employment, and substitution may occur through hours, outsourcing, or freelancing, which adverts cannot show. Model release dates are approximate. Finally, our model abstracts from changes in the quality and variety of assets and from price effects.</w:t>
+        <w:t xml:space="preserve">The identification is weak. Exposure is a continuous measure, but the pre-period contains the COVID shock, and the post-2022 pattern resembles a reversal of the 2022 recovery; the coefficients are small and rely on a few occupations. We do not observe adoption by employers of each occupation, so the scaling exercise is a stylized check. The adoption survey covers Europe and asks about AI in general for the barriers, whereas the hiring data are for the United Kingdom, so we link them only through sector averages. The Eurostat indicator for generative visual AI is available for one year, so we cannot show its growth. The European replication uses experimental statistics that cover 16 countries, ISCO three-digit occupations, and only two post-2022 years, and it ends in 2024. The Canadian data are an employer survey of vacancies rather than job adverts, lack two quarters in 2020, use exposure scored from NOC duty statements without a control for LLM exposure, and give imprecise estimates after 2023. The exposure measure is LLM-coded and has not been validated against human coders, although a rule-based score gives similar results. The mapping from O*NET to UK occupations goes through ISCO-08 and is approximate. The ONS series is experimental and has missing months that we interpolate. Adverts measure hiring intent, not employment, and substitution may occur through hours, outsourcing, or freelancing, which adverts cannot show. Model release dates are approximate. The projection depends on assumptions about the adoption path, the linearity of exposure, and adoption among employers of each occupation, and it does not identify the effect among adopters. Finally, our model abstracts from changes in the quality and variety of assets and from price effects.</w:t>
       </w:r>
     </w:p>
     <w:p>
@@ -10874,7 +12072,7 @@
           <w:sz w:val="24"/>
           <w:szCs w:val="24"/>
         </w:rPr>
-        <w:t xml:space="preserve">Generative visual AI is being adopted, with about one in ten European firms using it in 2025 and about one in three in publishing, film, and broadcasting, and firms that have not adopted point to expertise and legal and privacy uncertainty as the main obstacles. In UK job adverts, occupations with more visual content creation show small declines after 2022 that are hard to separate from a COVID-era pattern, that are not concentrated in low-quality-requirement tasks, and that are too large in the most exposed occupations for current adoption to explain through substitution. The evidence fits an early-adoption phase in which displacement is not yet detectable, but it does not show that displacement will arrive. Testing the delayed-displacement view requires firm-level data that link adoption to hiring, a validated task measure, and several more years of data.</w:t>
+        <w:t xml:space="preserve">Generative visual AI is being adopted, with about one in ten European firms using it in 2025 and about one in three in publishing, film, and broadcasting, and firms that have not adopted point to expertise and legal and privacy uncertainty as the main obstacles. In UK job adverts, occupations with more visual content creation show small declines after 2022 that are hard to separate from a COVID-era pattern, that are not concentrated in low-quality-requirement tasks, and that are too large in the most exposed occupations for current adoption to explain through substitution. The evidence fits an early-adoption phase in which displacement is not yet detectable, but it does not show that displacement will arrive. Under the model, a demand reduction of about 40% among adopters would become detectable in data of this kind around 2029 to 2030 if adoption follows its recent path, and a reduction of 10% would not become detectable at any adoption level. Testing the delayed-displacement view requires firm-level data that link adoption to hiring, a validated task measure, and several more years of data.</w:t>
       </w:r>
     </w:p>
     <w:p>

</xml_diff>

<commit_message>
Add coder A's validation of the creation score; report agreement in manuscript (weak agreement, conservative LLM score)
Co-Authored-By: Claude Sonnet 5.5 <noreply@anthropic.com>
Claude-Session: https://claude.ai/code/session_01H4JvRLBkzRHsy6jU5TcEWv
</commit_message>
<xml_diff>
--- a/isr_paper/ISR_Paper_Early_Adoption_Delayed_Displacement.docx
+++ b/isr_paper/ISR_Paper_Early_Adoption_Delayed_Displacement.docx
@@ -67,7 +67,7 @@
           <w:sz w:val="22"/>
           <w:szCs w:val="22"/>
         </w:rPr>
-        <w:t xml:space="preserve">This draft reports a full analysis on open data, but it is not yet ready for submission. Three items remain open: (i) the large-language-model (LLM) measure of occupational exposure to visual content creation has not been validated against human coders; (ii) the evidence on labor effects is small and imprecise, with two post-2022 years in the European replication, and we do not claim a causal effect of generative visual AI; (iii) model release dates and the bibliographic details marked † must be verified. All reported numbers are produced by the code and data in the accompanying repository.</w:t>
+        <w:t xml:space="preserve">This draft reports a full analysis on open data, but it is not yet ready for submission. Three items remain open: (i) the large-language-model (LLM) measure of occupational exposure to visual content creation agrees poorly with a single human coder (Section 4.3) and has no second coder; (ii) the evidence on labor effects is small and imprecise, with two post-2022 years in the European replication, and we do not claim a causal effect of generative visual AI; (iii) model release dates and the bibliographic details marked † must be verified. All reported numbers are produced by the code and data in the accompanying repository.</w:t>
       </w:r>
     </w:p>
     <w:p>
@@ -1767,7 +1767,7 @@
           <w:sz w:val="24"/>
           <w:szCs w:val="24"/>
         </w:rPr>
-        <w:t xml:space="preserve">The measure has not been validated against human coders. We provide convergent evidence from a transparent rule-based score built from the rubric text: its correlation with the LLM score across occupations is 0.71 in the first half and 0.91 in the second half of the data classified first (n = 196 and 192 occupations), and all main results are similar with the rule-based score. A second LLM pass codes the quality requirement of the 859 tasks that score 1 or 2 as low (237 tasks), medium (355), or high (267), using the rubric in Appendix A. An earlier attempt to measure a broader construct, dependence of tasks on visual perception, agreed poorly with a human coder (Cohen’s κ about 0.2 on 200 tasks) and was discontinued.</w:t>
+        <w:t xml:space="preserve">We validated the measure with one human coder on a stratified random sample of 199 task statements. The strata were defined by the LLM score and by a rule-based score: 45 tasks scored 2, 55 scored 1, 40 scored 0 but flagged by the rule-based score, and 60 random tasks scored 0 (the sampling weights are used in all estimates). The coder saw only the occupation and the task and used the rubric in Appendix A. Agreement is low. The design-weighted exact agreement is 0.73 (0.56 unweighted), weighted Cohen’s κ is 0.11 (95% bootstrap interval 0.06 to 0.20), the κ for the binary distinction between a score of one or more and zero is 0.15 (0.08 to 0.26), and the Spearman correlation between the two scores is 0.52. The pattern is asymmetric. The coder scored 80% of the tasks that the LLM scored one or two as one or more (91% of those scored two), so the LLM’s positives are mostly accepted. But the coder also scored 25% of random tasks that the LLM and the rule-based score both rated zero as one or more, including reading blueprints, examining engravings for quality, and monitoring closed-circuit television, which the rubric excludes. The design-weighted share of all O*NET tasks that the coder scored one or more is 27.6% (95% interval 18.0 to 38.5), against 4.6% for the LLM; the LLM’s sensitivity relative to the coder is 0.12 (0.09 to 0.19), its specificity 0.98, and its positive predictive value 0.75. The LLM score is therefore a conservative, narrow indicator of visual content production, and it misses most of what this coder counted as visual. With one coder we cannot separate coder idiosyncrasy from ambiguity in the rubric: an earlier exercise on a related construct, dependence of tasks on visual perception, showed a similarly broad pattern. The validity of the measure is therefore not established, and a second coder and a revised rubric are needed. As convergent evidence we provide a transparent rule-based score built from the rubric text: its correlation with the LLM score across occupations is 0.71 in the first half and 0.91 in the second half of the data classified first (n = 196 and 192 occupations), its Spearman correlation with the human score is 0.36, and the main results are similar when it replaces the LLM score. A second LLM pass codes the quality requirement of the 859 tasks that score 1 or 2 as low (237 tasks), medium (355), or high (267), using the rubric in Appendix A. An earlier attempt to measure a broader construct, dependence of tasks on visual perception, agreed poorly with a human coder (Cohen’s κ about 0.2 on 200 tasks) and was discontinued.</w:t>
       </w:r>
     </w:p>
     <w:p>
@@ -12039,7 +12039,7 @@
           <w:sz w:val="24"/>
           <w:szCs w:val="24"/>
         </w:rPr>
-        <w:t xml:space="preserve">The identification is weak. Exposure is a continuous measure, but the pre-period contains the COVID shock, and the post-2022 pattern resembles a reversal of the 2022 recovery; the coefficients are small and rely on a few occupations. We do not observe adoption by employers of each occupation, so the scaling exercise is a stylized check. The adoption survey covers Europe and asks about AI in general for the barriers, whereas the hiring data are for the United Kingdom, so we link them only through sector averages. The Eurostat indicator for generative visual AI is available for one year, so we cannot show its growth. The European replication uses experimental statistics that cover 16 countries, ISCO three-digit occupations, and only two post-2022 years, and it ends in 2024. The Canadian data are an employer survey of vacancies rather than job adverts, lack two quarters in 2020, use exposure scored from NOC duty statements without a control for LLM exposure, and give imprecise estimates after 2023. The exposure measure is LLM-coded and has not been validated against human coders, although a rule-based score gives similar results. The mapping from O*NET to UK occupations goes through ISCO-08 and is approximate. The ONS series is experimental and has missing months that we interpolate. Adverts measure hiring intent, not employment, and substitution may occur through hours, outsourcing, or freelancing, which adverts cannot show. Model release dates are approximate. The projection depends on assumptions about the adoption path, the linearity of exposure, and adoption among employers of each occupation, and it does not identify the effect among adopters. Finally, our model abstracts from changes in the quality and variety of assets and from price effects.</w:t>
+        <w:t xml:space="preserve">The identification is weak. Exposure is a continuous measure, but the pre-period contains the COVID shock, and the post-2022 pattern resembles a reversal of the 2022 recovery; the coefficients are small and rely on a few occupations. We do not observe adoption by employers of each occupation, so the scaling exercise is a stylized check. The adoption survey covers Europe and asks about AI in general for the barriers, whereas the hiring data are for the United Kingdom, so we link them only through sector averages. The Eurostat indicator for generative visual AI is available for one year, so we cannot show its growth. The European replication uses experimental statistics that cover 16 countries, ISCO three-digit occupations, and only two post-2022 years, and it ends in 2024. The Canadian data are an employer survey of vacancies rather than job adverts, lack two quarters in 2020, use exposure scored from NOC duty statements without a control for LLM exposure, and give imprecise estimates after 2023. The exposure measure is LLM-coded and agrees poorly with the one human coder who validated it (weighted κ = 0.11): it is precise but narrow relative to the coder’s broader reading, and there is no second coder, so inter-coder reliability is unknown; a rule-based score gives similar results. The mapping from O*NET to UK occupations goes through ISCO-08 and is approximate. The ONS series is experimental and has missing months that we interpolate. Adverts measure hiring intent, not employment, and substitution may occur through hours, outsourcing, or freelancing, which adverts cannot show. Model release dates are approximate. The projection depends on assumptions about the adoption path, the linearity of exposure, and adoption among employers of each occupation, and it does not identify the effect among adopters. Finally, our model abstracts from changes in the quality and variety of assets and from price effects.</w:t>
       </w:r>
     </w:p>
     <w:p>

</xml_diff>

<commit_message>
Add broad exposure measure (v2) results for UK and Europe; update manuscript
Co-Authored-By: Claude Sonnet 5.5 <noreply@anthropic.com>
Claude-Session: https://claude.ai/code/session_01H4JvRLBkzRHsy6jU5TcEWv
</commit_message>
<xml_diff>
--- a/isr_paper/ISR_Paper_Early_Adoption_Delayed_Displacement.docx
+++ b/isr_paper/ISR_Paper_Early_Adoption_Delayed_Displacement.docx
@@ -1768,6 +1768,21 @@
           <w:szCs w:val="24"/>
         </w:rPr>
         <w:t xml:space="preserve">We validated the measure with one human coder on a stratified random sample of 199 task statements. The strata were defined by the LLM score and by a rule-based score: 45 tasks scored 2, 55 scored 1, 40 scored 0 but flagged by the rule-based score, and 60 random tasks scored 0 (the sampling weights are used in all estimates). The coder saw only the occupation and the task and used the rubric in Appendix A. Agreement is low. The design-weighted exact agreement is 0.73 (0.56 unweighted), weighted Cohen’s κ is 0.11 (95% bootstrap interval 0.06 to 0.20), the κ for the binary distinction between a score of one or more and zero is 0.15 (0.08 to 0.26), and the Spearman correlation between the two scores is 0.52. The pattern is asymmetric. The coder scored 80% of the tasks that the LLM scored one or two as one or more (91% of those scored two), so the LLM’s positives are mostly accepted. But the coder also scored 25% of random tasks that the LLM and the rule-based score both rated zero as one or more, including reading blueprints, examining engravings for quality, and monitoring closed-circuit television, which the rubric excludes. The design-weighted share of all O*NET tasks that the coder scored one or more is 27.6% (95% interval 18.0 to 38.5), against 4.6% for the LLM; the LLM’s sensitivity relative to the coder is 0.12 (0.09 to 0.19), its specificity 0.98, and its positive predictive value 0.75. The LLM score is therefore a conservative, narrow indicator of visual content production, and it misses most of what this coder counted as visual. With one coder we cannot separate coder idiosyncrasy from ambiguity in the rubric: an earlier exercise on a related construct, dependence of tasks on visual perception, showed a similarly broad pattern. The validity of the measure is therefore not established, and a second coder and a revised rubric are needed. As convergent evidence we provide a transparent rule-based score built from the rubric text: its correlation with the LLM score across occupations is 0.71 in the first half and 0.91 in the second half of the data classified first (n = 196 and 192 occupations), its Spearman correlation with the human score is 0.36, and the main results are similar when it replaces the LLM score. A second LLM pass codes the quality requirement of the 859 tasks that score 1 or 2 as low (237 tasks), medium (355), or high (267), using the rubric in Appendix A. An earlier attempt to measure a broader construct, dependence of tasks on visual perception, agreed poorly with a human coder (Cohen’s κ about 0.2 on 200 tasks) and was discontinued.</w:t>
+      </w:r>
+    </w:p>
+    <w:p>
+      <w:pPr>
+        <w:spacing w:after="0" w:line="480" w:lineRule="auto"/>
+        <w:ind w:firstLine="720"/>
+        <w:jc w:val="left"/>
+      </w:pPr>
+      <w:r>
+        <w:rPr>
+          <w:rFonts w:ascii="Times New Roman" w:cs="Times New Roman" w:eastAsia="Times New Roman" w:hAnsi="Times New Roman"/>
+          <w:sz w:val="24"/>
+          <w:szCs w:val="24"/>
+        </w:rPr>
+        <w:t xml:space="preserve">Because the coder read the construct more broadly than the rubric, we built a second, broad measure that scores how much a task involves working with visual materials and visual or aesthetic output: producing, editing, reading, inspecting, or monitoring images, drawings, video, interfaces, and layouts (rubric in Appendix A). We wrote the rubric after seeing the coder’s pattern on the first half of the human sample, and evaluated it on the second half (99 tasks), which was not used to write it. On that held-out half the weighted κ is 0.41 (0.44 linear-weighted), the κ for a score of one or more versus zero is 0.44, and the Spearman correlation with the human score is 0.66, against 0.11 for the narrow measure on the full sample. Agreement is moderate, and because the rubric was shaped by one coder’s reading it may agree less well with another coder. We apply the broad measure to all 18,796 tasks, with the occupation title shown to the model as the coder saw it; 14.9% of tasks score one or more (2.5% score two). We report results for both measures.</w:t>
       </w:r>
     </w:p>
     <w:p>
@@ -10816,7 +10831,7 @@
           <w:sz w:val="24"/>
           <w:szCs w:val="24"/>
         </w:rPr>
-        <w:t xml:space="preserve">6.9 Summary of Evidence Against the Hypotheses</w:t>
+        <w:t xml:space="preserve">6.9 Broad Exposure Measure</w:t>
       </w:r>
     </w:p>
     <w:p>
@@ -10831,129 +10846,7 @@
           <w:sz w:val="24"/>
           <w:szCs w:val="24"/>
         </w:rPr>
-        <w:t xml:space="preserve">H1 is supported in a limited sense: adoption is substantial and rising, while estimated labor-demand effects are small, imprecise, and partly a reversal of earlier trends; the scaling exercise shows that the largest observed declines are too large for current adoption to explain through substitution. H2 is not supported. H3 is partly supported: firms cite expertise and legal and privacy uncertainty far more than usefulness, but cross-country variation in these concerns does not clearly explain adoption. H4 is weakly supported: in the UK the coefficients are most negative in 2026 and in Europe without the language control they grow from 2023 to 2024, but in both the pattern is not clearly monotone and in the UK the effect cannot be separated from the pre-existing pattern. The European replication strengthens the direction of the result and removes the pre-trend concern, but it covers only two post-2022 years. In Canada the first post-2022 year agrees in sign, and later years show no clear pattern within narrow occupation groups.</w:t>
-      </w:r>
-    </w:p>
-    <w:p>
-      <w:pPr>
-        <w:pStyle w:val="Heading2"/>
-        <w:keepNext/>
-        <w:spacing w:after="120" w:before="240" w:line="240" w:lineRule="auto"/>
-      </w:pPr>
-      <w:r>
-        <w:rPr>
-          <w:rFonts w:ascii="Times New Roman" w:cs="Times New Roman" w:eastAsia="Times New Roman" w:hAnsi="Times New Roman"/>
-          <w:b/>
-          <w:bCs/>
-          <w:sz w:val="24"/>
-          <w:szCs w:val="24"/>
-        </w:rPr>
-        <w:t xml:space="preserve">6.10 Projection: When Could Displacement Become Detectable?</w:t>
-      </w:r>
-    </w:p>
-    <w:p>
-      <w:pPr>
-        <w:spacing w:after="0" w:line="480" w:lineRule="auto"/>
-        <w:ind w:firstLine="720"/>
-        <w:jc w:val="left"/>
-      </w:pPr>
-      <w:r>
-        <w:rPr>
-          <w:rFonts w:ascii="Times New Roman" w:cs="Times New Roman" w:eastAsia="Times New Roman" w:hAnsi="Times New Roman"/>
-          <w:sz w:val="24"/>
-          <w:szCs w:val="24"/>
-        </w:rPr>
-        <w:t xml:space="preserve">Table 10 reports the share of employers that would have to adopt for the effect to reach the detection threshold, and the first year in which each adoption scenario gets there. The threshold requires adoption times </w:t>
-      </w:r>
-      <w:r>
-        <w:rPr>
-          <w:rFonts w:ascii="Times New Roman" w:cs="Times New Roman" w:eastAsia="Times New Roman" w:hAnsi="Times New Roman"/>
-          <w:i/>
-          <w:iCs/>
-          <w:sz w:val="24"/>
-          <w:szCs w:val="24"/>
-        </w:rPr>
-        <w:t xml:space="preserve">β</w:t>
-      </w:r>
-      <w:r>
-        <w:rPr>
-          <w:rFonts w:ascii="Times New Roman" w:cs="Times New Roman" w:eastAsia="Times New Roman" w:hAnsi="Times New Roman"/>
-          <w:sz w:val="24"/>
-          <w:szCs w:val="24"/>
-        </w:rPr>
-        <w:t xml:space="preserve"> to reach −0.27. If demand among adopters falls by 39% (</w:t>
-      </w:r>
-      <w:r>
-        <w:rPr>
-          <w:rFonts w:ascii="Times New Roman" w:cs="Times New Roman" w:eastAsia="Times New Roman" w:hAnsi="Times New Roman"/>
-          <w:i/>
-          <w:iCs/>
-          <w:sz w:val="24"/>
-          <w:szCs w:val="24"/>
-        </w:rPr>
-        <w:t xml:space="preserve">β</w:t>
-      </w:r>
-      <w:r>
-        <w:rPr>
-          <w:rFonts w:ascii="Times New Roman" w:cs="Times New Roman" w:eastAsia="Times New Roman" w:hAnsi="Times New Roman"/>
-          <w:sz w:val="24"/>
-          <w:szCs w:val="24"/>
-        </w:rPr>
-        <w:t xml:space="preserve"> = −0.5), adoption must reach 53%. Starting from the EU27 average of 9.6%, this happens in 2029 under fast diffusion, 2030 under medium diffusion, and 2035 under slow diffusion. Starting from the 36% adoption observed in publishing, film, and broadcasting, it happens in 2026, 2027, and 2028. If demand among adopters falls by 26% (</w:t>
-      </w:r>
-      <w:r>
-        <w:rPr>
-          <w:rFonts w:ascii="Times New Roman" w:cs="Times New Roman" w:eastAsia="Times New Roman" w:hAnsi="Times New Roman"/>
-          <w:i/>
-          <w:iCs/>
-          <w:sz w:val="24"/>
-          <w:szCs w:val="24"/>
-        </w:rPr>
-        <w:t xml:space="preserve">β</w:t>
-      </w:r>
-      <w:r>
-        <w:rPr>
-          <w:rFonts w:ascii="Times New Roman" w:cs="Times New Roman" w:eastAsia="Times New Roman" w:hAnsi="Times New Roman"/>
-          <w:sz w:val="24"/>
-          <w:szCs w:val="24"/>
-        </w:rPr>
-        <w:t xml:space="preserve"> = −0.3), adoption must reach 89%, which occurs between 2031 and 2034 for the average firm under fast and medium diffusion and between 2029 and 2031 in media-related sectors, and not within the horizon under slow diffusion. If demand falls by 10% (</w:t>
-      </w:r>
-      <w:r>
-        <w:rPr>
-          <w:rFonts w:ascii="Times New Roman" w:cs="Times New Roman" w:eastAsia="Times New Roman" w:hAnsi="Times New Roman"/>
-          <w:i/>
-          <w:iCs/>
-          <w:sz w:val="24"/>
-          <w:szCs w:val="24"/>
-        </w:rPr>
-        <w:t xml:space="preserve">β</w:t>
-      </w:r>
-      <w:r>
-        <w:rPr>
-          <w:rFonts w:ascii="Times New Roman" w:cs="Times New Roman" w:eastAsia="Times New Roman" w:hAnsi="Times New Roman"/>
-          <w:sz w:val="24"/>
-          <w:szCs w:val="24"/>
-        </w:rPr>
-        <w:t xml:space="preserve"> = −0.1), the threshold would require adoption above 100%: such an effect would not be detectable with this design at any adoption level. If demand among adopters fell by 55% (</w:t>
-      </w:r>
-      <w:r>
-        <w:rPr>
-          <w:rFonts w:ascii="Times New Roman" w:cs="Times New Roman" w:eastAsia="Times New Roman" w:hAnsi="Times New Roman"/>
-          <w:i/>
-          <w:iCs/>
-          <w:sz w:val="24"/>
-          <w:szCs w:val="24"/>
-        </w:rPr>
-        <w:t xml:space="preserve">β</w:t>
-      </w:r>
-      <w:r>
-        <w:rPr>
-          <w:rFonts w:ascii="Times New Roman" w:cs="Times New Roman" w:eastAsia="Times New Roman" w:hAnsi="Times New Roman"/>
-          <w:sz w:val="24"/>
-          <w:szCs w:val="24"/>
-        </w:rPr>
-        <w:t xml:space="preserve"> = −0.8), detection would occur in 2028 to 2032 for the average firm and already in 2025 in media-related sectors. The present UK coefficient for 2026 (−0.033) is at the detection threshold, so it is consistent either with such a large effect among adopters in a high-adoption sector or with a decline that is not caused by adoption, as Section 6.7 suggests.</w:t>
+        <w:t xml:space="preserve">Table 10 reports the dose-response estimates with the broad measure of exposure to visual materials. In the UK, with sub-major group fixed effects and the control for LLM exposure, a standard deviation of exposure is associated with 2.1% fewer adverts in the year ending June 2023 relative to the base year (standard error 1.5), 1.0% fewer in 2024 (2.2), 1.8% fewer in 2025 (2.0), and 2.7% fewer in 2026 (2.1); randomization p-values are 0.54, 0.25, and 0.09 for 2024, 2025, and 2026. With major-group fixed effects the estimates are −2.6% to −3.0% in 2023–2026 with standard errors of 1.1 to 1.8. The coefficients before the base year are positive and larger than for the narrow measure (+4.7% in 2018 and +4.2% in 2019, with standard errors of 1.7 and 1.5), which means that occupations with high exposure to visual materials were rising relative to others before 2022 and then lost that advantage. In the European data the broad measure gives −0.9% in 2023 (standard error 0.7, randomization p = 0.27) and −0.4% in 2024 (1.5, p = 0.77), against positive pre-2022 coefficients (+4.0% in 2019, +2.3% in 2020, +1.9% in 2021). The country-by-country slopes are negative in 5 of 9 countries in both years. With the broad measure the post-2022 estimates are therefore smaller and less precise than with the narrow measure, and the pre-2022 pattern of relative growth is stronger, so a larger part of the post-2022 pattern can be read as the reversal of an earlier trend.</w:t>
       </w:r>
     </w:p>
     <w:p>
@@ -10971,6 +10864,1297 @@
           <w:szCs w:val="22"/>
         </w:rPr>
         <w:t xml:space="preserve">Table 10.</w:t>
+      </w:r>
+      <w:r>
+        <w:rPr>
+          <w:rFonts w:ascii="Times New Roman" w:cs="Times New Roman" w:eastAsia="Times New Roman" w:hAnsi="Times New Roman"/>
+          <w:sz w:val="22"/>
+          <w:szCs w:val="22"/>
+        </w:rPr>
+        <w:t xml:space="preserve"> Broad exposure measure: coefficient on exposure to visual materials (per standard deviation), change in log adverts relative to the base year</w:t>
+      </w:r>
+    </w:p>
+    <w:tbl>
+      <w:tblPr>
+        <w:tblW w:type="dxa" w:w="9360"/>
+        <w:tblBorders>
+          <w:top w:val="single" w:color="auto" w:sz="4"/>
+          <w:left w:val="single" w:color="auto" w:sz="4"/>
+          <w:bottom w:val="single" w:color="auto" w:sz="4"/>
+          <w:right w:val="single" w:color="auto" w:sz="4"/>
+          <w:insideH w:val="single" w:color="auto" w:sz="4"/>
+          <w:insideV w:val="single" w:color="auto" w:sz="4"/>
+        </w:tblBorders>
+      </w:tblPr>
+      <w:tblGrid>
+        <w:gridCol w:w="2560"/>
+        <w:gridCol w:w="1100"/>
+        <w:gridCol w:w="1100"/>
+        <w:gridCol w:w="1100"/>
+        <w:gridCol w:w="1100"/>
+        <w:gridCol w:w="1100"/>
+        <w:gridCol w:w="1300"/>
+      </w:tblGrid>
+      <w:tr>
+        <w:trPr>
+          <w:cantSplit/>
+          <w:tblHeader/>
+        </w:trPr>
+        <w:tc>
+          <w:tcPr>
+            <w:tcW w:type="dxa" w:w="2560"/>
+            <w:tcBorders>
+              <w:top w:val="single" w:color="000000" w:sz="4"/>
+              <w:left w:val="none" w:color="FFFFFF" w:sz="0"/>
+              <w:bottom w:val="single" w:color="000000" w:sz="4"/>
+              <w:right w:val="none" w:color="FFFFFF" w:sz="0"/>
+            </w:tcBorders>
+            <w:shd w:fill="EDEDED" w:color="auto" w:val="clear"/>
+            <w:tcMar>
+              <w:top w:type="dxa" w:w="50"/>
+              <w:left w:type="dxa" w:w="90"/>
+              <w:bottom w:type="dxa" w:w="50"/>
+              <w:right w:type="dxa" w:w="90"/>
+            </w:tcMar>
+          </w:tcPr>
+          <w:p>
+            <w:pPr>
+              <w:spacing w:line="240" w:lineRule="auto"/>
+            </w:pPr>
+            <w:r>
+              <w:rPr>
+                <w:rFonts w:ascii="Times New Roman" w:cs="Times New Roman" w:eastAsia="Times New Roman" w:hAnsi="Times New Roman"/>
+                <w:b/>
+                <w:bCs/>
+                <w:sz w:val="20"/>
+                <w:szCs w:val="20"/>
+              </w:rPr>
+              <w:t xml:space="preserve">Sample</w:t>
+            </w:r>
+          </w:p>
+        </w:tc>
+        <w:tc>
+          <w:tcPr>
+            <w:tcW w:type="dxa" w:w="1100"/>
+            <w:tcBorders>
+              <w:top w:val="single" w:color="000000" w:sz="4"/>
+              <w:left w:val="none" w:color="FFFFFF" w:sz="0"/>
+              <w:bottom w:val="single" w:color="000000" w:sz="4"/>
+              <w:right w:val="none" w:color="FFFFFF" w:sz="0"/>
+            </w:tcBorders>
+            <w:shd w:fill="EDEDED" w:color="auto" w:val="clear"/>
+            <w:tcMar>
+              <w:top w:type="dxa" w:w="50"/>
+              <w:left w:type="dxa" w:w="90"/>
+              <w:bottom w:type="dxa" w:w="50"/>
+              <w:right w:type="dxa" w:w="90"/>
+            </w:tcMar>
+          </w:tcPr>
+          <w:p>
+            <w:pPr>
+              <w:spacing w:line="240" w:lineRule="auto"/>
+            </w:pPr>
+            <w:r>
+              <w:rPr>
+                <w:rFonts w:ascii="Times New Roman" w:cs="Times New Roman" w:eastAsia="Times New Roman" w:hAnsi="Times New Roman"/>
+                <w:b/>
+                <w:bCs/>
+                <w:sz w:val="20"/>
+                <w:szCs w:val="20"/>
+              </w:rPr>
+              <w:t xml:space="preserve">2018/19</w:t>
+            </w:r>
+          </w:p>
+        </w:tc>
+        <w:tc>
+          <w:tcPr>
+            <w:tcW w:type="dxa" w:w="1100"/>
+            <w:tcBorders>
+              <w:top w:val="single" w:color="000000" w:sz="4"/>
+              <w:left w:val="none" w:color="FFFFFF" w:sz="0"/>
+              <w:bottom w:val="single" w:color="000000" w:sz="4"/>
+              <w:right w:val="none" w:color="FFFFFF" w:sz="0"/>
+            </w:tcBorders>
+            <w:shd w:fill="EDEDED" w:color="auto" w:val="clear"/>
+            <w:tcMar>
+              <w:top w:type="dxa" w:w="50"/>
+              <w:left w:type="dxa" w:w="90"/>
+              <w:bottom w:type="dxa" w:w="50"/>
+              <w:right w:type="dxa" w:w="90"/>
+            </w:tcMar>
+          </w:tcPr>
+          <w:p>
+            <w:pPr>
+              <w:spacing w:line="240" w:lineRule="auto"/>
+            </w:pPr>
+            <w:r>
+              <w:rPr>
+                <w:rFonts w:ascii="Times New Roman" w:cs="Times New Roman" w:eastAsia="Times New Roman" w:hAnsi="Times New Roman"/>
+                <w:b/>
+                <w:bCs/>
+                <w:sz w:val="20"/>
+                <w:szCs w:val="20"/>
+              </w:rPr>
+              <w:t xml:space="preserve">2020/21</w:t>
+            </w:r>
+          </w:p>
+        </w:tc>
+        <w:tc>
+          <w:tcPr>
+            <w:tcW w:type="dxa" w:w="1100"/>
+            <w:tcBorders>
+              <w:top w:val="single" w:color="000000" w:sz="4"/>
+              <w:left w:val="none" w:color="FFFFFF" w:sz="0"/>
+              <w:bottom w:val="single" w:color="000000" w:sz="4"/>
+              <w:right w:val="none" w:color="FFFFFF" w:sz="0"/>
+            </w:tcBorders>
+            <w:shd w:fill="EDEDED" w:color="auto" w:val="clear"/>
+            <w:tcMar>
+              <w:top w:type="dxa" w:w="50"/>
+              <w:left w:type="dxa" w:w="90"/>
+              <w:bottom w:type="dxa" w:w="50"/>
+              <w:right w:type="dxa" w:w="90"/>
+            </w:tcMar>
+          </w:tcPr>
+          <w:p>
+            <w:pPr>
+              <w:spacing w:line="240" w:lineRule="auto"/>
+            </w:pPr>
+            <w:r>
+              <w:rPr>
+                <w:rFonts w:ascii="Times New Roman" w:cs="Times New Roman" w:eastAsia="Times New Roman" w:hAnsi="Times New Roman"/>
+                <w:b/>
+                <w:bCs/>
+                <w:sz w:val="20"/>
+                <w:szCs w:val="20"/>
+              </w:rPr>
+              <w:t xml:space="preserve">2023</w:t>
+            </w:r>
+          </w:p>
+        </w:tc>
+        <w:tc>
+          <w:tcPr>
+            <w:tcW w:type="dxa" w:w="1100"/>
+            <w:tcBorders>
+              <w:top w:val="single" w:color="000000" w:sz="4"/>
+              <w:left w:val="none" w:color="FFFFFF" w:sz="0"/>
+              <w:bottom w:val="single" w:color="000000" w:sz="4"/>
+              <w:right w:val="none" w:color="FFFFFF" w:sz="0"/>
+            </w:tcBorders>
+            <w:shd w:fill="EDEDED" w:color="auto" w:val="clear"/>
+            <w:tcMar>
+              <w:top w:type="dxa" w:w="50"/>
+              <w:left w:type="dxa" w:w="90"/>
+              <w:bottom w:type="dxa" w:w="50"/>
+              <w:right w:type="dxa" w:w="90"/>
+            </w:tcMar>
+          </w:tcPr>
+          <w:p>
+            <w:pPr>
+              <w:spacing w:line="240" w:lineRule="auto"/>
+            </w:pPr>
+            <w:r>
+              <w:rPr>
+                <w:rFonts w:ascii="Times New Roman" w:cs="Times New Roman" w:eastAsia="Times New Roman" w:hAnsi="Times New Roman"/>
+                <w:b/>
+                <w:bCs/>
+                <w:sz w:val="20"/>
+                <w:szCs w:val="20"/>
+              </w:rPr>
+              <w:t xml:space="preserve">2024</w:t>
+            </w:r>
+          </w:p>
+        </w:tc>
+        <w:tc>
+          <w:tcPr>
+            <w:tcW w:type="dxa" w:w="1100"/>
+            <w:tcBorders>
+              <w:top w:val="single" w:color="000000" w:sz="4"/>
+              <w:left w:val="none" w:color="FFFFFF" w:sz="0"/>
+              <w:bottom w:val="single" w:color="000000" w:sz="4"/>
+              <w:right w:val="none" w:color="FFFFFF" w:sz="0"/>
+            </w:tcBorders>
+            <w:shd w:fill="EDEDED" w:color="auto" w:val="clear"/>
+            <w:tcMar>
+              <w:top w:type="dxa" w:w="50"/>
+              <w:left w:type="dxa" w:w="90"/>
+              <w:bottom w:type="dxa" w:w="50"/>
+              <w:right w:type="dxa" w:w="90"/>
+            </w:tcMar>
+          </w:tcPr>
+          <w:p>
+            <w:pPr>
+              <w:spacing w:line="240" w:lineRule="auto"/>
+            </w:pPr>
+            <w:r>
+              <w:rPr>
+                <w:rFonts w:ascii="Times New Roman" w:cs="Times New Roman" w:eastAsia="Times New Roman" w:hAnsi="Times New Roman"/>
+                <w:b/>
+                <w:bCs/>
+                <w:sz w:val="20"/>
+                <w:szCs w:val="20"/>
+              </w:rPr>
+              <w:t xml:space="preserve">2025</w:t>
+            </w:r>
+          </w:p>
+        </w:tc>
+        <w:tc>
+          <w:tcPr>
+            <w:tcW w:type="dxa" w:w="1300"/>
+            <w:tcBorders>
+              <w:top w:val="single" w:color="000000" w:sz="4"/>
+              <w:left w:val="none" w:color="FFFFFF" w:sz="0"/>
+              <w:bottom w:val="single" w:color="000000" w:sz="4"/>
+              <w:right w:val="none" w:color="FFFFFF" w:sz="0"/>
+            </w:tcBorders>
+            <w:shd w:fill="EDEDED" w:color="auto" w:val="clear"/>
+            <w:tcMar>
+              <w:top w:type="dxa" w:w="50"/>
+              <w:left w:type="dxa" w:w="90"/>
+              <w:bottom w:type="dxa" w:w="50"/>
+              <w:right w:type="dxa" w:w="90"/>
+            </w:tcMar>
+          </w:tcPr>
+          <w:p>
+            <w:pPr>
+              <w:spacing w:line="240" w:lineRule="auto"/>
+            </w:pPr>
+            <w:r>
+              <w:rPr>
+                <w:rFonts w:ascii="Times New Roman" w:cs="Times New Roman" w:eastAsia="Times New Roman" w:hAnsi="Times New Roman"/>
+                <w:b/>
+                <w:bCs/>
+                <w:sz w:val="20"/>
+                <w:szCs w:val="20"/>
+              </w:rPr>
+              <w:t xml:space="preserve">2026</w:t>
+            </w:r>
+          </w:p>
+        </w:tc>
+      </w:tr>
+      <w:tr>
+        <w:trPr>
+          <w:cantSplit/>
+          <w:tblHeader w:val="false"/>
+        </w:trPr>
+        <w:tc>
+          <w:tcPr>
+            <w:tcW w:type="dxa" w:w="2560"/>
+            <w:tcBorders>
+              <w:top w:val="none" w:color="FFFFFF" w:sz="0"/>
+              <w:left w:val="none" w:color="FFFFFF" w:sz="0"/>
+              <w:bottom w:val="none" w:color="FFFFFF" w:sz="0"/>
+              <w:right w:val="none" w:color="FFFFFF" w:sz="0"/>
+            </w:tcBorders>
+            <w:tcMar>
+              <w:top w:type="dxa" w:w="50"/>
+              <w:left w:type="dxa" w:w="90"/>
+              <w:bottom w:type="dxa" w:w="50"/>
+              <w:right w:type="dxa" w:w="90"/>
+            </w:tcMar>
+          </w:tcPr>
+          <w:p>
+            <w:pPr>
+              <w:spacing w:line="240" w:lineRule="auto"/>
+            </w:pPr>
+            <w:r>
+              <w:rPr>
+                <w:rFonts w:ascii="Times New Roman" w:cs="Times New Roman" w:eastAsia="Times New Roman" w:hAnsi="Times New Roman"/>
+                <w:b w:val="false"/>
+                <w:bCs w:val="false"/>
+                <w:sz w:val="20"/>
+                <w:szCs w:val="20"/>
+              </w:rPr>
+              <w:t xml:space="preserve">UK: sub-major FE, LLM control</w:t>
+            </w:r>
+          </w:p>
+        </w:tc>
+        <w:tc>
+          <w:tcPr>
+            <w:tcW w:type="dxa" w:w="1100"/>
+            <w:tcBorders>
+              <w:top w:val="none" w:color="FFFFFF" w:sz="0"/>
+              <w:left w:val="none" w:color="FFFFFF" w:sz="0"/>
+              <w:bottom w:val="none" w:color="FFFFFF" w:sz="0"/>
+              <w:right w:val="none" w:color="FFFFFF" w:sz="0"/>
+            </w:tcBorders>
+            <w:tcMar>
+              <w:top w:type="dxa" w:w="50"/>
+              <w:left w:type="dxa" w:w="90"/>
+              <w:bottom w:type="dxa" w:w="50"/>
+              <w:right w:type="dxa" w:w="90"/>
+            </w:tcMar>
+          </w:tcPr>
+          <w:p>
+            <w:pPr>
+              <w:spacing w:line="240" w:lineRule="auto"/>
+            </w:pPr>
+            <w:r>
+              <w:rPr>
+                <w:rFonts w:ascii="Times New Roman" w:cs="Times New Roman" w:eastAsia="Times New Roman" w:hAnsi="Times New Roman"/>
+                <w:b w:val="false"/>
+                <w:bCs w:val="false"/>
+                <w:sz w:val="20"/>
+                <w:szCs w:val="20"/>
+              </w:rPr>
+              <w:t xml:space="preserve">+0.047 / +0.042</w:t>
+            </w:r>
+          </w:p>
+        </w:tc>
+        <w:tc>
+          <w:tcPr>
+            <w:tcW w:type="dxa" w:w="1100"/>
+            <w:tcBorders>
+              <w:top w:val="none" w:color="FFFFFF" w:sz="0"/>
+              <w:left w:val="none" w:color="FFFFFF" w:sz="0"/>
+              <w:bottom w:val="none" w:color="FFFFFF" w:sz="0"/>
+              <w:right w:val="none" w:color="FFFFFF" w:sz="0"/>
+            </w:tcBorders>
+            <w:tcMar>
+              <w:top w:type="dxa" w:w="50"/>
+              <w:left w:type="dxa" w:w="90"/>
+              <w:bottom w:type="dxa" w:w="50"/>
+              <w:right w:type="dxa" w:w="90"/>
+            </w:tcMar>
+          </w:tcPr>
+          <w:p>
+            <w:pPr>
+              <w:spacing w:line="240" w:lineRule="auto"/>
+            </w:pPr>
+            <w:r>
+              <w:rPr>
+                <w:rFonts w:ascii="Times New Roman" w:cs="Times New Roman" w:eastAsia="Times New Roman" w:hAnsi="Times New Roman"/>
+                <w:b w:val="false"/>
+                <w:bCs w:val="false"/>
+                <w:sz w:val="20"/>
+                <w:szCs w:val="20"/>
+              </w:rPr>
+              <w:t xml:space="preserve">−0.018 (2021)</w:t>
+            </w:r>
+          </w:p>
+        </w:tc>
+        <w:tc>
+          <w:tcPr>
+            <w:tcW w:type="dxa" w:w="1100"/>
+            <w:tcBorders>
+              <w:top w:val="none" w:color="FFFFFF" w:sz="0"/>
+              <w:left w:val="none" w:color="FFFFFF" w:sz="0"/>
+              <w:bottom w:val="none" w:color="FFFFFF" w:sz="0"/>
+              <w:right w:val="none" w:color="FFFFFF" w:sz="0"/>
+            </w:tcBorders>
+            <w:tcMar>
+              <w:top w:type="dxa" w:w="50"/>
+              <w:left w:type="dxa" w:w="90"/>
+              <w:bottom w:type="dxa" w:w="50"/>
+              <w:right w:type="dxa" w:w="90"/>
+            </w:tcMar>
+          </w:tcPr>
+          <w:p>
+            <w:pPr>
+              <w:spacing w:line="240" w:lineRule="auto"/>
+            </w:pPr>
+            <w:r>
+              <w:rPr>
+                <w:rFonts w:ascii="Times New Roman" w:cs="Times New Roman" w:eastAsia="Times New Roman" w:hAnsi="Times New Roman"/>
+                <w:b w:val="false"/>
+                <w:bCs w:val="false"/>
+                <w:sz w:val="20"/>
+                <w:szCs w:val="20"/>
+              </w:rPr>
+              <w:t xml:space="preserve">−0.021 (0.015)</w:t>
+            </w:r>
+          </w:p>
+        </w:tc>
+        <w:tc>
+          <w:tcPr>
+            <w:tcW w:type="dxa" w:w="1100"/>
+            <w:tcBorders>
+              <w:top w:val="none" w:color="FFFFFF" w:sz="0"/>
+              <w:left w:val="none" w:color="FFFFFF" w:sz="0"/>
+              <w:bottom w:val="none" w:color="FFFFFF" w:sz="0"/>
+              <w:right w:val="none" w:color="FFFFFF" w:sz="0"/>
+            </w:tcBorders>
+            <w:tcMar>
+              <w:top w:type="dxa" w:w="50"/>
+              <w:left w:type="dxa" w:w="90"/>
+              <w:bottom w:type="dxa" w:w="50"/>
+              <w:right w:type="dxa" w:w="90"/>
+            </w:tcMar>
+          </w:tcPr>
+          <w:p>
+            <w:pPr>
+              <w:spacing w:line="240" w:lineRule="auto"/>
+            </w:pPr>
+            <w:r>
+              <w:rPr>
+                <w:rFonts w:ascii="Times New Roman" w:cs="Times New Roman" w:eastAsia="Times New Roman" w:hAnsi="Times New Roman"/>
+                <w:b w:val="false"/>
+                <w:bCs w:val="false"/>
+                <w:sz w:val="20"/>
+                <w:szCs w:val="20"/>
+              </w:rPr>
+              <w:t xml:space="preserve">−0.010 (0.022)</w:t>
+            </w:r>
+          </w:p>
+        </w:tc>
+        <w:tc>
+          <w:tcPr>
+            <w:tcW w:type="dxa" w:w="1100"/>
+            <w:tcBorders>
+              <w:top w:val="none" w:color="FFFFFF" w:sz="0"/>
+              <w:left w:val="none" w:color="FFFFFF" w:sz="0"/>
+              <w:bottom w:val="none" w:color="FFFFFF" w:sz="0"/>
+              <w:right w:val="none" w:color="FFFFFF" w:sz="0"/>
+            </w:tcBorders>
+            <w:tcMar>
+              <w:top w:type="dxa" w:w="50"/>
+              <w:left w:type="dxa" w:w="90"/>
+              <w:bottom w:type="dxa" w:w="50"/>
+              <w:right w:type="dxa" w:w="90"/>
+            </w:tcMar>
+          </w:tcPr>
+          <w:p>
+            <w:pPr>
+              <w:spacing w:line="240" w:lineRule="auto"/>
+            </w:pPr>
+            <w:r>
+              <w:rPr>
+                <w:rFonts w:ascii="Times New Roman" w:cs="Times New Roman" w:eastAsia="Times New Roman" w:hAnsi="Times New Roman"/>
+                <w:b w:val="false"/>
+                <w:bCs w:val="false"/>
+                <w:sz w:val="20"/>
+                <w:szCs w:val="20"/>
+              </w:rPr>
+              <w:t xml:space="preserve">−0.018 (0.020)</w:t>
+            </w:r>
+          </w:p>
+        </w:tc>
+        <w:tc>
+          <w:tcPr>
+            <w:tcW w:type="dxa" w:w="1300"/>
+            <w:tcBorders>
+              <w:top w:val="none" w:color="FFFFFF" w:sz="0"/>
+              <w:left w:val="none" w:color="FFFFFF" w:sz="0"/>
+              <w:bottom w:val="none" w:color="FFFFFF" w:sz="0"/>
+              <w:right w:val="none" w:color="FFFFFF" w:sz="0"/>
+            </w:tcBorders>
+            <w:tcMar>
+              <w:top w:type="dxa" w:w="50"/>
+              <w:left w:type="dxa" w:w="90"/>
+              <w:bottom w:type="dxa" w:w="50"/>
+              <w:right w:type="dxa" w:w="90"/>
+            </w:tcMar>
+          </w:tcPr>
+          <w:p>
+            <w:pPr>
+              <w:spacing w:line="240" w:lineRule="auto"/>
+            </w:pPr>
+            <w:r>
+              <w:rPr>
+                <w:rFonts w:ascii="Times New Roman" w:cs="Times New Roman" w:eastAsia="Times New Roman" w:hAnsi="Times New Roman"/>
+                <w:b w:val="false"/>
+                <w:bCs w:val="false"/>
+                <w:sz w:val="20"/>
+                <w:szCs w:val="20"/>
+              </w:rPr>
+              <w:t xml:space="preserve">−0.027 (0.021)</w:t>
+            </w:r>
+          </w:p>
+        </w:tc>
+      </w:tr>
+      <w:tr>
+        <w:trPr>
+          <w:cantSplit/>
+          <w:tblHeader w:val="false"/>
+        </w:trPr>
+        <w:tc>
+          <w:tcPr>
+            <w:tcW w:type="dxa" w:w="2560"/>
+            <w:tcBorders>
+              <w:top w:val="none" w:color="FFFFFF" w:sz="0"/>
+              <w:left w:val="none" w:color="FFFFFF" w:sz="0"/>
+              <w:bottom w:val="none" w:color="FFFFFF" w:sz="0"/>
+              <w:right w:val="none" w:color="FFFFFF" w:sz="0"/>
+            </w:tcBorders>
+            <w:tcMar>
+              <w:top w:type="dxa" w:w="50"/>
+              <w:left w:type="dxa" w:w="90"/>
+              <w:bottom w:type="dxa" w:w="50"/>
+              <w:right w:type="dxa" w:w="90"/>
+            </w:tcMar>
+          </w:tcPr>
+          <w:p>
+            <w:pPr>
+              <w:spacing w:line="240" w:lineRule="auto"/>
+            </w:pPr>
+            <w:r>
+              <w:rPr>
+                <w:rFonts w:ascii="Times New Roman" w:cs="Times New Roman" w:eastAsia="Times New Roman" w:hAnsi="Times New Roman"/>
+                <w:b w:val="false"/>
+                <w:bCs w:val="false"/>
+                <w:sz w:val="20"/>
+                <w:szCs w:val="20"/>
+              </w:rPr>
+              <w:t xml:space="preserve">UK: randomization p</w:t>
+            </w:r>
+          </w:p>
+        </w:tc>
+        <w:tc>
+          <w:tcPr>
+            <w:tcW w:type="dxa" w:w="1100"/>
+            <w:tcBorders>
+              <w:top w:val="none" w:color="FFFFFF" w:sz="0"/>
+              <w:left w:val="none" w:color="FFFFFF" w:sz="0"/>
+              <w:bottom w:val="none" w:color="FFFFFF" w:sz="0"/>
+              <w:right w:val="none" w:color="FFFFFF" w:sz="0"/>
+            </w:tcBorders>
+            <w:tcMar>
+              <w:top w:type="dxa" w:w="50"/>
+              <w:left w:type="dxa" w:w="90"/>
+              <w:bottom w:type="dxa" w:w="50"/>
+              <w:right w:type="dxa" w:w="90"/>
+            </w:tcMar>
+          </w:tcPr>
+          <w:p>
+            <w:pPr>
+              <w:spacing w:line="240" w:lineRule="auto"/>
+            </w:pPr>
+          </w:p>
+        </w:tc>
+        <w:tc>
+          <w:tcPr>
+            <w:tcW w:type="dxa" w:w="1100"/>
+            <w:tcBorders>
+              <w:top w:val="none" w:color="FFFFFF" w:sz="0"/>
+              <w:left w:val="none" w:color="FFFFFF" w:sz="0"/>
+              <w:bottom w:val="none" w:color="FFFFFF" w:sz="0"/>
+              <w:right w:val="none" w:color="FFFFFF" w:sz="0"/>
+            </w:tcBorders>
+            <w:tcMar>
+              <w:top w:type="dxa" w:w="50"/>
+              <w:left w:type="dxa" w:w="90"/>
+              <w:bottom w:type="dxa" w:w="50"/>
+              <w:right w:type="dxa" w:w="90"/>
+            </w:tcMar>
+          </w:tcPr>
+          <w:p>
+            <w:pPr>
+              <w:spacing w:line="240" w:lineRule="auto"/>
+            </w:pPr>
+          </w:p>
+        </w:tc>
+        <w:tc>
+          <w:tcPr>
+            <w:tcW w:type="dxa" w:w="1100"/>
+            <w:tcBorders>
+              <w:top w:val="none" w:color="FFFFFF" w:sz="0"/>
+              <w:left w:val="none" w:color="FFFFFF" w:sz="0"/>
+              <w:bottom w:val="none" w:color="FFFFFF" w:sz="0"/>
+              <w:right w:val="none" w:color="FFFFFF" w:sz="0"/>
+            </w:tcBorders>
+            <w:tcMar>
+              <w:top w:type="dxa" w:w="50"/>
+              <w:left w:type="dxa" w:w="90"/>
+              <w:bottom w:type="dxa" w:w="50"/>
+              <w:right w:type="dxa" w:w="90"/>
+            </w:tcMar>
+          </w:tcPr>
+          <w:p>
+            <w:pPr>
+              <w:spacing w:line="240" w:lineRule="auto"/>
+            </w:pPr>
+          </w:p>
+        </w:tc>
+        <w:tc>
+          <w:tcPr>
+            <w:tcW w:type="dxa" w:w="1100"/>
+            <w:tcBorders>
+              <w:top w:val="none" w:color="FFFFFF" w:sz="0"/>
+              <w:left w:val="none" w:color="FFFFFF" w:sz="0"/>
+              <w:bottom w:val="none" w:color="FFFFFF" w:sz="0"/>
+              <w:right w:val="none" w:color="FFFFFF" w:sz="0"/>
+            </w:tcBorders>
+            <w:tcMar>
+              <w:top w:type="dxa" w:w="50"/>
+              <w:left w:type="dxa" w:w="90"/>
+              <w:bottom w:type="dxa" w:w="50"/>
+              <w:right w:type="dxa" w:w="90"/>
+            </w:tcMar>
+          </w:tcPr>
+          <w:p>
+            <w:pPr>
+              <w:spacing w:line="240" w:lineRule="auto"/>
+            </w:pPr>
+            <w:r>
+              <w:rPr>
+                <w:rFonts w:ascii="Times New Roman" w:cs="Times New Roman" w:eastAsia="Times New Roman" w:hAnsi="Times New Roman"/>
+                <w:b w:val="false"/>
+                <w:bCs w:val="false"/>
+                <w:sz w:val="20"/>
+                <w:szCs w:val="20"/>
+              </w:rPr>
+              <w:t xml:space="preserve">0.543</w:t>
+            </w:r>
+          </w:p>
+        </w:tc>
+        <w:tc>
+          <w:tcPr>
+            <w:tcW w:type="dxa" w:w="1100"/>
+            <w:tcBorders>
+              <w:top w:val="none" w:color="FFFFFF" w:sz="0"/>
+              <w:left w:val="none" w:color="FFFFFF" w:sz="0"/>
+              <w:bottom w:val="none" w:color="FFFFFF" w:sz="0"/>
+              <w:right w:val="none" w:color="FFFFFF" w:sz="0"/>
+            </w:tcBorders>
+            <w:tcMar>
+              <w:top w:type="dxa" w:w="50"/>
+              <w:left w:type="dxa" w:w="90"/>
+              <w:bottom w:type="dxa" w:w="50"/>
+              <w:right w:type="dxa" w:w="90"/>
+            </w:tcMar>
+          </w:tcPr>
+          <w:p>
+            <w:pPr>
+              <w:spacing w:line="240" w:lineRule="auto"/>
+            </w:pPr>
+            <w:r>
+              <w:rPr>
+                <w:rFonts w:ascii="Times New Roman" w:cs="Times New Roman" w:eastAsia="Times New Roman" w:hAnsi="Times New Roman"/>
+                <w:b w:val="false"/>
+                <w:bCs w:val="false"/>
+                <w:sz w:val="20"/>
+                <w:szCs w:val="20"/>
+              </w:rPr>
+              <w:t xml:space="preserve">0.253</w:t>
+            </w:r>
+          </w:p>
+        </w:tc>
+        <w:tc>
+          <w:tcPr>
+            <w:tcW w:type="dxa" w:w="1300"/>
+            <w:tcBorders>
+              <w:top w:val="none" w:color="FFFFFF" w:sz="0"/>
+              <w:left w:val="none" w:color="FFFFFF" w:sz="0"/>
+              <w:bottom w:val="none" w:color="FFFFFF" w:sz="0"/>
+              <w:right w:val="none" w:color="FFFFFF" w:sz="0"/>
+            </w:tcBorders>
+            <w:tcMar>
+              <w:top w:type="dxa" w:w="50"/>
+              <w:left w:type="dxa" w:w="90"/>
+              <w:bottom w:type="dxa" w:w="50"/>
+              <w:right w:type="dxa" w:w="90"/>
+            </w:tcMar>
+          </w:tcPr>
+          <w:p>
+            <w:pPr>
+              <w:spacing w:line="240" w:lineRule="auto"/>
+            </w:pPr>
+            <w:r>
+              <w:rPr>
+                <w:rFonts w:ascii="Times New Roman" w:cs="Times New Roman" w:eastAsia="Times New Roman" w:hAnsi="Times New Roman"/>
+                <w:b w:val="false"/>
+                <w:bCs w:val="false"/>
+                <w:sz w:val="20"/>
+                <w:szCs w:val="20"/>
+              </w:rPr>
+              <w:t xml:space="preserve">0.091</w:t>
+            </w:r>
+          </w:p>
+        </w:tc>
+      </w:tr>
+      <w:tr>
+        <w:trPr>
+          <w:cantSplit/>
+          <w:tblHeader w:val="false"/>
+        </w:trPr>
+        <w:tc>
+          <w:tcPr>
+            <w:tcW w:type="dxa" w:w="2560"/>
+            <w:tcBorders>
+              <w:top w:val="none" w:color="FFFFFF" w:sz="0"/>
+              <w:left w:val="none" w:color="FFFFFF" w:sz="0"/>
+              <w:bottom w:val="none" w:color="FFFFFF" w:sz="0"/>
+              <w:right w:val="none" w:color="FFFFFF" w:sz="0"/>
+            </w:tcBorders>
+            <w:tcMar>
+              <w:top w:type="dxa" w:w="50"/>
+              <w:left w:type="dxa" w:w="90"/>
+              <w:bottom w:type="dxa" w:w="50"/>
+              <w:right w:type="dxa" w:w="90"/>
+            </w:tcMar>
+          </w:tcPr>
+          <w:p>
+            <w:pPr>
+              <w:spacing w:line="240" w:lineRule="auto"/>
+            </w:pPr>
+            <w:r>
+              <w:rPr>
+                <w:rFonts w:ascii="Times New Roman" w:cs="Times New Roman" w:eastAsia="Times New Roman" w:hAnsi="Times New Roman"/>
+                <w:b w:val="false"/>
+                <w:bCs w:val="false"/>
+                <w:sz w:val="20"/>
+                <w:szCs w:val="20"/>
+              </w:rPr>
+              <w:t xml:space="preserve">Europe: country-year FE, LLM control</w:t>
+            </w:r>
+          </w:p>
+        </w:tc>
+        <w:tc>
+          <w:tcPr>
+            <w:tcW w:type="dxa" w:w="1100"/>
+            <w:tcBorders>
+              <w:top w:val="none" w:color="FFFFFF" w:sz="0"/>
+              <w:left w:val="none" w:color="FFFFFF" w:sz="0"/>
+              <w:bottom w:val="none" w:color="FFFFFF" w:sz="0"/>
+              <w:right w:val="none" w:color="FFFFFF" w:sz="0"/>
+            </w:tcBorders>
+            <w:tcMar>
+              <w:top w:type="dxa" w:w="50"/>
+              <w:left w:type="dxa" w:w="90"/>
+              <w:bottom w:type="dxa" w:w="50"/>
+              <w:right w:type="dxa" w:w="90"/>
+            </w:tcMar>
+          </w:tcPr>
+          <w:p>
+            <w:pPr>
+              <w:spacing w:line="240" w:lineRule="auto"/>
+            </w:pPr>
+            <w:r>
+              <w:rPr>
+                <w:rFonts w:ascii="Times New Roman" w:cs="Times New Roman" w:eastAsia="Times New Roman" w:hAnsi="Times New Roman"/>
+                <w:b w:val="false"/>
+                <w:bCs w:val="false"/>
+                <w:sz w:val="20"/>
+                <w:szCs w:val="20"/>
+              </w:rPr>
+              <w:t xml:space="preserve">+0.040 (2019)</w:t>
+            </w:r>
+          </w:p>
+        </w:tc>
+        <w:tc>
+          <w:tcPr>
+            <w:tcW w:type="dxa" w:w="1100"/>
+            <w:tcBorders>
+              <w:top w:val="none" w:color="FFFFFF" w:sz="0"/>
+              <w:left w:val="none" w:color="FFFFFF" w:sz="0"/>
+              <w:bottom w:val="none" w:color="FFFFFF" w:sz="0"/>
+              <w:right w:val="none" w:color="FFFFFF" w:sz="0"/>
+            </w:tcBorders>
+            <w:tcMar>
+              <w:top w:type="dxa" w:w="50"/>
+              <w:left w:type="dxa" w:w="90"/>
+              <w:bottom w:type="dxa" w:w="50"/>
+              <w:right w:type="dxa" w:w="90"/>
+            </w:tcMar>
+          </w:tcPr>
+          <w:p>
+            <w:pPr>
+              <w:spacing w:line="240" w:lineRule="auto"/>
+            </w:pPr>
+            <w:r>
+              <w:rPr>
+                <w:rFonts w:ascii="Times New Roman" w:cs="Times New Roman" w:eastAsia="Times New Roman" w:hAnsi="Times New Roman"/>
+                <w:b w:val="false"/>
+                <w:bCs w:val="false"/>
+                <w:sz w:val="20"/>
+                <w:szCs w:val="20"/>
+              </w:rPr>
+              <w:t xml:space="preserve">+0.023 / +0.019</w:t>
+            </w:r>
+          </w:p>
+        </w:tc>
+        <w:tc>
+          <w:tcPr>
+            <w:tcW w:type="dxa" w:w="1100"/>
+            <w:tcBorders>
+              <w:top w:val="none" w:color="FFFFFF" w:sz="0"/>
+              <w:left w:val="none" w:color="FFFFFF" w:sz="0"/>
+              <w:bottom w:val="none" w:color="FFFFFF" w:sz="0"/>
+              <w:right w:val="none" w:color="FFFFFF" w:sz="0"/>
+            </w:tcBorders>
+            <w:tcMar>
+              <w:top w:type="dxa" w:w="50"/>
+              <w:left w:type="dxa" w:w="90"/>
+              <w:bottom w:type="dxa" w:w="50"/>
+              <w:right w:type="dxa" w:w="90"/>
+            </w:tcMar>
+          </w:tcPr>
+          <w:p>
+            <w:pPr>
+              <w:spacing w:line="240" w:lineRule="auto"/>
+            </w:pPr>
+            <w:r>
+              <w:rPr>
+                <w:rFonts w:ascii="Times New Roman" w:cs="Times New Roman" w:eastAsia="Times New Roman" w:hAnsi="Times New Roman"/>
+                <w:b w:val="false"/>
+                <w:bCs w:val="false"/>
+                <w:sz w:val="20"/>
+                <w:szCs w:val="20"/>
+              </w:rPr>
+              <w:t xml:space="preserve">−0.009 (0.007)</w:t>
+            </w:r>
+          </w:p>
+        </w:tc>
+        <w:tc>
+          <w:tcPr>
+            <w:tcW w:type="dxa" w:w="1100"/>
+            <w:tcBorders>
+              <w:top w:val="none" w:color="FFFFFF" w:sz="0"/>
+              <w:left w:val="none" w:color="FFFFFF" w:sz="0"/>
+              <w:bottom w:val="none" w:color="FFFFFF" w:sz="0"/>
+              <w:right w:val="none" w:color="FFFFFF" w:sz="0"/>
+            </w:tcBorders>
+            <w:tcMar>
+              <w:top w:type="dxa" w:w="50"/>
+              <w:left w:type="dxa" w:w="90"/>
+              <w:bottom w:type="dxa" w:w="50"/>
+              <w:right w:type="dxa" w:w="90"/>
+            </w:tcMar>
+          </w:tcPr>
+          <w:p>
+            <w:pPr>
+              <w:spacing w:line="240" w:lineRule="auto"/>
+            </w:pPr>
+            <w:r>
+              <w:rPr>
+                <w:rFonts w:ascii="Times New Roman" w:cs="Times New Roman" w:eastAsia="Times New Roman" w:hAnsi="Times New Roman"/>
+                <w:b w:val="false"/>
+                <w:bCs w:val="false"/>
+                <w:sz w:val="20"/>
+                <w:szCs w:val="20"/>
+              </w:rPr>
+              <w:t xml:space="preserve">−0.004 (0.015)</w:t>
+            </w:r>
+          </w:p>
+        </w:tc>
+        <w:tc>
+          <w:tcPr>
+            <w:tcW w:type="dxa" w:w="1100"/>
+            <w:tcBorders>
+              <w:top w:val="none" w:color="FFFFFF" w:sz="0"/>
+              <w:left w:val="none" w:color="FFFFFF" w:sz="0"/>
+              <w:bottom w:val="none" w:color="FFFFFF" w:sz="0"/>
+              <w:right w:val="none" w:color="FFFFFF" w:sz="0"/>
+            </w:tcBorders>
+            <w:tcMar>
+              <w:top w:type="dxa" w:w="50"/>
+              <w:left w:type="dxa" w:w="90"/>
+              <w:bottom w:type="dxa" w:w="50"/>
+              <w:right w:type="dxa" w:w="90"/>
+            </w:tcMar>
+          </w:tcPr>
+          <w:p>
+            <w:pPr>
+              <w:spacing w:line="240" w:lineRule="auto"/>
+            </w:pPr>
+          </w:p>
+        </w:tc>
+        <w:tc>
+          <w:tcPr>
+            <w:tcW w:type="dxa" w:w="1300"/>
+            <w:tcBorders>
+              <w:top w:val="none" w:color="FFFFFF" w:sz="0"/>
+              <w:left w:val="none" w:color="FFFFFF" w:sz="0"/>
+              <w:bottom w:val="none" w:color="FFFFFF" w:sz="0"/>
+              <w:right w:val="none" w:color="FFFFFF" w:sz="0"/>
+            </w:tcBorders>
+            <w:tcMar>
+              <w:top w:type="dxa" w:w="50"/>
+              <w:left w:type="dxa" w:w="90"/>
+              <w:bottom w:type="dxa" w:w="50"/>
+              <w:right w:type="dxa" w:w="90"/>
+            </w:tcMar>
+          </w:tcPr>
+          <w:p>
+            <w:pPr>
+              <w:spacing w:line="240" w:lineRule="auto"/>
+            </w:pPr>
+          </w:p>
+        </w:tc>
+      </w:tr>
+      <w:tr>
+        <w:trPr>
+          <w:cantSplit/>
+          <w:tblHeader w:val="false"/>
+        </w:trPr>
+        <w:tc>
+          <w:tcPr>
+            <w:tcW w:type="dxa" w:w="2560"/>
+            <w:tcBorders>
+              <w:top w:val="none" w:color="FFFFFF" w:sz="0"/>
+              <w:left w:val="none" w:color="FFFFFF" w:sz="0"/>
+              <w:bottom w:val="single" w:color="000000" w:sz="4"/>
+              <w:right w:val="none" w:color="FFFFFF" w:sz="0"/>
+            </w:tcBorders>
+            <w:tcMar>
+              <w:top w:type="dxa" w:w="50"/>
+              <w:left w:type="dxa" w:w="90"/>
+              <w:bottom w:type="dxa" w:w="50"/>
+              <w:right w:type="dxa" w:w="90"/>
+            </w:tcMar>
+          </w:tcPr>
+          <w:p>
+            <w:pPr>
+              <w:spacing w:line="240" w:lineRule="auto"/>
+            </w:pPr>
+            <w:r>
+              <w:rPr>
+                <w:rFonts w:ascii="Times New Roman" w:cs="Times New Roman" w:eastAsia="Times New Roman" w:hAnsi="Times New Roman"/>
+                <w:b w:val="false"/>
+                <w:bCs w:val="false"/>
+                <w:sz w:val="20"/>
+                <w:szCs w:val="20"/>
+              </w:rPr>
+              <w:t xml:space="preserve">Europe: randomization p</w:t>
+            </w:r>
+          </w:p>
+        </w:tc>
+        <w:tc>
+          <w:tcPr>
+            <w:tcW w:type="dxa" w:w="1100"/>
+            <w:tcBorders>
+              <w:top w:val="none" w:color="FFFFFF" w:sz="0"/>
+              <w:left w:val="none" w:color="FFFFFF" w:sz="0"/>
+              <w:bottom w:val="single" w:color="000000" w:sz="4"/>
+              <w:right w:val="none" w:color="FFFFFF" w:sz="0"/>
+            </w:tcBorders>
+            <w:tcMar>
+              <w:top w:type="dxa" w:w="50"/>
+              <w:left w:type="dxa" w:w="90"/>
+              <w:bottom w:type="dxa" w:w="50"/>
+              <w:right w:type="dxa" w:w="90"/>
+            </w:tcMar>
+          </w:tcPr>
+          <w:p>
+            <w:pPr>
+              <w:spacing w:line="240" w:lineRule="auto"/>
+            </w:pPr>
+          </w:p>
+        </w:tc>
+        <w:tc>
+          <w:tcPr>
+            <w:tcW w:type="dxa" w:w="1100"/>
+            <w:tcBorders>
+              <w:top w:val="none" w:color="FFFFFF" w:sz="0"/>
+              <w:left w:val="none" w:color="FFFFFF" w:sz="0"/>
+              <w:bottom w:val="single" w:color="000000" w:sz="4"/>
+              <w:right w:val="none" w:color="FFFFFF" w:sz="0"/>
+            </w:tcBorders>
+            <w:tcMar>
+              <w:top w:type="dxa" w:w="50"/>
+              <w:left w:type="dxa" w:w="90"/>
+              <w:bottom w:type="dxa" w:w="50"/>
+              <w:right w:type="dxa" w:w="90"/>
+            </w:tcMar>
+          </w:tcPr>
+          <w:p>
+            <w:pPr>
+              <w:spacing w:line="240" w:lineRule="auto"/>
+            </w:pPr>
+          </w:p>
+        </w:tc>
+        <w:tc>
+          <w:tcPr>
+            <w:tcW w:type="dxa" w:w="1100"/>
+            <w:tcBorders>
+              <w:top w:val="none" w:color="FFFFFF" w:sz="0"/>
+              <w:left w:val="none" w:color="FFFFFF" w:sz="0"/>
+              <w:bottom w:val="single" w:color="000000" w:sz="4"/>
+              <w:right w:val="none" w:color="FFFFFF" w:sz="0"/>
+            </w:tcBorders>
+            <w:tcMar>
+              <w:top w:type="dxa" w:w="50"/>
+              <w:left w:type="dxa" w:w="90"/>
+              <w:bottom w:type="dxa" w:w="50"/>
+              <w:right w:type="dxa" w:w="90"/>
+            </w:tcMar>
+          </w:tcPr>
+          <w:p>
+            <w:pPr>
+              <w:spacing w:line="240" w:lineRule="auto"/>
+            </w:pPr>
+            <w:r>
+              <w:rPr>
+                <w:rFonts w:ascii="Times New Roman" w:cs="Times New Roman" w:eastAsia="Times New Roman" w:hAnsi="Times New Roman"/>
+                <w:b w:val="false"/>
+                <w:bCs w:val="false"/>
+                <w:sz w:val="20"/>
+                <w:szCs w:val="20"/>
+              </w:rPr>
+              <w:t xml:space="preserve">0.272</w:t>
+            </w:r>
+          </w:p>
+        </w:tc>
+        <w:tc>
+          <w:tcPr>
+            <w:tcW w:type="dxa" w:w="1100"/>
+            <w:tcBorders>
+              <w:top w:val="none" w:color="FFFFFF" w:sz="0"/>
+              <w:left w:val="none" w:color="FFFFFF" w:sz="0"/>
+              <w:bottom w:val="single" w:color="000000" w:sz="4"/>
+              <w:right w:val="none" w:color="FFFFFF" w:sz="0"/>
+            </w:tcBorders>
+            <w:tcMar>
+              <w:top w:type="dxa" w:w="50"/>
+              <w:left w:type="dxa" w:w="90"/>
+              <w:bottom w:type="dxa" w:w="50"/>
+              <w:right w:type="dxa" w:w="90"/>
+            </w:tcMar>
+          </w:tcPr>
+          <w:p>
+            <w:pPr>
+              <w:spacing w:line="240" w:lineRule="auto"/>
+            </w:pPr>
+            <w:r>
+              <w:rPr>
+                <w:rFonts w:ascii="Times New Roman" w:cs="Times New Roman" w:eastAsia="Times New Roman" w:hAnsi="Times New Roman"/>
+                <w:b w:val="false"/>
+                <w:bCs w:val="false"/>
+                <w:sz w:val="20"/>
+                <w:szCs w:val="20"/>
+              </w:rPr>
+              <w:t xml:space="preserve">0.774</w:t>
+            </w:r>
+          </w:p>
+        </w:tc>
+        <w:tc>
+          <w:tcPr>
+            <w:tcW w:type="dxa" w:w="1100"/>
+            <w:tcBorders>
+              <w:top w:val="none" w:color="FFFFFF" w:sz="0"/>
+              <w:left w:val="none" w:color="FFFFFF" w:sz="0"/>
+              <w:bottom w:val="single" w:color="000000" w:sz="4"/>
+              <w:right w:val="none" w:color="FFFFFF" w:sz="0"/>
+            </w:tcBorders>
+            <w:tcMar>
+              <w:top w:type="dxa" w:w="50"/>
+              <w:left w:type="dxa" w:w="90"/>
+              <w:bottom w:type="dxa" w:w="50"/>
+              <w:right w:type="dxa" w:w="90"/>
+            </w:tcMar>
+          </w:tcPr>
+          <w:p>
+            <w:pPr>
+              <w:spacing w:line="240" w:lineRule="auto"/>
+            </w:pPr>
+          </w:p>
+        </w:tc>
+        <w:tc>
+          <w:tcPr>
+            <w:tcW w:type="dxa" w:w="1300"/>
+            <w:tcBorders>
+              <w:top w:val="none" w:color="FFFFFF" w:sz="0"/>
+              <w:left w:val="none" w:color="FFFFFF" w:sz="0"/>
+              <w:bottom w:val="single" w:color="000000" w:sz="4"/>
+              <w:right w:val="none" w:color="FFFFFF" w:sz="0"/>
+            </w:tcBorders>
+            <w:tcMar>
+              <w:top w:type="dxa" w:w="50"/>
+              <w:left w:type="dxa" w:w="90"/>
+              <w:bottom w:type="dxa" w:w="50"/>
+              <w:right w:type="dxa" w:w="90"/>
+            </w:tcMar>
+          </w:tcPr>
+          <w:p>
+            <w:pPr>
+              <w:spacing w:line="240" w:lineRule="auto"/>
+            </w:pPr>
+          </w:p>
+        </w:tc>
+      </w:tr>
+    </w:tbl>
+    <w:p>
+      <w:pPr>
+        <w:spacing w:after="200" w:before="60" w:line="240" w:lineRule="auto"/>
+      </w:pPr>
+      <w:r>
+        <w:rPr>
+          <w:rFonts w:ascii="Times New Roman" w:cs="Times New Roman" w:eastAsia="Times New Roman" w:hAnsi="Times New Roman"/>
+          <w:i/>
+          <w:iCs/>
+          <w:sz w:val="20"/>
+          <w:szCs w:val="20"/>
+        </w:rPr>
+        <w:t xml:space="preserve">Note.</w:t>
+      </w:r>
+      <w:r>
+        <w:rPr>
+          <w:rFonts w:ascii="Times New Roman" w:cs="Times New Roman" w:eastAsia="Times New Roman" w:hAnsi="Times New Roman"/>
+          <w:sz w:val="20"/>
+          <w:szCs w:val="20"/>
+        </w:rPr>
+        <w:t xml:space="preserve"> Broad measure of exposure to visual materials (Section 4.3). UK: 403 occupations; Europe: 604 country-occupation cells in 96 occupations and 16 countries. Standard errors in parentheses; for the pre-2022 columns they are 0.017 and 0.015 (UK, 2018 and 2019), 0.015 (UK, 2021), 0.017 (Europe, 2019), and 0.019 and 0.010 (Europe, 2020 and 2021). The UK base year is July 2021–June 2022 and the European base year is 2022.</w:t>
+      </w:r>
+    </w:p>
+    <w:p>
+      <w:pPr>
+        <w:pStyle w:val="Heading2"/>
+        <w:keepNext/>
+        <w:spacing w:after="120" w:before="240" w:line="240" w:lineRule="auto"/>
+      </w:pPr>
+      <w:r>
+        <w:rPr>
+          <w:rFonts w:ascii="Times New Roman" w:cs="Times New Roman" w:eastAsia="Times New Roman" w:hAnsi="Times New Roman"/>
+          <w:b/>
+          <w:bCs/>
+          <w:sz w:val="24"/>
+          <w:szCs w:val="24"/>
+        </w:rPr>
+        <w:t xml:space="preserve">6.10 Summary of Evidence Against the Hypotheses</w:t>
+      </w:r>
+    </w:p>
+    <w:p>
+      <w:pPr>
+        <w:spacing w:after="0" w:line="480" w:lineRule="auto"/>
+        <w:ind w:firstLine="720"/>
+        <w:jc w:val="left"/>
+      </w:pPr>
+      <w:r>
+        <w:rPr>
+          <w:rFonts w:ascii="Times New Roman" w:cs="Times New Roman" w:eastAsia="Times New Roman" w:hAnsi="Times New Roman"/>
+          <w:sz w:val="24"/>
+          <w:szCs w:val="24"/>
+        </w:rPr>
+        <w:t xml:space="preserve">H1 is supported in a limited sense: adoption is substantial and rising, while estimated labor-demand effects are small, imprecise, and partly a reversal of earlier trends; the scaling exercise shows that the largest observed declines are too large for current adoption to explain through substitution. H2 is not supported. H3 is partly supported: firms cite expertise and legal and privacy uncertainty far more than usefulness, but cross-country variation in these concerns does not clearly explain adoption. H4 is weakly supported: in the UK the coefficients are most negative in 2026 and in Europe without the language control they grow from 2023 to 2024, but in both the pattern is not clearly monotone and in the UK the effect cannot be separated from the pre-existing pattern. The European replication strengthens the direction of the result and removes the pre-trend concern, but it covers only two post-2022 years. In Canada the first post-2022 year agrees in sign, and later years show no clear pattern within narrow occupation groups. With the broad exposure measure the post-2022 estimates are smaller and less precise and the pre-2022 coefficients are positive and larger, so the evidence for displacement is weaker still.</w:t>
+      </w:r>
+    </w:p>
+    <w:p>
+      <w:pPr>
+        <w:pStyle w:val="Heading2"/>
+        <w:keepNext/>
+        <w:spacing w:after="120" w:before="240" w:line="240" w:lineRule="auto"/>
+      </w:pPr>
+      <w:r>
+        <w:rPr>
+          <w:rFonts w:ascii="Times New Roman" w:cs="Times New Roman" w:eastAsia="Times New Roman" w:hAnsi="Times New Roman"/>
+          <w:b/>
+          <w:bCs/>
+          <w:sz w:val="24"/>
+          <w:szCs w:val="24"/>
+        </w:rPr>
+        <w:t xml:space="preserve">6.11 Projection: When Could Displacement Become Detectable?</w:t>
+      </w:r>
+    </w:p>
+    <w:p>
+      <w:pPr>
+        <w:spacing w:after="0" w:line="480" w:lineRule="auto"/>
+        <w:ind w:firstLine="720"/>
+        <w:jc w:val="left"/>
+      </w:pPr>
+      <w:r>
+        <w:rPr>
+          <w:rFonts w:ascii="Times New Roman" w:cs="Times New Roman" w:eastAsia="Times New Roman" w:hAnsi="Times New Roman"/>
+          <w:sz w:val="24"/>
+          <w:szCs w:val="24"/>
+        </w:rPr>
+        <w:t xml:space="preserve">Table 11 reports the share of employers that would have to adopt for the effect to reach the detection threshold, and the first year in which each adoption scenario gets there. The threshold requires adoption times </w:t>
+      </w:r>
+      <w:r>
+        <w:rPr>
+          <w:rFonts w:ascii="Times New Roman" w:cs="Times New Roman" w:eastAsia="Times New Roman" w:hAnsi="Times New Roman"/>
+          <w:i/>
+          <w:iCs/>
+          <w:sz w:val="24"/>
+          <w:szCs w:val="24"/>
+        </w:rPr>
+        <w:t xml:space="preserve">β</w:t>
+      </w:r>
+      <w:r>
+        <w:rPr>
+          <w:rFonts w:ascii="Times New Roman" w:cs="Times New Roman" w:eastAsia="Times New Roman" w:hAnsi="Times New Roman"/>
+          <w:sz w:val="24"/>
+          <w:szCs w:val="24"/>
+        </w:rPr>
+        <w:t xml:space="preserve"> to reach −0.27. If demand among adopters falls by 39% (</w:t>
+      </w:r>
+      <w:r>
+        <w:rPr>
+          <w:rFonts w:ascii="Times New Roman" w:cs="Times New Roman" w:eastAsia="Times New Roman" w:hAnsi="Times New Roman"/>
+          <w:i/>
+          <w:iCs/>
+          <w:sz w:val="24"/>
+          <w:szCs w:val="24"/>
+        </w:rPr>
+        <w:t xml:space="preserve">β</w:t>
+      </w:r>
+      <w:r>
+        <w:rPr>
+          <w:rFonts w:ascii="Times New Roman" w:cs="Times New Roman" w:eastAsia="Times New Roman" w:hAnsi="Times New Roman"/>
+          <w:sz w:val="24"/>
+          <w:szCs w:val="24"/>
+        </w:rPr>
+        <w:t xml:space="preserve"> = −0.5), adoption must reach 53%. Starting from the EU27 average of 9.6%, this happens in 2029 under fast diffusion, 2030 under medium diffusion, and 2035 under slow diffusion. Starting from the 36% adoption observed in publishing, film, and broadcasting, it happens in 2026, 2027, and 2028. If demand among adopters falls by 26% (</w:t>
+      </w:r>
+      <w:r>
+        <w:rPr>
+          <w:rFonts w:ascii="Times New Roman" w:cs="Times New Roman" w:eastAsia="Times New Roman" w:hAnsi="Times New Roman"/>
+          <w:i/>
+          <w:iCs/>
+          <w:sz w:val="24"/>
+          <w:szCs w:val="24"/>
+        </w:rPr>
+        <w:t xml:space="preserve">β</w:t>
+      </w:r>
+      <w:r>
+        <w:rPr>
+          <w:rFonts w:ascii="Times New Roman" w:cs="Times New Roman" w:eastAsia="Times New Roman" w:hAnsi="Times New Roman"/>
+          <w:sz w:val="24"/>
+          <w:szCs w:val="24"/>
+        </w:rPr>
+        <w:t xml:space="preserve"> = −0.3), adoption must reach 89%, which occurs between 2031 and 2034 for the average firm under fast and medium diffusion and between 2029 and 2031 in media-related sectors, and not within the horizon under slow diffusion. If demand falls by 10% (</w:t>
+      </w:r>
+      <w:r>
+        <w:rPr>
+          <w:rFonts w:ascii="Times New Roman" w:cs="Times New Roman" w:eastAsia="Times New Roman" w:hAnsi="Times New Roman"/>
+          <w:i/>
+          <w:iCs/>
+          <w:sz w:val="24"/>
+          <w:szCs w:val="24"/>
+        </w:rPr>
+        <w:t xml:space="preserve">β</w:t>
+      </w:r>
+      <w:r>
+        <w:rPr>
+          <w:rFonts w:ascii="Times New Roman" w:cs="Times New Roman" w:eastAsia="Times New Roman" w:hAnsi="Times New Roman"/>
+          <w:sz w:val="24"/>
+          <w:szCs w:val="24"/>
+        </w:rPr>
+        <w:t xml:space="preserve"> = −0.1), the threshold would require adoption above 100%: such an effect would not be detectable with this design at any adoption level. If demand among adopters fell by 55% (</w:t>
+      </w:r>
+      <w:r>
+        <w:rPr>
+          <w:rFonts w:ascii="Times New Roman" w:cs="Times New Roman" w:eastAsia="Times New Roman" w:hAnsi="Times New Roman"/>
+          <w:i/>
+          <w:iCs/>
+          <w:sz w:val="24"/>
+          <w:szCs w:val="24"/>
+        </w:rPr>
+        <w:t xml:space="preserve">β</w:t>
+      </w:r>
+      <w:r>
+        <w:rPr>
+          <w:rFonts w:ascii="Times New Roman" w:cs="Times New Roman" w:eastAsia="Times New Roman" w:hAnsi="Times New Roman"/>
+          <w:sz w:val="24"/>
+          <w:szCs w:val="24"/>
+        </w:rPr>
+        <w:t xml:space="preserve"> = −0.8), detection would occur in 2028 to 2032 for the average firm and already in 2025 in media-related sectors. The present UK coefficient for 2026 (−0.033) is at the detection threshold, so it is consistent either with such a large effect among adopters in a high-adoption sector or with a decline that is not caused by adoption, as Section 6.7 suggests.</w:t>
+      </w:r>
+    </w:p>
+    <w:p>
+      <w:pPr>
+        <w:keepNext/>
+        <w:spacing w:after="80" w:before="240" w:line="240" w:lineRule="auto"/>
+        <w:jc w:val="center"/>
+      </w:pPr>
+      <w:r>
+        <w:rPr>
+          <w:rFonts w:ascii="Times New Roman" w:cs="Times New Roman" w:eastAsia="Times New Roman" w:hAnsi="Times New Roman"/>
+          <w:b/>
+          <w:bCs/>
+          <w:sz w:val="22"/>
+          <w:szCs w:val="22"/>
+        </w:rPr>
+        <w:t xml:space="preserve">Table 11.</w:t>
       </w:r>
       <w:r>
         <w:rPr>
@@ -12137,15 +13321,15 @@
           <w:sz w:val="24"/>
           <w:szCs w:val="24"/>
         </w:rPr>
-        <w:t xml:space="preserve">Quality-requirement score (applied to the 859 tasks scoring 1 or 2).</w:t>
-      </w:r>
-      <w:r>
-        <w:rPr>
-          <w:rFonts w:ascii="Times New Roman" w:cs="Times New Roman" w:eastAsia="Times New Roman" w:hAnsi="Times New Roman"/>
-          <w:sz w:val="24"/>
-          <w:szCs w:val="24"/>
-        </w:rPr>
-        <w:t xml:space="preserve"> Rate how demanding the acceptance standard is for the visual output of the task. 0 = low: generic, routine, draft, or internal-use visuals where good-enough output is acceptable and errors are cheap to fix. 1 = medium: visuals for external audiences or clients where polish matters but several acceptable solutions exist and review is routine. 2 = high: brand-defining, safety-critical, legally or regulatorily sensitive, technically exact, or signature or original artistic work where errors are costly or the particular creator’s judgment is central.</w:t>
+        <w:t xml:space="preserve">Broad visual-materials score (applied to all 18,796 tasks, with the occupation title shown).</w:t>
+      </w:r>
+      <w:r>
+        <w:rPr>
+          <w:rFonts w:ascii="Times New Roman" w:cs="Times New Roman" w:eastAsia="Times New Roman" w:hAnsi="Times New Roman"/>
+          <w:sz w:val="24"/>
+          <w:szCs w:val="24"/>
+        </w:rPr>
+        <w:t xml:space="preserve"> Score how much the task involves visual materials and visual or aesthetic output. 2 = producing, designing, or editing visual or aesthetic output is the core of the task (graphics, illustration, photography, video, animation, web or interface design and development, layouts and patterns, set, costume, hair or make-up appearance, performing for camera or stage). 1 = the task works with visual materials without producing visual or aesthetic output as its core: reading, studying, or interpreting blueprints, drawings, maps, or images; producing engineering or technical drawings and documentation; visually inspecting or monitoring; preparing charts, slides, or visual aids as part of a broader duty. 0 = the task does not involve visual materials or visual output. Tasks are not scored merely because the worker must see to do them.</w:t>
       </w:r>
     </w:p>
     <w:p>
@@ -12157,10 +13341,35 @@
       <w:r>
         <w:rPr>
           <w:rFonts w:ascii="Times New Roman" w:cs="Times New Roman" w:eastAsia="Times New Roman" w:hAnsi="Times New Roman"/>
-          <w:sz w:val="24"/>
-          <w:szCs w:val="24"/>
-        </w:rPr>
-        <w:t xml:space="preserve">The prompts are in the repository as prompt_creation.txt and prompt_quality.txt. Data and code are in the accompanying repository (isr_paper).</w:t>
+          <w:i/>
+          <w:iCs/>
+          <w:sz w:val="24"/>
+          <w:szCs w:val="24"/>
+        </w:rPr>
+        <w:t xml:space="preserve">Quality-requirement score (applied to the 859 tasks scoring 1 or 2).</w:t>
+      </w:r>
+      <w:r>
+        <w:rPr>
+          <w:rFonts w:ascii="Times New Roman" w:cs="Times New Roman" w:eastAsia="Times New Roman" w:hAnsi="Times New Roman"/>
+          <w:sz w:val="24"/>
+          <w:szCs w:val="24"/>
+        </w:rPr>
+        <w:t xml:space="preserve"> Rate how demanding the acceptance standard is for the visual output of the task. 0 = low: generic, routine, draft, or internal-use visuals where good-enough output is acceptable and errors are cheap to fix. 1 = medium: visuals for external audiences or clients where polish matters but several acceptable solutions exist and review is routine. 2 = high: brand-defining, safety-critical, legally or regulatorily sensitive, technically exact, or signature or original artistic work where errors are costly or the particular creator’s judgment is central.</w:t>
+      </w:r>
+    </w:p>
+    <w:p>
+      <w:pPr>
+        <w:spacing w:after="0" w:line="480" w:lineRule="auto"/>
+        <w:ind w:firstLine="720"/>
+        <w:jc w:val="left"/>
+      </w:pPr>
+      <w:r>
+        <w:rPr>
+          <w:rFonts w:ascii="Times New Roman" w:cs="Times New Roman" w:eastAsia="Times New Roman" w:hAnsi="Times New Roman"/>
+          <w:sz w:val="24"/>
+          <w:szCs w:val="24"/>
+        </w:rPr>
+        <w:t xml:space="preserve">The prompts are in the repository as prompt_creation.txt, prompt_broad_v2.txt, and prompt_quality.txt. Data and code are in the accompanying repository (isr_paper).</w:t>
       </w:r>
     </w:p>
     <w:p>

</xml_diff>

<commit_message>
Add coder B validation; report inter-coder reliability and independent check of the broad measure
Co-Authored-By: Claude Sonnet 5.5 <noreply@anthropic.com>
Claude-Session: https://claude.ai/code/session_01H4JvRLBkzRHsy6jU5TcEWv
</commit_message>
<xml_diff>
--- a/isr_paper/ISR_Paper_Early_Adoption_Delayed_Displacement.docx
+++ b/isr_paper/ISR_Paper_Early_Adoption_Delayed_Displacement.docx
@@ -67,7 +67,7 @@
           <w:sz w:val="22"/>
           <w:szCs w:val="22"/>
         </w:rPr>
-        <w:t xml:space="preserve">This draft reports a full analysis on open data, but it is not yet ready for submission. Three items remain open: (i) the large-language-model (LLM) measure of occupational exposure to visual content creation agrees poorly with a single human coder (Section 4.3) and has no second coder; (ii) the evidence on labor effects is small and imprecise, with two post-2022 years in the European replication, and we do not claim a causal effect of generative visual AI; (iii) model release dates and the bibliographic details marked † must be verified. All reported numbers are produced by the code and data in the accompanying repository.</w:t>
+        <w:t xml:space="preserve">This draft reports a full analysis on open data, but it is not yet ready for submission. Three items remain open: (i) the large-language-model (LLM) measure of occupational exposure to visual content creation agrees poorly with two human coders, who also agree poorly with each other (Section 4.3); (ii) the evidence on labor effects is small and imprecise, with two post-2022 years in the European replication, and we do not claim a causal effect of generative visual AI; (iii) model release dates and the bibliographic details marked † must be verified. All reported numbers are produced by the code and data in the accompanying repository.</w:t>
       </w:r>
     </w:p>
     <w:p>
@@ -1767,7 +1767,7 @@
           <w:sz w:val="24"/>
           <w:szCs w:val="24"/>
         </w:rPr>
-        <w:t xml:space="preserve">We validated the measure with one human coder on a stratified random sample of 199 task statements. The strata were defined by the LLM score and by a rule-based score: 45 tasks scored 2, 55 scored 1, 40 scored 0 but flagged by the rule-based score, and 60 random tasks scored 0 (the sampling weights are used in all estimates). The coder saw only the occupation and the task and used the rubric in Appendix A. Agreement is low. The design-weighted exact agreement is 0.73 (0.56 unweighted), weighted Cohen’s κ is 0.11 (95% bootstrap interval 0.06 to 0.20), the κ for the binary distinction between a score of one or more and zero is 0.15 (0.08 to 0.26), and the Spearman correlation between the two scores is 0.52. The pattern is asymmetric. The coder scored 80% of the tasks that the LLM scored one or two as one or more (91% of those scored two), so the LLM’s positives are mostly accepted. But the coder also scored 25% of random tasks that the LLM and the rule-based score both rated zero as one or more, including reading blueprints, examining engravings for quality, and monitoring closed-circuit television, which the rubric excludes. The design-weighted share of all O*NET tasks that the coder scored one or more is 27.6% (95% interval 18.0 to 38.5), against 4.6% for the LLM; the LLM’s sensitivity relative to the coder is 0.12 (0.09 to 0.19), its specificity 0.98, and its positive predictive value 0.75. The LLM score is therefore a conservative, narrow indicator of visual content production, and it misses most of what this coder counted as visual. With one coder we cannot separate coder idiosyncrasy from ambiguity in the rubric: an earlier exercise on a related construct, dependence of tasks on visual perception, showed a similarly broad pattern. The validity of the measure is therefore not established, and a second coder and a revised rubric are needed. As convergent evidence we provide a transparent rule-based score built from the rubric text: its correlation with the LLM score across occupations is 0.71 in the first half and 0.91 in the second half of the data classified first (n = 196 and 192 occupations), its Spearman correlation with the human score is 0.36, and the main results are similar when it replaces the LLM score. A second LLM pass codes the quality requirement of the 859 tasks that score 1 or 2 as low (237 tasks), medium (355), or high (267), using the rubric in Appendix A. An earlier attempt to measure a broader construct, dependence of tasks on visual perception, agreed poorly with a human coder (Cohen’s κ about 0.2 on 200 tasks) and was discontinued.</w:t>
+        <w:t xml:space="preserve">We validated the measures with two human coders, who independently scored the same stratified random sample of 199 task statements (199 of the 200 sampled tasks are used: coder A left one blank). The strata were defined by the LLM score and by a rule-based score: 45 tasks scored 2, 55 scored 1, 40 scored 0 but flagged by the rule-based score, and 60 random tasks scored 0 (sampling weights are used in all estimates). The coders saw only the occupation and the task and used the narrow rubric in Appendix A. Agreement between the coders is low: the design-weighted exact agreement is 0.57, weighted Cohen’s κ is 0.18, the κ for a score of one or more versus zero is 0.20, and the Spearman correlation is 0.22. The coders also differ in how broadly they read the construct: coder A scored 27.6% of all O*NET tasks one or more (3.5% two) and coder B 44.5% (15.3% two), against 4.6% (1.0%) for the narrow LLM score. Both coders counted as visual many tasks that the rubric excludes, such as reading blueprints, examining engravings for quality, and monitoring closed-circuit television.</w:t>
       </w:r>
     </w:p>
     <w:p>
@@ -1782,7 +1782,22 @@
           <w:sz w:val="24"/>
           <w:szCs w:val="24"/>
         </w:rPr>
-        <w:t xml:space="preserve">Because the coder read the construct more broadly than the rubric, we built a second, broad measure that scores how much a task involves working with visual materials and visual or aesthetic output: producing, editing, reading, inspecting, or monitoring images, drawings, video, interfaces, and layouts (rubric in Appendix A). We wrote the rubric after seeing the coder’s pattern on the first half of the human sample, and evaluated it on the second half (99 tasks), which was not used to write it. On that held-out half the weighted κ is 0.41 (0.44 linear-weighted), the κ for a score of one or more versus zero is 0.44, and the Spearman correlation with the human score is 0.66, against 0.11 for the narrow measure on the full sample. Agreement is moderate, and because the rubric was shaped by one coder’s reading it may agree less well with another coder. We apply the broad measure to all 18,796 tasks, with the occupation title shown to the model as the coder saw it; 14.9% of tasks score one or more (2.5% score two). We report results for both measures.</w:t>
+        <w:t xml:space="preserve">By weighted κ, the narrow LLM score agrees with the coders less than the coders agree with each other (0.11 and 0.04, against 0.18), although its rank correlation with coder A (0.52) is higher than the correlation between the coders (0.22). Its weighted κ is 0.11 with coder A (95% bootstrap interval 0.06 to 0.20) and 0.04 with coder B; its binary κ is 0.15 and 0.04; its Spearman correlations are 0.52 and 0.25. Its positives are mostly accepted (coder A scored 80% of them one or more) but it misses most of what the coders counted as visual (sensitivity 0.12 relative to coder A and 0.07 relative to coder B; specificity 0.98 and 0.97). The narrow score is a conservative indicator of visual content production. Because the coders disagree with each other, we cannot treat either as a gold standard, and the reliability of task-level labels for this construct is low regardless of who or what produces them.</w:t>
+      </w:r>
+    </w:p>
+    <w:p>
+      <w:pPr>
+        <w:spacing w:after="0" w:line="480" w:lineRule="auto"/>
+        <w:ind w:firstLine="720"/>
+        <w:jc w:val="left"/>
+      </w:pPr>
+      <w:r>
+        <w:rPr>
+          <w:rFonts w:ascii="Times New Roman" w:cs="Times New Roman" w:eastAsia="Times New Roman" w:hAnsi="Times New Roman"/>
+          <w:sz w:val="24"/>
+          <w:szCs w:val="24"/>
+        </w:rPr>
+        <w:t xml:space="preserve">We therefore built a second, broad measure that scores how much a task involves working with visual materials and visual or aesthetic output: producing, editing, reading, inspecting, or monitoring images, drawings, video, interfaces, and layouts (rubric in Appendix A). We wrote the rubric after seeing coder A’s pattern on the first half of the sample and evaluated it on the second half (99 tasks). Against coder A on that held-out half the weighted κ is 0.41 and the Spearman correlation 0.66. Coder B did not contribute to the rubric, so the comparison with coder B is an independent check: on all 199 tasks the weighted κ is 0.31 (0.25 on the second half), the binary κ is 0.29 (0.23), and the Spearman correlation is 0.46; against the rounded average of the two coders, the weighted κ is 0.28 and the binary κ 0.33. These values are modest in absolute terms. Relative to the benchmark of agreement between the coders (weighted κ 0.18, Spearman 0.22), the broad score agrees with each coder at least as well as the coders agree with each other, and its Spearman correlation with coder A (0.61) and coder B (0.46) is well above the correlation between them. We apply the broad measure to all 18,796 tasks, with the occupation title shown to the model as the coders saw it; 14.9% of tasks score one or more (2.5% score two). We report results for both measures. Low reliability of an exposure measure biases estimated coefficients toward zero, so some of the smallness of our estimates may reflect measurement error rather than absence of an effect.</w:t>
       </w:r>
     </w:p>
     <w:p>
@@ -13223,7 +13238,7 @@
           <w:sz w:val="24"/>
           <w:szCs w:val="24"/>
         </w:rPr>
-        <w:t xml:space="preserve">The identification is weak. Exposure is a continuous measure, but the pre-period contains the COVID shock, and the post-2022 pattern resembles a reversal of the 2022 recovery; the coefficients are small and rely on a few occupations. We do not observe adoption by employers of each occupation, so the scaling exercise is a stylized check. The adoption survey covers Europe and asks about AI in general for the barriers, whereas the hiring data are for the United Kingdom, so we link them only through sector averages. The Eurostat indicator for generative visual AI is available for one year, so we cannot show its growth. The European replication uses experimental statistics that cover 16 countries, ISCO three-digit occupations, and only two post-2022 years, and it ends in 2024. The Canadian data are an employer survey of vacancies rather than job adverts, lack two quarters in 2020, use exposure scored from NOC duty statements without a control for LLM exposure, and give imprecise estimates after 2023. The exposure measure is LLM-coded and agrees poorly with the one human coder who validated it (weighted κ = 0.11): it is precise but narrow relative to the coder’s broader reading, and there is no second coder, so inter-coder reliability is unknown; a rule-based score gives similar results. The mapping from O*NET to UK occupations goes through ISCO-08 and is approximate. The ONS series is experimental and has missing months that we interpolate. Adverts measure hiring intent, not employment, and substitution may occur through hours, outsourcing, or freelancing, which adverts cannot show. Model release dates are approximate. The projection depends on assumptions about the adoption path, the linearity of exposure, and adoption among employers of each occupation, and it does not identify the effect among adopters. Finally, our model abstracts from changes in the quality and variety of assets and from price effects.</w:t>
+        <w:t xml:space="preserve">The identification is weak. Exposure is a continuous measure, but the pre-period contains the COVID shock, and the post-2022 pattern resembles a reversal of the 2022 recovery; the coefficients are small and rely on a few occupations. We do not observe adoption by employers of each occupation, so the scaling exercise is a stylized check. The adoption survey covers Europe and asks about AI in general for the barriers, whereas the hiring data are for the United Kingdom, so we link them only through sector averages. The Eurostat indicator for generative visual AI is available for one year, so we cannot show its growth. The European replication uses experimental statistics that cover 16 countries, ISCO three-digit occupations, and only two post-2022 years, and it ends in 2024. The Canadian data are an employer survey of vacancies rather than job adverts, lack two quarters in 2020, use exposure scored from NOC duty statements without a control for LLM exposure, and give imprecise estimates after 2023. The exposure measures are LLM-coded. The narrow measure agrees poorly with two human coders (weighted κ 0.11 and 0.04) and the coders agree poorly with each other (0.18), so the reliability of the construct at task level is low; the broad measure agrees moderately (0.31 to 0.41) and at least as well as the coders agree with each other, but its rubric was shaped by one coder. Low reliability attenuates estimated effects. A rule-based score gives similar results to the narrow measure. The mapping from O*NET to UK occupations goes through ISCO-08 and is approximate. The ONS series is experimental and has missing months that we interpolate. Adverts measure hiring intent, not employment, and substitution may occur through hours, outsourcing, or freelancing, which adverts cannot show. Model release dates are approximate. The projection depends on assumptions about the adoption path, the linearity of exposure, and adoption among employers of each occupation, and it does not identify the effect among adopters. Finally, our model abstracts from changes in the quality and variety of assets and from price effects.</w:t>
       </w:r>
     </w:p>
     <w:p>

</xml_diff>